<commit_message>
ajout des fonctionnalité et tri en module
</commit_message>
<xml_diff>
--- a/Documents/DossierAnalyse.docx
+++ b/Documents/DossierAnalyse.docx
@@ -3208,7 +3208,10 @@
         <w:t>OpenStreetMap :</w:t>
       </w:r>
       <w:r>
-        <w:t xml:space="preserve"> Il s'agit d'un projet collaboratif de cartographie. Cela permet de créer des cartes sous licence libre.</w:t>
+        <w:t xml:space="preserve"> Il s'agit d'un projet collaboratif de cartographie. Cela permet de créer des </w:t>
+      </w:r>
+      <w:r>
+        <w:t xml:space="preserve"> </w:t>
       </w:r>
     </w:p>
     <w:p>
@@ -3239,19 +3242,7 @@
         <w:t>A</w:t>
       </w:r>
       <w:r>
-        <w:t>nglais pour escapade routière, c'est un voyage en voiture tout en s'</w:t>
-      </w:r>
-      <w:r>
-        <w:t>arrêtant</w:t>
-      </w:r>
-      <w:r>
-        <w:t xml:space="preserve"> pour voir de nombreux paysages / lieux culturels. Généralement </w:t>
-      </w:r>
-      <w:r>
-        <w:t>effectué</w:t>
-      </w:r>
-      <w:r>
-        <w:t xml:space="preserve"> sur de longue distance le plus souvent en voiture, van ou moto et parfois même à pied.</w:t>
+        <w:t>nglais pour escapade routière, c'est un voyage en voiture tout en s'arrêtant pour voir de nombreux paysages / lieux culturels. Généralement effectué sur de longue distance le plus souvent en voiture, van ou moto et parfois même à pied.</w:t>
       </w:r>
     </w:p>
     <w:p>
@@ -3313,22 +3304,7 @@
         <w:t>Z</w:t>
       </w:r>
       <w:r>
-        <w:t>one réservée</w:t>
-      </w:r>
-      <w:r>
-        <w:t xml:space="preserve"> à l'</w:t>
-      </w:r>
-      <w:r>
-        <w:t>échange</w:t>
-      </w:r>
-      <w:r>
-        <w:t xml:space="preserve"> de message </w:t>
-      </w:r>
-      <w:r>
-        <w:t>que</w:t>
-      </w:r>
-      <w:r>
-        <w:t xml:space="preserve"> ce soit une discussion de groupe ou à deux.</w:t>
+        <w:t>one réservée à l'échange de message que ce soit une discussion de groupe ou à deux.</w:t>
       </w:r>
     </w:p>
     <w:p>
@@ -3359,13 +3335,7 @@
         <w:t>C</w:t>
       </w:r>
       <w:r>
-        <w:t xml:space="preserve">hemin créer au préalable par un utilisateur qui contient </w:t>
-      </w:r>
-      <w:r>
-        <w:t>des informations</w:t>
-      </w:r>
-      <w:r>
-        <w:t xml:space="preserve"> tel que le temps, la distance et les lieux visités.</w:t>
+        <w:t>hemin créer au préalable par un utilisateur qui contient des informations tel que le temps, la distance et les lieux visités.</w:t>
       </w:r>
     </w:p>
     <w:p>
@@ -3390,13 +3360,7 @@
         <w:t>Abus :</w:t>
       </w:r>
       <w:r>
-        <w:t xml:space="preserve"> Comportements qui </w:t>
-      </w:r>
-      <w:r>
-        <w:t>transgressent</w:t>
-      </w:r>
-      <w:r>
-        <w:t xml:space="preserve"> les règles d'utilisations.</w:t>
+        <w:t xml:space="preserve"> Comportements qui transgressent les règles d'utilisations.</w:t>
       </w:r>
     </w:p>
     <w:p>
@@ -3418,23 +3382,7 @@
           <w:bCs/>
           <w:u w:val="single"/>
         </w:rPr>
-        <w:t xml:space="preserve">Base de </w:t>
-      </w:r>
-      <w:r>
-        <w:rPr>
-          <w:b/>
-          <w:bCs/>
-          <w:u w:val="single"/>
-        </w:rPr>
-        <w:t>données</w:t>
-      </w:r>
-      <w:r>
-        <w:rPr>
-          <w:b/>
-          <w:bCs/>
-          <w:u w:val="single"/>
-        </w:rPr>
-        <w:t xml:space="preserve"> :</w:t>
+        <w:t>Base de données :</w:t>
       </w:r>
       <w:r>
         <w:t xml:space="preserve">  </w:t>
@@ -3490,42 +3438,1778 @@
           <w:bCs/>
           <w:u w:val="single"/>
         </w:rPr>
-        <w:t xml:space="preserve">Héberger un site </w:t>
-      </w:r>
-      <w:r>
-        <w:rPr>
-          <w:b/>
-          <w:bCs/>
-          <w:u w:val="single"/>
-        </w:rPr>
-        <w:t>Web :</w:t>
-      </w:r>
-      <w:r>
-        <w:t xml:space="preserve"> Action qui consiste </w:t>
-      </w:r>
-      <w:r>
-        <w:t>à</w:t>
-      </w:r>
-      <w:r>
-        <w:t xml:space="preserve"> faire fonctionner le site web sur un serveur en fonctionnement 24/24 pour que le site soit fonctionnel tout le temps.</w:t>
+        <w:lastRenderedPageBreak/>
+        <w:t>Héberger un site Web :</w:t>
+      </w:r>
+      <w:r>
+        <w:t xml:space="preserve"> Action qui consiste à faire fonctionner le site web sur un serveur en fonctionnement 24/24 pour que le site soit fonctionnel tout le temps.</w:t>
+      </w:r>
+    </w:p>
+    <w:p>
+      <w:pPr>
+        <w:pStyle w:val="Paragraphedeliste"/>
+      </w:pPr>
+    </w:p>
+    <w:p>
+      <w:pPr>
+        <w:pStyle w:val="Titre2"/>
+      </w:pPr>
+      <w:r>
+        <w:t>Définition des fonctionnalités du programme</w:t>
+      </w:r>
+    </w:p>
+    <w:p>
+      <w:r>
+        <w:t>Nous voulons que notre site web ai ces fonctionnalités :</w:t>
+      </w:r>
+    </w:p>
+    <w:p>
+      <w:pPr>
+        <w:pStyle w:val="Paragraphedeliste"/>
+        <w:numPr>
+          <w:ilvl w:val="0"/>
+          <w:numId w:val="19"/>
+        </w:numPr>
+      </w:pPr>
+      <w:r>
+        <w:t>Possibilité de s’inscrire, se connecter, se déconnecter au site</w:t>
+      </w:r>
+    </w:p>
+    <w:p>
+      <w:pPr>
+        <w:pStyle w:val="Paragraphedeliste"/>
+        <w:numPr>
+          <w:ilvl w:val="0"/>
+          <w:numId w:val="19"/>
+        </w:numPr>
+      </w:pPr>
+      <w:r>
+        <w:t>Supprimer un compte</w:t>
+      </w:r>
+    </w:p>
+    <w:p>
+      <w:pPr>
+        <w:pStyle w:val="Paragraphedeliste"/>
+        <w:numPr>
+          <w:ilvl w:val="0"/>
+          <w:numId w:val="19"/>
+        </w:numPr>
+      </w:pPr>
+      <w:r>
+        <w:t>Pouvoir gérer son profil, ses amis</w:t>
+      </w:r>
+    </w:p>
+    <w:p>
+      <w:pPr>
+        <w:pStyle w:val="Paragraphedeliste"/>
+        <w:numPr>
+          <w:ilvl w:val="0"/>
+          <w:numId w:val="19"/>
+        </w:numPr>
+      </w:pPr>
+      <w:r>
+        <w:t>Consulter ses informations personnelles</w:t>
+      </w:r>
+    </w:p>
+    <w:p>
+      <w:pPr>
+        <w:pStyle w:val="Paragraphedeliste"/>
+        <w:numPr>
+          <w:ilvl w:val="0"/>
+          <w:numId w:val="19"/>
+        </w:numPr>
+      </w:pPr>
+      <w:r>
+        <w:t>Afficher la carte OpenStreetMap, pourvoir naviguer dessus</w:t>
+      </w:r>
+    </w:p>
+    <w:p>
+      <w:pPr>
+        <w:pStyle w:val="Paragraphedeliste"/>
+        <w:numPr>
+          <w:ilvl w:val="0"/>
+          <w:numId w:val="19"/>
+        </w:numPr>
+      </w:pPr>
+      <w:r>
+        <w:t>Pouvoir consulter les points d’intérêts</w:t>
+      </w:r>
+      <w:r>
+        <w:t>, les utiliser dans des parcours, les filtrer en fonction des préférences</w:t>
+      </w:r>
+    </w:p>
+    <w:p>
+      <w:pPr>
+        <w:pStyle w:val="Paragraphedeliste"/>
+        <w:numPr>
+          <w:ilvl w:val="0"/>
+          <w:numId w:val="19"/>
+        </w:numPr>
+      </w:pPr>
+      <w:r>
+        <w:t>Pouvoir créer et modifier des itinéraires, ajouter/supprimer des étapes, enregistrer, partager et consulter des road-trip</w:t>
+      </w:r>
+    </w:p>
+    <w:p>
+      <w:pPr>
+        <w:pStyle w:val="Paragraphedeliste"/>
+        <w:numPr>
+          <w:ilvl w:val="0"/>
+          <w:numId w:val="19"/>
+        </w:numPr>
+      </w:pPr>
+      <w:r>
+        <w:t>Rechercher des points d’intérêts, voir leur description et la générer automatiquement grâce à une API</w:t>
+      </w:r>
+    </w:p>
+    <w:p>
+      <w:pPr>
+        <w:pStyle w:val="Paragraphedeliste"/>
+        <w:numPr>
+          <w:ilvl w:val="0"/>
+          <w:numId w:val="19"/>
+        </w:numPr>
+      </w:pPr>
+      <w:r>
+        <w:t>Avoir un historique des lieux visités et des évaluations</w:t>
+      </w:r>
+    </w:p>
+    <w:p>
+      <w:pPr>
+        <w:pStyle w:val="Paragraphedeliste"/>
+        <w:numPr>
+          <w:ilvl w:val="0"/>
+          <w:numId w:val="19"/>
+        </w:numPr>
+      </w:pPr>
+      <w:r>
+        <w:t>Possibilité d’ajouter un point d’intérêt a un road-trip</w:t>
+      </w:r>
+    </w:p>
+    <w:p>
+      <w:pPr>
+        <w:pStyle w:val="Paragraphedeliste"/>
+        <w:numPr>
+          <w:ilvl w:val="0"/>
+          <w:numId w:val="19"/>
+        </w:numPr>
+      </w:pPr>
+      <w:r>
+        <w:t>Ajouter/supprimer des amis</w:t>
+      </w:r>
+    </w:p>
+    <w:p>
+      <w:pPr>
+        <w:pStyle w:val="Paragraphedeliste"/>
+        <w:numPr>
+          <w:ilvl w:val="0"/>
+          <w:numId w:val="19"/>
+        </w:numPr>
+      </w:pPr>
+      <w:r>
+        <w:t>Mettre et lire des commentaires/avis</w:t>
+      </w:r>
+    </w:p>
+    <w:p>
+      <w:pPr>
+        <w:pStyle w:val="Paragraphedeliste"/>
+        <w:numPr>
+          <w:ilvl w:val="0"/>
+          <w:numId w:val="19"/>
+        </w:numPr>
+      </w:pPr>
+      <w:r>
+        <w:t>Avoir un chat intégré à l’application</w:t>
+      </w:r>
+    </w:p>
+    <w:p>
+      <w:pPr>
+        <w:pStyle w:val="Paragraphedeliste"/>
+        <w:numPr>
+          <w:ilvl w:val="0"/>
+          <w:numId w:val="19"/>
+        </w:numPr>
+      </w:pPr>
+      <w:r>
+        <w:t>Notifications</w:t>
+      </w:r>
+    </w:p>
+    <w:p>
+      <w:pPr>
+        <w:pStyle w:val="Paragraphedeliste"/>
+        <w:numPr>
+          <w:ilvl w:val="0"/>
+          <w:numId w:val="19"/>
+        </w:numPr>
+      </w:pPr>
+      <w:r>
+        <w:t>Gérer des utilisateurs (bannir, bloquer)</w:t>
+      </w:r>
+    </w:p>
+    <w:p>
+      <w:pPr>
+        <w:pStyle w:val="Paragraphedeliste"/>
+        <w:numPr>
+          <w:ilvl w:val="0"/>
+          <w:numId w:val="19"/>
+        </w:numPr>
+      </w:pPr>
+      <w:r>
+        <w:t>Modération du contenu de l’application (avis, points d’intérêts, commentaires…)</w:t>
+      </w:r>
+    </w:p>
+    <w:p>
+      <w:pPr>
+        <w:pStyle w:val="Paragraphedeliste"/>
+        <w:numPr>
+          <w:ilvl w:val="0"/>
+          <w:numId w:val="19"/>
+        </w:numPr>
+      </w:pPr>
+      <w:r>
+        <w:t>Signalement d’autres utilisateurs</w:t>
+      </w:r>
+    </w:p>
+    <w:p>
+      <w:pPr>
+        <w:pStyle w:val="Paragraphedeliste"/>
+        <w:numPr>
+          <w:ilvl w:val="0"/>
+          <w:numId w:val="19"/>
+        </w:numPr>
+      </w:pPr>
+      <w:r>
+        <w:t>Mise à jour</w:t>
+      </w:r>
+    </w:p>
+    <w:p>
+      <w:pPr>
+        <w:pStyle w:val="Paragraphedeliste"/>
+        <w:numPr>
+          <w:ilvl w:val="0"/>
+          <w:numId w:val="19"/>
+        </w:numPr>
+      </w:pPr>
+      <w:r>
+        <w:t>Base de données utilisateur, road-trip, points d’intérêts et avis</w:t>
+      </w:r>
+    </w:p>
+    <w:p>
+      <w:pPr>
+        <w:pStyle w:val="Paragraphedeliste"/>
+        <w:numPr>
+          <w:ilvl w:val="0"/>
+          <w:numId w:val="19"/>
+        </w:numPr>
+      </w:pPr>
+      <w:r>
+        <w:t xml:space="preserve">Être hébergé </w:t>
+      </w:r>
+    </w:p>
+    <w:p>
+      <w:pPr>
+        <w:pStyle w:val="Paragraphedeliste"/>
+        <w:numPr>
+          <w:ilvl w:val="0"/>
+          <w:numId w:val="19"/>
+        </w:numPr>
+      </w:pPr>
+      <w:r>
+        <w:t xml:space="preserve">Être sûr </w:t>
+      </w:r>
+    </w:p>
+    <w:p>
+      <w:pPr>
+        <w:pStyle w:val="Titre3"/>
+      </w:pPr>
+      <w:r>
+        <w:t>Diagramme de cas d’utilisations</w:t>
+      </w:r>
+    </w:p>
+    <w:p>
+      <w:pPr>
+        <w:jc w:val="left"/>
+      </w:pPr>
+      <w:r>
+        <w:br w:type="page"/>
+      </w:r>
+    </w:p>
+    <w:p>
+      <w:pPr>
+        <w:pStyle w:val="Titre3"/>
+      </w:pPr>
+      <w:r>
+        <w:lastRenderedPageBreak/>
+        <w:t>I/O Fonctions</w:t>
       </w:r>
     </w:p>
     <w:p/>
-    <w:p>
-      <w:pPr>
-        <w:rPr>
-          <w:b/>
-          <w:bCs/>
-        </w:rPr>
-      </w:pPr>
-    </w:p>
-    <w:p>
-      <w:pPr>
-        <w:rPr>
-          <w:b/>
-          <w:bCs/>
-        </w:rPr>
-      </w:pPr>
+    <w:tbl>
+      <w:tblPr>
+        <w:tblStyle w:val="Grilledutableau"/>
+        <w:tblW w:w="0" w:type="auto"/>
+        <w:tblLook w:val="04A0" w:firstRow="1" w:lastRow="0" w:firstColumn="1" w:lastColumn="0" w:noHBand="0" w:noVBand="1"/>
+      </w:tblPr>
+      <w:tblGrid>
+        <w:gridCol w:w="2880"/>
+        <w:gridCol w:w="2880"/>
+        <w:gridCol w:w="2880"/>
+      </w:tblGrid>
+      <w:tr>
+        <w:tc>
+          <w:tcPr>
+            <w:tcW w:w="2880" w:type="dxa"/>
+            <w:shd w:val="clear" w:color="auto" w:fill="BFBFBF" w:themeFill="background1" w:themeFillShade="BF"/>
+          </w:tcPr>
+          <w:p>
+            <w:pPr>
+              <w:rPr>
+                <w:lang w:val="fr-FR"/>
+              </w:rPr>
+            </w:pPr>
+            <w:r>
+              <w:rPr>
+                <w:lang w:val="fr-FR"/>
+              </w:rPr>
+              <w:t>Fonctionnalité</w:t>
+            </w:r>
+          </w:p>
+        </w:tc>
+        <w:tc>
+          <w:tcPr>
+            <w:tcW w:w="2880" w:type="dxa"/>
+            <w:shd w:val="clear" w:color="auto" w:fill="BFBFBF" w:themeFill="background1" w:themeFillShade="BF"/>
+          </w:tcPr>
+          <w:p>
+            <w:pPr>
+              <w:rPr>
+                <w:lang w:val="fr-FR"/>
+              </w:rPr>
+            </w:pPr>
+            <w:r>
+              <w:rPr>
+                <w:lang w:val="fr-FR"/>
+              </w:rPr>
+              <w:t>Entrées (Input)</w:t>
+            </w:r>
+          </w:p>
+        </w:tc>
+        <w:tc>
+          <w:tcPr>
+            <w:tcW w:w="2880" w:type="dxa"/>
+            <w:shd w:val="clear" w:color="auto" w:fill="BFBFBF" w:themeFill="background1" w:themeFillShade="BF"/>
+          </w:tcPr>
+          <w:p>
+            <w:pPr>
+              <w:rPr>
+                <w:lang w:val="fr-FR"/>
+              </w:rPr>
+            </w:pPr>
+            <w:r>
+              <w:rPr>
+                <w:lang w:val="fr-FR"/>
+              </w:rPr>
+              <w:t>Sorties (Output)</w:t>
+            </w:r>
+          </w:p>
+        </w:tc>
+      </w:tr>
+      <w:tr>
+        <w:tc>
+          <w:tcPr>
+            <w:tcW w:w="2880" w:type="dxa"/>
+          </w:tcPr>
+          <w:p>
+            <w:pPr>
+              <w:rPr>
+                <w:lang w:val="fr-FR"/>
+              </w:rPr>
+            </w:pPr>
+            <w:r>
+              <w:rPr>
+                <w:lang w:val="fr-FR"/>
+              </w:rPr>
+              <w:t>Inscription / Connexion / Déconnexion / Suppression de compte</w:t>
+            </w:r>
+          </w:p>
+        </w:tc>
+        <w:tc>
+          <w:tcPr>
+            <w:tcW w:w="2880" w:type="dxa"/>
+          </w:tcPr>
+          <w:p>
+            <w:pPr>
+              <w:rPr>
+                <w:lang w:val="fr-FR"/>
+              </w:rPr>
+            </w:pPr>
+            <w:r>
+              <w:rPr>
+                <w:lang w:val="fr-FR"/>
+              </w:rPr>
+              <w:t>Identifiant, mot de passe, données</w:t>
+            </w:r>
+            <w:r>
+              <w:rPr>
+                <w:lang w:val="fr-FR"/>
+              </w:rPr>
+              <w:t xml:space="preserve"> </w:t>
+            </w:r>
+            <w:r>
+              <w:rPr>
+                <w:lang w:val="fr-FR"/>
+              </w:rPr>
+              <w:t>d’inscription, requête de suppression</w:t>
+            </w:r>
+          </w:p>
+        </w:tc>
+        <w:tc>
+          <w:tcPr>
+            <w:tcW w:w="2880" w:type="dxa"/>
+          </w:tcPr>
+          <w:p>
+            <w:pPr>
+              <w:rPr>
+                <w:lang w:val="fr-FR"/>
+              </w:rPr>
+            </w:pPr>
+            <w:r>
+              <w:rPr>
+                <w:lang w:val="fr-FR"/>
+              </w:rPr>
+              <w:t>Confirmation de connexion/déconnexion, création/suppression de compte, message d’erreur</w:t>
+            </w:r>
+          </w:p>
+        </w:tc>
+      </w:tr>
+      <w:tr>
+        <w:tc>
+          <w:tcPr>
+            <w:tcW w:w="2880" w:type="dxa"/>
+          </w:tcPr>
+          <w:p>
+            <w:pPr>
+              <w:rPr>
+                <w:lang w:val="fr-FR"/>
+              </w:rPr>
+            </w:pPr>
+            <w:r>
+              <w:rPr>
+                <w:lang w:val="fr-FR"/>
+              </w:rPr>
+              <w:t>Gestion du profil</w:t>
+            </w:r>
+          </w:p>
+        </w:tc>
+        <w:tc>
+          <w:tcPr>
+            <w:tcW w:w="2880" w:type="dxa"/>
+          </w:tcPr>
+          <w:p>
+            <w:pPr>
+              <w:rPr>
+                <w:lang w:val="fr-FR"/>
+              </w:rPr>
+            </w:pPr>
+            <w:r>
+              <w:rPr>
+                <w:lang w:val="fr-FR"/>
+              </w:rPr>
+              <w:t>Pseudo, photo, bio</w:t>
+            </w:r>
+          </w:p>
+        </w:tc>
+        <w:tc>
+          <w:tcPr>
+            <w:tcW w:w="2880" w:type="dxa"/>
+          </w:tcPr>
+          <w:p>
+            <w:pPr>
+              <w:rPr>
+                <w:lang w:val="fr-FR"/>
+              </w:rPr>
+            </w:pPr>
+            <w:r>
+              <w:rPr>
+                <w:lang w:val="fr-FR"/>
+              </w:rPr>
+              <w:t>Profil mis à jour, informations affichées</w:t>
+            </w:r>
+          </w:p>
+        </w:tc>
+      </w:tr>
+      <w:tr>
+        <w:tc>
+          <w:tcPr>
+            <w:tcW w:w="2880" w:type="dxa"/>
+          </w:tcPr>
+          <w:p>
+            <w:pPr>
+              <w:rPr>
+                <w:lang w:val="fr-FR"/>
+              </w:rPr>
+            </w:pPr>
+            <w:r>
+              <w:rPr>
+                <w:lang w:val="fr-FR"/>
+              </w:rPr>
+              <w:t>Gestion des amis</w:t>
+            </w:r>
+          </w:p>
+        </w:tc>
+        <w:tc>
+          <w:tcPr>
+            <w:tcW w:w="2880" w:type="dxa"/>
+          </w:tcPr>
+          <w:p>
+            <w:pPr>
+              <w:rPr>
+                <w:lang w:val="fr-FR"/>
+              </w:rPr>
+            </w:pPr>
+            <w:r>
+              <w:rPr>
+                <w:lang w:val="fr-FR"/>
+              </w:rPr>
+              <w:t>Demande d’ajout/suppression</w:t>
+            </w:r>
+          </w:p>
+        </w:tc>
+        <w:tc>
+          <w:tcPr>
+            <w:tcW w:w="2880" w:type="dxa"/>
+          </w:tcPr>
+          <w:p>
+            <w:pPr>
+              <w:rPr>
+                <w:lang w:val="fr-FR"/>
+              </w:rPr>
+            </w:pPr>
+            <w:r>
+              <w:rPr>
+                <w:lang w:val="fr-FR"/>
+              </w:rPr>
+              <w:t>Liste d’amis mise à jour, notification</w:t>
+            </w:r>
+          </w:p>
+        </w:tc>
+      </w:tr>
+      <w:tr>
+        <w:tc>
+          <w:tcPr>
+            <w:tcW w:w="2880" w:type="dxa"/>
+          </w:tcPr>
+          <w:p>
+            <w:pPr>
+              <w:rPr>
+                <w:lang w:val="fr-FR"/>
+              </w:rPr>
+            </w:pPr>
+            <w:r>
+              <w:rPr>
+                <w:lang w:val="fr-FR"/>
+              </w:rPr>
+              <w:t>Consultation des informations personnelles</w:t>
+            </w:r>
+          </w:p>
+        </w:tc>
+        <w:tc>
+          <w:tcPr>
+            <w:tcW w:w="2880" w:type="dxa"/>
+          </w:tcPr>
+          <w:p>
+            <w:pPr>
+              <w:rPr>
+                <w:lang w:val="fr-FR"/>
+              </w:rPr>
+            </w:pPr>
+            <w:r>
+              <w:rPr>
+                <w:lang w:val="fr-FR"/>
+              </w:rPr>
+              <w:t>Requête utilisateur</w:t>
+            </w:r>
+          </w:p>
+        </w:tc>
+        <w:tc>
+          <w:tcPr>
+            <w:tcW w:w="2880" w:type="dxa"/>
+          </w:tcPr>
+          <w:p>
+            <w:pPr>
+              <w:rPr>
+                <w:lang w:val="fr-FR"/>
+              </w:rPr>
+            </w:pPr>
+            <w:r>
+              <w:rPr>
+                <w:lang w:val="fr-FR"/>
+              </w:rPr>
+              <w:t>Affichage des informations</w:t>
+            </w:r>
+          </w:p>
+        </w:tc>
+      </w:tr>
+      <w:tr>
+        <w:tc>
+          <w:tcPr>
+            <w:tcW w:w="2880" w:type="dxa"/>
+          </w:tcPr>
+          <w:p>
+            <w:pPr>
+              <w:rPr>
+                <w:lang w:val="fr-FR"/>
+              </w:rPr>
+            </w:pPr>
+            <w:r>
+              <w:rPr>
+                <w:lang w:val="fr-FR"/>
+              </w:rPr>
+              <w:t>Affichage de la carte</w:t>
+            </w:r>
+          </w:p>
+        </w:tc>
+        <w:tc>
+          <w:tcPr>
+            <w:tcW w:w="2880" w:type="dxa"/>
+          </w:tcPr>
+          <w:p>
+            <w:pPr>
+              <w:rPr>
+                <w:lang w:val="fr-FR"/>
+              </w:rPr>
+            </w:pPr>
+            <w:r>
+              <w:rPr>
+                <w:lang w:val="fr-FR"/>
+              </w:rPr>
+              <w:t>Actions utilisateur (zoom, déplacement)</w:t>
+            </w:r>
+          </w:p>
+        </w:tc>
+        <w:tc>
+          <w:tcPr>
+            <w:tcW w:w="2880" w:type="dxa"/>
+          </w:tcPr>
+          <w:p>
+            <w:pPr>
+              <w:rPr>
+                <w:lang w:val="fr-FR"/>
+              </w:rPr>
+            </w:pPr>
+            <w:r>
+              <w:rPr>
+                <w:lang w:val="fr-FR"/>
+              </w:rPr>
+              <w:t>Carte affichée et mise à jour</w:t>
+            </w:r>
+          </w:p>
+        </w:tc>
+      </w:tr>
+      <w:tr>
+        <w:tc>
+          <w:tcPr>
+            <w:tcW w:w="2880" w:type="dxa"/>
+          </w:tcPr>
+          <w:p>
+            <w:pPr>
+              <w:rPr>
+                <w:lang w:val="fr-FR"/>
+              </w:rPr>
+            </w:pPr>
+            <w:r>
+              <w:rPr>
+                <w:lang w:val="fr-FR"/>
+              </w:rPr>
+              <w:t>Navigation / Superposition de données</w:t>
+            </w:r>
+          </w:p>
+        </w:tc>
+        <w:tc>
+          <w:tcPr>
+            <w:tcW w:w="2880" w:type="dxa"/>
+          </w:tcPr>
+          <w:p>
+            <w:pPr>
+              <w:rPr>
+                <w:lang w:val="fr-FR"/>
+              </w:rPr>
+            </w:pPr>
+            <w:r>
+              <w:rPr>
+                <w:lang w:val="fr-FR"/>
+              </w:rPr>
+              <w:t>Choix de parcours, sélection de filtres</w:t>
+            </w:r>
+          </w:p>
+        </w:tc>
+        <w:tc>
+          <w:tcPr>
+            <w:tcW w:w="2880" w:type="dxa"/>
+          </w:tcPr>
+          <w:p>
+            <w:pPr>
+              <w:rPr>
+                <w:lang w:val="fr-FR"/>
+              </w:rPr>
+            </w:pPr>
+            <w:r>
+              <w:rPr>
+                <w:lang w:val="fr-FR"/>
+              </w:rPr>
+              <w:t>Carte enrichie avec POI et parcours</w:t>
+            </w:r>
+          </w:p>
+        </w:tc>
+      </w:tr>
+      <w:tr>
+        <w:tc>
+          <w:tcPr>
+            <w:tcW w:w="2880" w:type="dxa"/>
+          </w:tcPr>
+          <w:p>
+            <w:pPr>
+              <w:rPr>
+                <w:lang w:val="fr-FR"/>
+              </w:rPr>
+            </w:pPr>
+            <w:r>
+              <w:rPr>
+                <w:lang w:val="fr-FR"/>
+              </w:rPr>
+              <w:t>Recherche d’un point d’intérêt (POI)</w:t>
+            </w:r>
+          </w:p>
+        </w:tc>
+        <w:tc>
+          <w:tcPr>
+            <w:tcW w:w="2880" w:type="dxa"/>
+          </w:tcPr>
+          <w:p>
+            <w:pPr>
+              <w:rPr>
+                <w:lang w:val="fr-FR"/>
+              </w:rPr>
+            </w:pPr>
+            <w:r>
+              <w:rPr>
+                <w:lang w:val="fr-FR"/>
+              </w:rPr>
+              <w:t>Mot-clé, catégorie, coordonnées</w:t>
+            </w:r>
+          </w:p>
+        </w:tc>
+        <w:tc>
+          <w:tcPr>
+            <w:tcW w:w="2880" w:type="dxa"/>
+          </w:tcPr>
+          <w:p>
+            <w:pPr>
+              <w:rPr>
+                <w:lang w:val="fr-FR"/>
+              </w:rPr>
+            </w:pPr>
+            <w:r>
+              <w:rPr>
+                <w:lang w:val="fr-FR"/>
+              </w:rPr>
+              <w:t>Résultats de recherche, description générée par API</w:t>
+            </w:r>
+          </w:p>
+        </w:tc>
+      </w:tr>
+      <w:tr>
+        <w:tc>
+          <w:tcPr>
+            <w:tcW w:w="2880" w:type="dxa"/>
+          </w:tcPr>
+          <w:p>
+            <w:pPr>
+              <w:rPr>
+                <w:lang w:val="fr-FR"/>
+              </w:rPr>
+            </w:pPr>
+            <w:r>
+              <w:rPr>
+                <w:lang w:val="fr-FR"/>
+              </w:rPr>
+              <w:t>Ajout d’un POI à un Road-Trip</w:t>
+            </w:r>
+          </w:p>
+        </w:tc>
+        <w:tc>
+          <w:tcPr>
+            <w:tcW w:w="2880" w:type="dxa"/>
+          </w:tcPr>
+          <w:p>
+            <w:pPr>
+              <w:rPr>
+                <w:lang w:val="fr-FR"/>
+              </w:rPr>
+            </w:pPr>
+            <w:r>
+              <w:rPr>
+                <w:lang w:val="fr-FR"/>
+              </w:rPr>
+              <w:t>Sélection d’un POI, choix du Road-Trip</w:t>
+            </w:r>
+          </w:p>
+        </w:tc>
+        <w:tc>
+          <w:tcPr>
+            <w:tcW w:w="2880" w:type="dxa"/>
+          </w:tcPr>
+          <w:p>
+            <w:pPr>
+              <w:rPr>
+                <w:lang w:val="fr-FR"/>
+              </w:rPr>
+            </w:pPr>
+            <w:r>
+              <w:rPr>
+                <w:lang w:val="fr-FR"/>
+              </w:rPr>
+              <w:t>Road-Trip mis à jour avec le POI</w:t>
+            </w:r>
+          </w:p>
+        </w:tc>
+      </w:tr>
+      <w:tr>
+        <w:tc>
+          <w:tcPr>
+            <w:tcW w:w="2880" w:type="dxa"/>
+          </w:tcPr>
+          <w:p>
+            <w:pPr>
+              <w:rPr>
+                <w:lang w:val="fr-FR"/>
+              </w:rPr>
+            </w:pPr>
+            <w:r>
+              <w:rPr>
+                <w:lang w:val="fr-FR"/>
+              </w:rPr>
+              <w:t>Historique / Évaluations</w:t>
+            </w:r>
+          </w:p>
+        </w:tc>
+        <w:tc>
+          <w:tcPr>
+            <w:tcW w:w="2880" w:type="dxa"/>
+          </w:tcPr>
+          <w:p>
+            <w:pPr>
+              <w:rPr>
+                <w:lang w:val="fr-FR"/>
+              </w:rPr>
+            </w:pPr>
+            <w:r>
+              <w:rPr>
+                <w:lang w:val="fr-FR"/>
+              </w:rPr>
+              <w:t>Action utilisateur (consultation, notation)</w:t>
+            </w:r>
+          </w:p>
+        </w:tc>
+        <w:tc>
+          <w:tcPr>
+            <w:tcW w:w="2880" w:type="dxa"/>
+          </w:tcPr>
+          <w:p>
+            <w:pPr>
+              <w:rPr>
+                <w:lang w:val="fr-FR"/>
+              </w:rPr>
+            </w:pPr>
+            <w:r>
+              <w:rPr>
+                <w:lang w:val="fr-FR"/>
+              </w:rPr>
+              <w:t>Historique affiché ou mis à jour</w:t>
+            </w:r>
+          </w:p>
+        </w:tc>
+      </w:tr>
+      <w:tr>
+        <w:tc>
+          <w:tcPr>
+            <w:tcW w:w="2880" w:type="dxa"/>
+          </w:tcPr>
+          <w:p>
+            <w:pPr>
+              <w:rPr>
+                <w:lang w:val="fr-FR"/>
+              </w:rPr>
+            </w:pPr>
+            <w:r>
+              <w:rPr>
+                <w:lang w:val="fr-FR"/>
+              </w:rPr>
+              <w:t>Création / Modification d’un Road-Trip</w:t>
+            </w:r>
+          </w:p>
+        </w:tc>
+        <w:tc>
+          <w:tcPr>
+            <w:tcW w:w="2880" w:type="dxa"/>
+          </w:tcPr>
+          <w:p>
+            <w:pPr>
+              <w:rPr>
+                <w:lang w:val="fr-FR"/>
+              </w:rPr>
+            </w:pPr>
+            <w:r>
+              <w:rPr>
+                <w:lang w:val="fr-FR"/>
+              </w:rPr>
+              <w:t>Points de passage, nom du Road-Trip, options de partage</w:t>
+            </w:r>
+          </w:p>
+        </w:tc>
+        <w:tc>
+          <w:tcPr>
+            <w:tcW w:w="2880" w:type="dxa"/>
+          </w:tcPr>
+          <w:p>
+            <w:pPr>
+              <w:rPr>
+                <w:lang w:val="fr-FR"/>
+              </w:rPr>
+            </w:pPr>
+            <w:r>
+              <w:rPr>
+                <w:lang w:val="fr-FR"/>
+              </w:rPr>
+              <w:t>Road-Trip sauvegardé, affiché, partagé</w:t>
+            </w:r>
+          </w:p>
+        </w:tc>
+      </w:tr>
+      <w:tr>
+        <w:tc>
+          <w:tcPr>
+            <w:tcW w:w="2880" w:type="dxa"/>
+          </w:tcPr>
+          <w:p>
+            <w:pPr>
+              <w:rPr>
+                <w:lang w:val="fr-FR"/>
+              </w:rPr>
+            </w:pPr>
+            <w:r>
+              <w:rPr>
+                <w:lang w:val="fr-FR"/>
+              </w:rPr>
+              <w:t>Consultation d’un Road-Trip</w:t>
+            </w:r>
+          </w:p>
+        </w:tc>
+        <w:tc>
+          <w:tcPr>
+            <w:tcW w:w="2880" w:type="dxa"/>
+          </w:tcPr>
+          <w:p>
+            <w:pPr>
+              <w:rPr>
+                <w:lang w:val="fr-FR"/>
+              </w:rPr>
+            </w:pPr>
+            <w:r>
+              <w:rPr>
+                <w:lang w:val="fr-FR"/>
+              </w:rPr>
+              <w:t>Requête utilisateur</w:t>
+            </w:r>
+          </w:p>
+        </w:tc>
+        <w:tc>
+          <w:tcPr>
+            <w:tcW w:w="2880" w:type="dxa"/>
+          </w:tcPr>
+          <w:p>
+            <w:pPr>
+              <w:rPr>
+                <w:lang w:val="fr-FR"/>
+              </w:rPr>
+            </w:pPr>
+            <w:r>
+              <w:rPr>
+                <w:lang w:val="fr-FR"/>
+              </w:rPr>
+              <w:t>Affichage de l’itinéraire et des étapes</w:t>
+            </w:r>
+          </w:p>
+        </w:tc>
+      </w:tr>
+      <w:tr>
+        <w:tc>
+          <w:tcPr>
+            <w:tcW w:w="2880" w:type="dxa"/>
+          </w:tcPr>
+          <w:p>
+            <w:pPr>
+              <w:rPr>
+                <w:lang w:val="fr-FR"/>
+              </w:rPr>
+            </w:pPr>
+            <w:r>
+              <w:rPr>
+                <w:lang w:val="fr-FR"/>
+              </w:rPr>
+              <w:t>Commentaires / Avis</w:t>
+            </w:r>
+          </w:p>
+        </w:tc>
+        <w:tc>
+          <w:tcPr>
+            <w:tcW w:w="2880" w:type="dxa"/>
+          </w:tcPr>
+          <w:p>
+            <w:pPr>
+              <w:rPr>
+                <w:lang w:val="fr-FR"/>
+              </w:rPr>
+            </w:pPr>
+            <w:r>
+              <w:rPr>
+                <w:lang w:val="fr-FR"/>
+              </w:rPr>
+              <w:t>Texte du commentaire, note</w:t>
+            </w:r>
+          </w:p>
+        </w:tc>
+        <w:tc>
+          <w:tcPr>
+            <w:tcW w:w="2880" w:type="dxa"/>
+          </w:tcPr>
+          <w:p>
+            <w:pPr>
+              <w:rPr>
+                <w:lang w:val="fr-FR"/>
+              </w:rPr>
+            </w:pPr>
+            <w:r>
+              <w:rPr>
+                <w:lang w:val="fr-FR"/>
+              </w:rPr>
+              <w:t>Avis enregistré, affichage, notification</w:t>
+            </w:r>
+          </w:p>
+        </w:tc>
+      </w:tr>
+      <w:tr>
+        <w:tc>
+          <w:tcPr>
+            <w:tcW w:w="2880" w:type="dxa"/>
+          </w:tcPr>
+          <w:p>
+            <w:pPr>
+              <w:rPr>
+                <w:lang w:val="fr-FR"/>
+              </w:rPr>
+            </w:pPr>
+            <w:r>
+              <w:rPr>
+                <w:lang w:val="fr-FR"/>
+              </w:rPr>
+              <w:t>Chat intégré</w:t>
+            </w:r>
+          </w:p>
+        </w:tc>
+        <w:tc>
+          <w:tcPr>
+            <w:tcW w:w="2880" w:type="dxa"/>
+          </w:tcPr>
+          <w:p>
+            <w:pPr>
+              <w:rPr>
+                <w:lang w:val="fr-FR"/>
+              </w:rPr>
+            </w:pPr>
+            <w:r>
+              <w:rPr>
+                <w:lang w:val="fr-FR"/>
+              </w:rPr>
+              <w:t>Message saisi</w:t>
+            </w:r>
+          </w:p>
+        </w:tc>
+        <w:tc>
+          <w:tcPr>
+            <w:tcW w:w="2880" w:type="dxa"/>
+          </w:tcPr>
+          <w:p>
+            <w:pPr>
+              <w:rPr>
+                <w:lang w:val="fr-FR"/>
+              </w:rPr>
+            </w:pPr>
+            <w:r>
+              <w:rPr>
+                <w:lang w:val="fr-FR"/>
+              </w:rPr>
+              <w:t>Message reçu et affiché en temps réel</w:t>
+            </w:r>
+          </w:p>
+        </w:tc>
+      </w:tr>
+      <w:tr>
+        <w:tc>
+          <w:tcPr>
+            <w:tcW w:w="2880" w:type="dxa"/>
+          </w:tcPr>
+          <w:p>
+            <w:pPr>
+              <w:rPr>
+                <w:lang w:val="fr-FR"/>
+              </w:rPr>
+            </w:pPr>
+            <w:r>
+              <w:rPr>
+                <w:lang w:val="fr-FR"/>
+              </w:rPr>
+              <w:t>Notifications</w:t>
+            </w:r>
+          </w:p>
+        </w:tc>
+        <w:tc>
+          <w:tcPr>
+            <w:tcW w:w="2880" w:type="dxa"/>
+          </w:tcPr>
+          <w:p>
+            <w:pPr>
+              <w:rPr>
+                <w:lang w:val="fr-FR"/>
+              </w:rPr>
+            </w:pPr>
+            <w:r>
+              <w:rPr>
+                <w:lang w:val="fr-FR"/>
+              </w:rPr>
+              <w:t>Actions des amis, commentaires, partages</w:t>
+            </w:r>
+          </w:p>
+        </w:tc>
+        <w:tc>
+          <w:tcPr>
+            <w:tcW w:w="2880" w:type="dxa"/>
+          </w:tcPr>
+          <w:p>
+            <w:pPr>
+              <w:rPr>
+                <w:lang w:val="fr-FR"/>
+              </w:rPr>
+            </w:pPr>
+            <w:r>
+              <w:rPr>
+                <w:lang w:val="fr-FR"/>
+              </w:rPr>
+              <w:t>Notifications envoyées et affichées</w:t>
+            </w:r>
+          </w:p>
+        </w:tc>
+      </w:tr>
+      <w:tr>
+        <w:tc>
+          <w:tcPr>
+            <w:tcW w:w="2880" w:type="dxa"/>
+          </w:tcPr>
+          <w:p>
+            <w:pPr>
+              <w:rPr>
+                <w:lang w:val="fr-FR"/>
+              </w:rPr>
+            </w:pPr>
+            <w:r>
+              <w:rPr>
+                <w:lang w:val="fr-FR"/>
+              </w:rPr>
+              <w:t>Administration / Signalement</w:t>
+            </w:r>
+          </w:p>
+        </w:tc>
+        <w:tc>
+          <w:tcPr>
+            <w:tcW w:w="2880" w:type="dxa"/>
+          </w:tcPr>
+          <w:p>
+            <w:pPr>
+              <w:rPr>
+                <w:lang w:val="fr-FR"/>
+              </w:rPr>
+            </w:pPr>
+            <w:r>
+              <w:rPr>
+                <w:lang w:val="fr-FR"/>
+              </w:rPr>
+              <w:t>Requête de modération, action admin (bloquer, bannir)</w:t>
+            </w:r>
+          </w:p>
+        </w:tc>
+        <w:tc>
+          <w:tcPr>
+            <w:tcW w:w="2880" w:type="dxa"/>
+          </w:tcPr>
+          <w:p>
+            <w:pPr>
+              <w:rPr>
+                <w:lang w:val="fr-FR"/>
+              </w:rPr>
+            </w:pPr>
+            <w:r>
+              <w:rPr>
+                <w:lang w:val="fr-FR"/>
+              </w:rPr>
+              <w:t>Confirmation d’action, contenu modéré, rapport traité</w:t>
+            </w:r>
+          </w:p>
+        </w:tc>
+      </w:tr>
+      <w:tr>
+        <w:tc>
+          <w:tcPr>
+            <w:tcW w:w="2880" w:type="dxa"/>
+          </w:tcPr>
+          <w:p>
+            <w:pPr>
+              <w:rPr>
+                <w:lang w:val="fr-FR"/>
+              </w:rPr>
+            </w:pPr>
+            <w:r>
+              <w:rPr>
+                <w:lang w:val="fr-FR"/>
+              </w:rPr>
+              <w:t>Hébergement &amp; Base de données</w:t>
+            </w:r>
+          </w:p>
+        </w:tc>
+        <w:tc>
+          <w:tcPr>
+            <w:tcW w:w="2880" w:type="dxa"/>
+          </w:tcPr>
+          <w:p>
+            <w:pPr>
+              <w:rPr>
+                <w:lang w:val="fr-FR"/>
+              </w:rPr>
+            </w:pPr>
+            <w:r>
+              <w:rPr>
+                <w:lang w:val="fr-FR"/>
+              </w:rPr>
+              <w:t>Requêtes de lecture/écriture, authentification utilisateur</w:t>
+            </w:r>
+          </w:p>
+        </w:tc>
+        <w:tc>
+          <w:tcPr>
+            <w:tcW w:w="2880" w:type="dxa"/>
+          </w:tcPr>
+          <w:p>
+            <w:pPr>
+              <w:rPr>
+                <w:lang w:val="fr-FR"/>
+              </w:rPr>
+            </w:pPr>
+            <w:r>
+              <w:rPr>
+                <w:lang w:val="fr-FR"/>
+              </w:rPr>
+              <w:t>Données sauvegardées/restituées, disponibilité service</w:t>
+            </w:r>
+          </w:p>
+        </w:tc>
+      </w:tr>
+      <w:tr>
+        <w:trPr>
+          <w:trHeight w:val="665"/>
+        </w:trPr>
+        <w:tc>
+          <w:tcPr>
+            <w:tcW w:w="2880" w:type="dxa"/>
+          </w:tcPr>
+          <w:p>
+            <w:pPr>
+              <w:rPr>
+                <w:lang w:val="fr-FR"/>
+              </w:rPr>
+            </w:pPr>
+            <w:r>
+              <w:rPr>
+                <w:lang w:val="fr-FR"/>
+              </w:rPr>
+              <w:t>Sécurité</w:t>
+            </w:r>
+          </w:p>
+        </w:tc>
+        <w:tc>
+          <w:tcPr>
+            <w:tcW w:w="2880" w:type="dxa"/>
+          </w:tcPr>
+          <w:p>
+            <w:pPr>
+              <w:rPr>
+                <w:lang w:val="fr-FR"/>
+              </w:rPr>
+            </w:pPr>
+            <w:r>
+              <w:rPr>
+                <w:lang w:val="fr-FR"/>
+              </w:rPr>
+              <w:t>Tentatives de connexion, accès aux données</w:t>
+            </w:r>
+          </w:p>
+        </w:tc>
+        <w:tc>
+          <w:tcPr>
+            <w:tcW w:w="2880" w:type="dxa"/>
+          </w:tcPr>
+          <w:p>
+            <w:pPr>
+              <w:rPr>
+                <w:lang w:val="fr-FR"/>
+              </w:rPr>
+            </w:pPr>
+            <w:r>
+              <w:rPr>
+                <w:lang w:val="fr-FR"/>
+              </w:rPr>
+              <w:t>Protection appliquée, logs de sécurité</w:t>
+            </w:r>
+          </w:p>
+        </w:tc>
+      </w:tr>
+    </w:tbl>
+    <w:p/>
+    <w:p>
+      <w:pPr>
+        <w:jc w:val="left"/>
+      </w:pPr>
+      <w:r>
+        <w:br w:type="page"/>
+      </w:r>
+    </w:p>
+    <w:p>
+      <w:pPr>
+        <w:pStyle w:val="Titre2"/>
+      </w:pPr>
+      <w:r>
+        <w:lastRenderedPageBreak/>
+        <w:t>Définition des modules</w:t>
+      </w:r>
+    </w:p>
+    <w:p>
+      <w:r>
+        <w:t>Nous pouvons regrouper les fonctionnalités ci-dessus en plusieurs catégories :</w:t>
+      </w:r>
+    </w:p>
+    <w:p/>
+    <w:p>
+      <w:pPr>
+        <w:pStyle w:val="Titre3"/>
+      </w:pPr>
+      <w:r>
+        <w:t>Module d’authentification et de gestion des comptes</w:t>
+      </w:r>
+    </w:p>
+    <w:p>
+      <w:pPr>
+        <w:pStyle w:val="Paragraphedeliste"/>
+        <w:numPr>
+          <w:ilvl w:val="0"/>
+          <w:numId w:val="21"/>
+        </w:numPr>
+      </w:pPr>
+      <w:r>
+        <w:t>Inscription, connexion, déconnexion</w:t>
+      </w:r>
+      <w:r>
+        <w:t>, supprimer</w:t>
+      </w:r>
+    </w:p>
+    <w:p>
+      <w:pPr>
+        <w:pStyle w:val="Paragraphedeliste"/>
+        <w:numPr>
+          <w:ilvl w:val="0"/>
+          <w:numId w:val="21"/>
+        </w:numPr>
+      </w:pPr>
+      <w:r>
+        <w:t>Gestion de profil (pseudo, photo, bio)</w:t>
+      </w:r>
+    </w:p>
+    <w:p>
+      <w:pPr>
+        <w:pStyle w:val="Paragraphedeliste"/>
+        <w:numPr>
+          <w:ilvl w:val="0"/>
+          <w:numId w:val="21"/>
+        </w:numPr>
+      </w:pPr>
+      <w:r>
+        <w:t>Gestion des amis</w:t>
+      </w:r>
+    </w:p>
+    <w:p>
+      <w:pPr>
+        <w:pStyle w:val="Paragraphedeliste"/>
+        <w:numPr>
+          <w:ilvl w:val="0"/>
+          <w:numId w:val="21"/>
+        </w:numPr>
+      </w:pPr>
+      <w:r>
+        <w:t>Récupération des infos personnelles</w:t>
+      </w:r>
+    </w:p>
+    <w:p/>
+    <w:p>
+      <w:pPr>
+        <w:pStyle w:val="Titre3"/>
+      </w:pPr>
+      <w:r>
+        <w:t>Module cartographique</w:t>
+      </w:r>
+    </w:p>
+    <w:p>
+      <w:pPr>
+        <w:pStyle w:val="Paragraphedeliste"/>
+        <w:numPr>
+          <w:ilvl w:val="0"/>
+          <w:numId w:val="22"/>
+        </w:numPr>
+      </w:pPr>
+      <w:r>
+        <w:t>Affichage de la carte OpenStreetMap</w:t>
+      </w:r>
+    </w:p>
+    <w:p>
+      <w:pPr>
+        <w:pStyle w:val="Paragraphedeliste"/>
+        <w:numPr>
+          <w:ilvl w:val="0"/>
+          <w:numId w:val="22"/>
+        </w:numPr>
+      </w:pPr>
+      <w:r>
+        <w:t>Navigation sur la carte (zoom, déplacement)</w:t>
+      </w:r>
+    </w:p>
+    <w:p>
+      <w:pPr>
+        <w:pStyle w:val="Paragraphedeliste"/>
+        <w:numPr>
+          <w:ilvl w:val="0"/>
+          <w:numId w:val="22"/>
+        </w:numPr>
+      </w:pPr>
+      <w:r>
+        <w:t>Superposition des parcours et des points d’intérêt</w:t>
+      </w:r>
+    </w:p>
+    <w:p>
+      <w:pPr>
+        <w:pStyle w:val="Paragraphedeliste"/>
+        <w:numPr>
+          <w:ilvl w:val="0"/>
+          <w:numId w:val="22"/>
+        </w:numPr>
+      </w:pPr>
+      <w:r>
+        <w:t>Filtrage des informations en fonction des préférences</w:t>
+      </w:r>
+    </w:p>
+    <w:p/>
+    <w:p>
+      <w:pPr>
+        <w:pStyle w:val="Titre3"/>
+      </w:pPr>
+      <w:r>
+        <w:t>Module Road-Trip</w:t>
+      </w:r>
+    </w:p>
+    <w:p>
+      <w:pPr>
+        <w:pStyle w:val="Paragraphedeliste"/>
+        <w:numPr>
+          <w:ilvl w:val="0"/>
+          <w:numId w:val="23"/>
+        </w:numPr>
+      </w:pPr>
+      <w:r>
+        <w:t xml:space="preserve">Création et modification d’un itinéraire </w:t>
+      </w:r>
+    </w:p>
+    <w:p>
+      <w:pPr>
+        <w:pStyle w:val="Paragraphedeliste"/>
+        <w:numPr>
+          <w:ilvl w:val="0"/>
+          <w:numId w:val="23"/>
+        </w:numPr>
+      </w:pPr>
+      <w:r>
+        <w:t>Ajout d’étapes/points de passage</w:t>
+      </w:r>
+    </w:p>
+    <w:p>
+      <w:pPr>
+        <w:pStyle w:val="Paragraphedeliste"/>
+        <w:numPr>
+          <w:ilvl w:val="0"/>
+          <w:numId w:val="23"/>
+        </w:numPr>
+      </w:pPr>
+      <w:r>
+        <w:t>Enregistrement (temporaire ou définitif)</w:t>
+      </w:r>
+    </w:p>
+    <w:p>
+      <w:pPr>
+        <w:pStyle w:val="Paragraphedeliste"/>
+        <w:numPr>
+          <w:ilvl w:val="0"/>
+          <w:numId w:val="23"/>
+        </w:numPr>
+      </w:pPr>
+      <w:r>
+        <w:t>Partage (public, amis, privé)</w:t>
+      </w:r>
+    </w:p>
+    <w:p>
+      <w:pPr>
+        <w:pStyle w:val="Paragraphedeliste"/>
+        <w:numPr>
+          <w:ilvl w:val="0"/>
+          <w:numId w:val="23"/>
+        </w:numPr>
+      </w:pPr>
+      <w:r>
+        <w:t>Consulter un Road-Trip</w:t>
+      </w:r>
+    </w:p>
+    <w:p/>
+    <w:p>
+      <w:pPr>
+        <w:pStyle w:val="Titre3"/>
+      </w:pPr>
+      <w:r>
+        <w:t>Module point d’intérêt</w:t>
+      </w:r>
+      <w:r>
+        <w:t xml:space="preserve"> (POI)</w:t>
+      </w:r>
+    </w:p>
+    <w:p>
+      <w:pPr>
+        <w:pStyle w:val="Paragraphedeliste"/>
+        <w:numPr>
+          <w:ilvl w:val="0"/>
+          <w:numId w:val="24"/>
+        </w:numPr>
+      </w:pPr>
+      <w:r>
+        <w:t xml:space="preserve">Recherche et ajout de points d’intérêt sur la carte </w:t>
+      </w:r>
+    </w:p>
+    <w:p>
+      <w:pPr>
+        <w:pStyle w:val="Paragraphedeliste"/>
+        <w:numPr>
+          <w:ilvl w:val="0"/>
+          <w:numId w:val="24"/>
+        </w:numPr>
+      </w:pPr>
+      <w:r>
+        <w:t>Description automatique d’un POI (via API IA)</w:t>
+      </w:r>
+    </w:p>
+    <w:p>
+      <w:pPr>
+        <w:pStyle w:val="Paragraphedeliste"/>
+        <w:numPr>
+          <w:ilvl w:val="0"/>
+          <w:numId w:val="24"/>
+        </w:numPr>
+      </w:pPr>
+      <w:r>
+        <w:t>Historique de visites / évaluations</w:t>
+      </w:r>
+    </w:p>
+    <w:p>
+      <w:pPr>
+        <w:pStyle w:val="Paragraphedeliste"/>
+        <w:numPr>
+          <w:ilvl w:val="0"/>
+          <w:numId w:val="24"/>
+        </w:numPr>
+      </w:pPr>
+      <w:r>
+        <w:t>Possibilité d’associer un POI à un Road-Trip</w:t>
+      </w:r>
+    </w:p>
+    <w:p/>
+    <w:p>
+      <w:pPr>
+        <w:pStyle w:val="Titre3"/>
+      </w:pPr>
+      <w:r>
+        <w:t>Module communautaire</w:t>
+      </w:r>
+    </w:p>
+    <w:p>
+      <w:pPr>
+        <w:pStyle w:val="Paragraphedeliste"/>
+        <w:numPr>
+          <w:ilvl w:val="0"/>
+          <w:numId w:val="25"/>
+        </w:numPr>
+      </w:pPr>
+      <w:r>
+        <w:t>Ajout d’amis et gestion du réseau</w:t>
+      </w:r>
+    </w:p>
+    <w:p>
+      <w:pPr>
+        <w:pStyle w:val="Paragraphedeliste"/>
+        <w:numPr>
+          <w:ilvl w:val="0"/>
+          <w:numId w:val="25"/>
+        </w:numPr>
+      </w:pPr>
+      <w:r>
+        <w:t>Système de commentaire et avis (sur des POI et des Road-Trip)</w:t>
+      </w:r>
+    </w:p>
+    <w:p>
+      <w:pPr>
+        <w:pStyle w:val="Paragraphedeliste"/>
+        <w:numPr>
+          <w:ilvl w:val="0"/>
+          <w:numId w:val="25"/>
+        </w:numPr>
+      </w:pPr>
+      <w:r>
+        <w:t>Chat intégré pour échanger entre amis</w:t>
+      </w:r>
+    </w:p>
+    <w:p>
+      <w:pPr>
+        <w:pStyle w:val="Paragraphedeliste"/>
+        <w:numPr>
+          <w:ilvl w:val="0"/>
+          <w:numId w:val="25"/>
+        </w:numPr>
+      </w:pPr>
+      <w:r>
+        <w:t>Notification (nouvel avis, nouvel ami, road-trip partagé…)</w:t>
+      </w:r>
+    </w:p>
+    <w:p/>
+    <w:p>
+      <w:pPr>
+        <w:pStyle w:val="Titre3"/>
+      </w:pPr>
+      <w:r>
+        <w:t>Module administration</w:t>
+      </w:r>
+    </w:p>
+    <w:p>
+      <w:pPr>
+        <w:pStyle w:val="Paragraphedeliste"/>
+        <w:numPr>
+          <w:ilvl w:val="0"/>
+          <w:numId w:val="26"/>
+        </w:numPr>
+      </w:pPr>
+      <w:r>
+        <w:t>Gestion des utilisateurs (bloquer, bannir)</w:t>
+      </w:r>
+    </w:p>
+    <w:p>
+      <w:pPr>
+        <w:pStyle w:val="Paragraphedeliste"/>
+        <w:numPr>
+          <w:ilvl w:val="0"/>
+          <w:numId w:val="26"/>
+        </w:numPr>
+      </w:pPr>
+      <w:r>
+        <w:lastRenderedPageBreak/>
+        <w:t>Modération des contenus (avis, POI créés, commentaires)</w:t>
+      </w:r>
+    </w:p>
+    <w:p>
+      <w:pPr>
+        <w:pStyle w:val="Paragraphedeliste"/>
+        <w:numPr>
+          <w:ilvl w:val="0"/>
+          <w:numId w:val="26"/>
+        </w:numPr>
+      </w:pPr>
+      <w:r>
+        <w:t>Outils de signalement</w:t>
+      </w:r>
+    </w:p>
+    <w:p>
+      <w:pPr>
+        <w:pStyle w:val="Paragraphedeliste"/>
+        <w:numPr>
+          <w:ilvl w:val="0"/>
+          <w:numId w:val="26"/>
+        </w:numPr>
+      </w:pPr>
+      <w:r>
+        <w:t xml:space="preserve">Mise à jour de certains contenus </w:t>
+      </w:r>
+    </w:p>
+    <w:p/>
+    <w:p>
+      <w:pPr>
+        <w:pStyle w:val="Titre3"/>
+      </w:pPr>
+      <w:r>
+        <w:t xml:space="preserve">Module infrastructure </w:t>
+      </w:r>
+    </w:p>
+    <w:p>
+      <w:pPr>
+        <w:pStyle w:val="Paragraphedeliste"/>
+        <w:numPr>
+          <w:ilvl w:val="0"/>
+          <w:numId w:val="27"/>
+        </w:numPr>
+      </w:pPr>
+      <w:r>
+        <w:t>Base de données utilisateurs, Road-Trip et avis</w:t>
+      </w:r>
+    </w:p>
+    <w:p>
+      <w:pPr>
+        <w:pStyle w:val="Paragraphedeliste"/>
+        <w:numPr>
+          <w:ilvl w:val="0"/>
+          <w:numId w:val="27"/>
+        </w:numPr>
+      </w:pPr>
+      <w:r>
+        <w:t>Hébergement</w:t>
+      </w:r>
+    </w:p>
+    <w:p>
+      <w:pPr>
+        <w:pStyle w:val="Paragraphedeliste"/>
+        <w:numPr>
+          <w:ilvl w:val="0"/>
+          <w:numId w:val="27"/>
+        </w:numPr>
+      </w:pPr>
+      <w:r>
+        <w:t>Sécurité (protection des données (RGPD))</w:t>
+      </w:r>
     </w:p>
     <w:p/>
     <w:p/>
@@ -4099,7 +5783,7 @@
         <w:bCs/>
         <w:noProof/>
       </w:rPr>
-      <w:t>5</w:t>
+      <w:t>8</w:t>
     </w:r>
     <w:r>
       <w:rPr>
@@ -4310,6 +5994,119 @@
 <file path=word/numbering.xml><?xml version="1.0" encoding="utf-8"?>
 <w:numbering xmlns:wpc="http://schemas.microsoft.com/office/word/2010/wordprocessingCanvas" xmlns:cx="http://schemas.microsoft.com/office/drawing/2014/chartex" xmlns:cx1="http://schemas.microsoft.com/office/drawing/2015/9/8/chartex" xmlns:cx2="http://schemas.microsoft.com/office/drawing/2015/10/21/chartex" xmlns:cx3="http://schemas.microsoft.com/office/drawing/2016/5/9/chartex" xmlns:cx4="http://schemas.microsoft.com/office/drawing/2016/5/10/chartex" xmlns:cx5="http://schemas.microsoft.com/office/drawing/2016/5/11/chartex" xmlns:cx6="http://schemas.microsoft.com/office/drawing/2016/5/12/chartex" xmlns:cx7="http://schemas.microsoft.com/office/drawing/2016/5/13/chartex" xmlns:cx8="http://schemas.microsoft.com/office/drawing/2016/5/14/chartex" xmlns:mc="http://schemas.openxmlformats.org/markup-compatibility/2006" xmlns:aink="http://schemas.microsoft.com/office/drawing/2016/ink" xmlns:am3d="http://schemas.microsoft.com/office/drawing/2017/model3d" xmlns:o="urn:schemas-microsoft-com:office:office" xmlns:r="http://schemas.openxmlformats.org/officeDocument/2006/relationships" xmlns:m="http://schemas.openxmlformats.org/officeDocument/2006/math" xmlns:v="urn:schemas-microsoft-com:vml" xmlns:wp14="http://schemas.microsoft.com/office/word/2010/wordprocessingDrawing" xmlns:wp="http://schemas.openxmlformats.org/drawingml/2006/wordprocessingDrawing" xmlns:w10="urn:schemas-microsoft-com:office:word" xmlns:w="http://schemas.openxmlformats.org/wordprocessingml/2006/main" xmlns:w14="http://schemas.microsoft.com/office/word/2010/wordml" xmlns:w15="http://schemas.microsoft.com/office/word/2012/wordml" xmlns:w16cex="http://schemas.microsoft.com/office/word/2018/wordml/cex" xmlns:w16cid="http://schemas.microsoft.com/office/word/2016/wordml/cid" xmlns:w16="http://schemas.microsoft.com/office/word/2018/wordml" xmlns:w16sdtdh="http://schemas.microsoft.com/office/word/2020/wordml/sdtdatahash" xmlns:w16se="http://schemas.microsoft.com/office/word/2015/wordml/symex" xmlns:wpg="http://schemas.microsoft.com/office/word/2010/wordprocessingGroup" xmlns:wpi="http://schemas.microsoft.com/office/word/2010/wordprocessingInk" xmlns:wne="http://schemas.microsoft.com/office/word/2006/wordml" xmlns:wps="http://schemas.microsoft.com/office/word/2010/wordprocessingShape" mc:Ignorable="w14 w15 w16se w16cid w16 w16cex w16sdtdh wp14">
   <w:abstractNum w:abstractNumId="0" w15:restartNumberingAfterBreak="0">
+    <w:nsid w:val="01247281"/>
+    <w:multiLevelType w:val="hybridMultilevel"/>
+    <w:tmpl w:val="30A0F924"/>
+    <w:lvl w:ilvl="0" w:tplc="040C000B">
+      <w:start w:val="1"/>
+      <w:numFmt w:val="bullet"/>
+      <w:lvlText w:val=""/>
+      <w:lvlJc w:val="left"/>
+      <w:pPr>
+        <w:ind w:left="720" w:hanging="360"/>
+      </w:pPr>
+      <w:rPr>
+        <w:rFonts w:ascii="Wingdings" w:hAnsi="Wingdings" w:hint="default"/>
+      </w:rPr>
+    </w:lvl>
+    <w:lvl w:ilvl="1" w:tplc="040C0003" w:tentative="1">
+      <w:start w:val="1"/>
+      <w:numFmt w:val="bullet"/>
+      <w:lvlText w:val="o"/>
+      <w:lvlJc w:val="left"/>
+      <w:pPr>
+        <w:ind w:left="1440" w:hanging="360"/>
+      </w:pPr>
+      <w:rPr>
+        <w:rFonts w:ascii="Courier New" w:hAnsi="Courier New" w:cs="Courier New" w:hint="default"/>
+      </w:rPr>
+    </w:lvl>
+    <w:lvl w:ilvl="2" w:tplc="040C0005" w:tentative="1">
+      <w:start w:val="1"/>
+      <w:numFmt w:val="bullet"/>
+      <w:lvlText w:val=""/>
+      <w:lvlJc w:val="left"/>
+      <w:pPr>
+        <w:ind w:left="2160" w:hanging="360"/>
+      </w:pPr>
+      <w:rPr>
+        <w:rFonts w:ascii="Wingdings" w:hAnsi="Wingdings" w:hint="default"/>
+      </w:rPr>
+    </w:lvl>
+    <w:lvl w:ilvl="3" w:tplc="040C0001" w:tentative="1">
+      <w:start w:val="1"/>
+      <w:numFmt w:val="bullet"/>
+      <w:lvlText w:val=""/>
+      <w:lvlJc w:val="left"/>
+      <w:pPr>
+        <w:ind w:left="2880" w:hanging="360"/>
+      </w:pPr>
+      <w:rPr>
+        <w:rFonts w:ascii="Symbol" w:hAnsi="Symbol" w:hint="default"/>
+      </w:rPr>
+    </w:lvl>
+    <w:lvl w:ilvl="4" w:tplc="040C0003" w:tentative="1">
+      <w:start w:val="1"/>
+      <w:numFmt w:val="bullet"/>
+      <w:lvlText w:val="o"/>
+      <w:lvlJc w:val="left"/>
+      <w:pPr>
+        <w:ind w:left="3600" w:hanging="360"/>
+      </w:pPr>
+      <w:rPr>
+        <w:rFonts w:ascii="Courier New" w:hAnsi="Courier New" w:cs="Courier New" w:hint="default"/>
+      </w:rPr>
+    </w:lvl>
+    <w:lvl w:ilvl="5" w:tplc="040C0005" w:tentative="1">
+      <w:start w:val="1"/>
+      <w:numFmt w:val="bullet"/>
+      <w:lvlText w:val=""/>
+      <w:lvlJc w:val="left"/>
+      <w:pPr>
+        <w:ind w:left="4320" w:hanging="360"/>
+      </w:pPr>
+      <w:rPr>
+        <w:rFonts w:ascii="Wingdings" w:hAnsi="Wingdings" w:hint="default"/>
+      </w:rPr>
+    </w:lvl>
+    <w:lvl w:ilvl="6" w:tplc="040C0001" w:tentative="1">
+      <w:start w:val="1"/>
+      <w:numFmt w:val="bullet"/>
+      <w:lvlText w:val=""/>
+      <w:lvlJc w:val="left"/>
+      <w:pPr>
+        <w:ind w:left="5040" w:hanging="360"/>
+      </w:pPr>
+      <w:rPr>
+        <w:rFonts w:ascii="Symbol" w:hAnsi="Symbol" w:hint="default"/>
+      </w:rPr>
+    </w:lvl>
+    <w:lvl w:ilvl="7" w:tplc="040C0003" w:tentative="1">
+      <w:start w:val="1"/>
+      <w:numFmt w:val="bullet"/>
+      <w:lvlText w:val="o"/>
+      <w:lvlJc w:val="left"/>
+      <w:pPr>
+        <w:ind w:left="5760" w:hanging="360"/>
+      </w:pPr>
+      <w:rPr>
+        <w:rFonts w:ascii="Courier New" w:hAnsi="Courier New" w:cs="Courier New" w:hint="default"/>
+      </w:rPr>
+    </w:lvl>
+    <w:lvl w:ilvl="8" w:tplc="040C0005" w:tentative="1">
+      <w:start w:val="1"/>
+      <w:numFmt w:val="bullet"/>
+      <w:lvlText w:val=""/>
+      <w:lvlJc w:val="left"/>
+      <w:pPr>
+        <w:ind w:left="6480" w:hanging="360"/>
+      </w:pPr>
+      <w:rPr>
+        <w:rFonts w:ascii="Wingdings" w:hAnsi="Wingdings" w:hint="default"/>
+      </w:rPr>
+    </w:lvl>
+  </w:abstractNum>
+  <w:abstractNum w:abstractNumId="1" w15:restartNumberingAfterBreak="0">
     <w:nsid w:val="02006BF3"/>
     <w:multiLevelType w:val="hybridMultilevel"/>
     <w:tmpl w:val="3FFAAE28"/>
@@ -4422,7 +6219,7 @@
       </w:rPr>
     </w:lvl>
   </w:abstractNum>
-  <w:abstractNum w:abstractNumId="1" w15:restartNumberingAfterBreak="0">
+  <w:abstractNum w:abstractNumId="2" w15:restartNumberingAfterBreak="0">
     <w:nsid w:val="020D6B0D"/>
     <w:multiLevelType w:val="hybridMultilevel"/>
     <w:tmpl w:val="FE7A49BE"/>
@@ -4535,7 +6332,7 @@
       </w:rPr>
     </w:lvl>
   </w:abstractNum>
-  <w:abstractNum w:abstractNumId="2" w15:restartNumberingAfterBreak="0">
+  <w:abstractNum w:abstractNumId="3" w15:restartNumberingAfterBreak="0">
     <w:nsid w:val="0B752BE6"/>
     <w:multiLevelType w:val="hybridMultilevel"/>
     <w:tmpl w:val="997E1B08"/>
@@ -4648,7 +6445,7 @@
       </w:rPr>
     </w:lvl>
   </w:abstractNum>
-  <w:abstractNum w:abstractNumId="3" w15:restartNumberingAfterBreak="0">
+  <w:abstractNum w:abstractNumId="4" w15:restartNumberingAfterBreak="0">
     <w:nsid w:val="0F4C0D4B"/>
     <w:multiLevelType w:val="hybridMultilevel"/>
     <w:tmpl w:val="33C43BCE"/>
@@ -4761,7 +6558,7 @@
       </w:rPr>
     </w:lvl>
   </w:abstractNum>
-  <w:abstractNum w:abstractNumId="4" w15:restartNumberingAfterBreak="0">
+  <w:abstractNum w:abstractNumId="5" w15:restartNumberingAfterBreak="0">
     <w:nsid w:val="10665C4B"/>
     <w:multiLevelType w:val="hybridMultilevel"/>
     <w:tmpl w:val="E37466AC"/>
@@ -4878,7 +6675,120 @@
       </w:rPr>
     </w:lvl>
   </w:abstractNum>
-  <w:abstractNum w:abstractNumId="5" w15:restartNumberingAfterBreak="0">
+  <w:abstractNum w:abstractNumId="6" w15:restartNumberingAfterBreak="0">
+    <w:nsid w:val="17EA2513"/>
+    <w:multiLevelType w:val="hybridMultilevel"/>
+    <w:tmpl w:val="0F1022CA"/>
+    <w:lvl w:ilvl="0" w:tplc="040C000B">
+      <w:start w:val="1"/>
+      <w:numFmt w:val="bullet"/>
+      <w:lvlText w:val=""/>
+      <w:lvlJc w:val="left"/>
+      <w:pPr>
+        <w:ind w:left="720" w:hanging="360"/>
+      </w:pPr>
+      <w:rPr>
+        <w:rFonts w:ascii="Wingdings" w:hAnsi="Wingdings" w:hint="default"/>
+      </w:rPr>
+    </w:lvl>
+    <w:lvl w:ilvl="1" w:tplc="040C0003" w:tentative="1">
+      <w:start w:val="1"/>
+      <w:numFmt w:val="bullet"/>
+      <w:lvlText w:val="o"/>
+      <w:lvlJc w:val="left"/>
+      <w:pPr>
+        <w:ind w:left="1440" w:hanging="360"/>
+      </w:pPr>
+      <w:rPr>
+        <w:rFonts w:ascii="Courier New" w:hAnsi="Courier New" w:cs="Courier New" w:hint="default"/>
+      </w:rPr>
+    </w:lvl>
+    <w:lvl w:ilvl="2" w:tplc="040C0005" w:tentative="1">
+      <w:start w:val="1"/>
+      <w:numFmt w:val="bullet"/>
+      <w:lvlText w:val=""/>
+      <w:lvlJc w:val="left"/>
+      <w:pPr>
+        <w:ind w:left="2160" w:hanging="360"/>
+      </w:pPr>
+      <w:rPr>
+        <w:rFonts w:ascii="Wingdings" w:hAnsi="Wingdings" w:hint="default"/>
+      </w:rPr>
+    </w:lvl>
+    <w:lvl w:ilvl="3" w:tplc="040C0001" w:tentative="1">
+      <w:start w:val="1"/>
+      <w:numFmt w:val="bullet"/>
+      <w:lvlText w:val=""/>
+      <w:lvlJc w:val="left"/>
+      <w:pPr>
+        <w:ind w:left="2880" w:hanging="360"/>
+      </w:pPr>
+      <w:rPr>
+        <w:rFonts w:ascii="Symbol" w:hAnsi="Symbol" w:hint="default"/>
+      </w:rPr>
+    </w:lvl>
+    <w:lvl w:ilvl="4" w:tplc="040C0003" w:tentative="1">
+      <w:start w:val="1"/>
+      <w:numFmt w:val="bullet"/>
+      <w:lvlText w:val="o"/>
+      <w:lvlJc w:val="left"/>
+      <w:pPr>
+        <w:ind w:left="3600" w:hanging="360"/>
+      </w:pPr>
+      <w:rPr>
+        <w:rFonts w:ascii="Courier New" w:hAnsi="Courier New" w:cs="Courier New" w:hint="default"/>
+      </w:rPr>
+    </w:lvl>
+    <w:lvl w:ilvl="5" w:tplc="040C0005" w:tentative="1">
+      <w:start w:val="1"/>
+      <w:numFmt w:val="bullet"/>
+      <w:lvlText w:val=""/>
+      <w:lvlJc w:val="left"/>
+      <w:pPr>
+        <w:ind w:left="4320" w:hanging="360"/>
+      </w:pPr>
+      <w:rPr>
+        <w:rFonts w:ascii="Wingdings" w:hAnsi="Wingdings" w:hint="default"/>
+      </w:rPr>
+    </w:lvl>
+    <w:lvl w:ilvl="6" w:tplc="040C0001" w:tentative="1">
+      <w:start w:val="1"/>
+      <w:numFmt w:val="bullet"/>
+      <w:lvlText w:val=""/>
+      <w:lvlJc w:val="left"/>
+      <w:pPr>
+        <w:ind w:left="5040" w:hanging="360"/>
+      </w:pPr>
+      <w:rPr>
+        <w:rFonts w:ascii="Symbol" w:hAnsi="Symbol" w:hint="default"/>
+      </w:rPr>
+    </w:lvl>
+    <w:lvl w:ilvl="7" w:tplc="040C0003" w:tentative="1">
+      <w:start w:val="1"/>
+      <w:numFmt w:val="bullet"/>
+      <w:lvlText w:val="o"/>
+      <w:lvlJc w:val="left"/>
+      <w:pPr>
+        <w:ind w:left="5760" w:hanging="360"/>
+      </w:pPr>
+      <w:rPr>
+        <w:rFonts w:ascii="Courier New" w:hAnsi="Courier New" w:cs="Courier New" w:hint="default"/>
+      </w:rPr>
+    </w:lvl>
+    <w:lvl w:ilvl="8" w:tplc="040C0005" w:tentative="1">
+      <w:start w:val="1"/>
+      <w:numFmt w:val="bullet"/>
+      <w:lvlText w:val=""/>
+      <w:lvlJc w:val="left"/>
+      <w:pPr>
+        <w:ind w:left="6480" w:hanging="360"/>
+      </w:pPr>
+      <w:rPr>
+        <w:rFonts w:ascii="Wingdings" w:hAnsi="Wingdings" w:hint="default"/>
+      </w:rPr>
+    </w:lvl>
+  </w:abstractNum>
+  <w:abstractNum w:abstractNumId="7" w15:restartNumberingAfterBreak="0">
     <w:nsid w:val="1C837955"/>
     <w:multiLevelType w:val="hybridMultilevel"/>
     <w:tmpl w:val="FBAEE096"/>
@@ -4991,7 +6901,7 @@
       </w:rPr>
     </w:lvl>
   </w:abstractNum>
-  <w:abstractNum w:abstractNumId="6" w15:restartNumberingAfterBreak="0">
+  <w:abstractNum w:abstractNumId="8" w15:restartNumberingAfterBreak="0">
     <w:nsid w:val="203D7754"/>
     <w:multiLevelType w:val="hybridMultilevel"/>
     <w:tmpl w:val="3642F91E"/>
@@ -5104,7 +7014,7 @@
       </w:rPr>
     </w:lvl>
   </w:abstractNum>
-  <w:abstractNum w:abstractNumId="7" w15:restartNumberingAfterBreak="0">
+  <w:abstractNum w:abstractNumId="9" w15:restartNumberingAfterBreak="0">
     <w:nsid w:val="23DB41D1"/>
     <w:multiLevelType w:val="hybridMultilevel"/>
     <w:tmpl w:val="43AC9062"/>
@@ -5218,7 +7128,7 @@
       </w:rPr>
     </w:lvl>
   </w:abstractNum>
-  <w:abstractNum w:abstractNumId="8" w15:restartNumberingAfterBreak="0">
+  <w:abstractNum w:abstractNumId="10" w15:restartNumberingAfterBreak="0">
     <w:nsid w:val="2D2B7D69"/>
     <w:multiLevelType w:val="hybridMultilevel"/>
     <w:tmpl w:val="00DAE8EC"/>
@@ -5331,7 +7241,120 @@
       </w:rPr>
     </w:lvl>
   </w:abstractNum>
-  <w:abstractNum w:abstractNumId="9" w15:restartNumberingAfterBreak="0">
+  <w:abstractNum w:abstractNumId="11" w15:restartNumberingAfterBreak="0">
+    <w:nsid w:val="3B992B65"/>
+    <w:multiLevelType w:val="hybridMultilevel"/>
+    <w:tmpl w:val="12A4A5A0"/>
+    <w:lvl w:ilvl="0" w:tplc="040C000B">
+      <w:start w:val="1"/>
+      <w:numFmt w:val="bullet"/>
+      <w:lvlText w:val=""/>
+      <w:lvlJc w:val="left"/>
+      <w:pPr>
+        <w:ind w:left="720" w:hanging="360"/>
+      </w:pPr>
+      <w:rPr>
+        <w:rFonts w:ascii="Wingdings" w:hAnsi="Wingdings" w:hint="default"/>
+      </w:rPr>
+    </w:lvl>
+    <w:lvl w:ilvl="1" w:tplc="040C0003" w:tentative="1">
+      <w:start w:val="1"/>
+      <w:numFmt w:val="bullet"/>
+      <w:lvlText w:val="o"/>
+      <w:lvlJc w:val="left"/>
+      <w:pPr>
+        <w:ind w:left="1440" w:hanging="360"/>
+      </w:pPr>
+      <w:rPr>
+        <w:rFonts w:ascii="Courier New" w:hAnsi="Courier New" w:cs="Courier New" w:hint="default"/>
+      </w:rPr>
+    </w:lvl>
+    <w:lvl w:ilvl="2" w:tplc="040C0005" w:tentative="1">
+      <w:start w:val="1"/>
+      <w:numFmt w:val="bullet"/>
+      <w:lvlText w:val=""/>
+      <w:lvlJc w:val="left"/>
+      <w:pPr>
+        <w:ind w:left="2160" w:hanging="360"/>
+      </w:pPr>
+      <w:rPr>
+        <w:rFonts w:ascii="Wingdings" w:hAnsi="Wingdings" w:hint="default"/>
+      </w:rPr>
+    </w:lvl>
+    <w:lvl w:ilvl="3" w:tplc="040C0001" w:tentative="1">
+      <w:start w:val="1"/>
+      <w:numFmt w:val="bullet"/>
+      <w:lvlText w:val=""/>
+      <w:lvlJc w:val="left"/>
+      <w:pPr>
+        <w:ind w:left="2880" w:hanging="360"/>
+      </w:pPr>
+      <w:rPr>
+        <w:rFonts w:ascii="Symbol" w:hAnsi="Symbol" w:hint="default"/>
+      </w:rPr>
+    </w:lvl>
+    <w:lvl w:ilvl="4" w:tplc="040C0003" w:tentative="1">
+      <w:start w:val="1"/>
+      <w:numFmt w:val="bullet"/>
+      <w:lvlText w:val="o"/>
+      <w:lvlJc w:val="left"/>
+      <w:pPr>
+        <w:ind w:left="3600" w:hanging="360"/>
+      </w:pPr>
+      <w:rPr>
+        <w:rFonts w:ascii="Courier New" w:hAnsi="Courier New" w:cs="Courier New" w:hint="default"/>
+      </w:rPr>
+    </w:lvl>
+    <w:lvl w:ilvl="5" w:tplc="040C0005" w:tentative="1">
+      <w:start w:val="1"/>
+      <w:numFmt w:val="bullet"/>
+      <w:lvlText w:val=""/>
+      <w:lvlJc w:val="left"/>
+      <w:pPr>
+        <w:ind w:left="4320" w:hanging="360"/>
+      </w:pPr>
+      <w:rPr>
+        <w:rFonts w:ascii="Wingdings" w:hAnsi="Wingdings" w:hint="default"/>
+      </w:rPr>
+    </w:lvl>
+    <w:lvl w:ilvl="6" w:tplc="040C0001" w:tentative="1">
+      <w:start w:val="1"/>
+      <w:numFmt w:val="bullet"/>
+      <w:lvlText w:val=""/>
+      <w:lvlJc w:val="left"/>
+      <w:pPr>
+        <w:ind w:left="5040" w:hanging="360"/>
+      </w:pPr>
+      <w:rPr>
+        <w:rFonts w:ascii="Symbol" w:hAnsi="Symbol" w:hint="default"/>
+      </w:rPr>
+    </w:lvl>
+    <w:lvl w:ilvl="7" w:tplc="040C0003" w:tentative="1">
+      <w:start w:val="1"/>
+      <w:numFmt w:val="bullet"/>
+      <w:lvlText w:val="o"/>
+      <w:lvlJc w:val="left"/>
+      <w:pPr>
+        <w:ind w:left="5760" w:hanging="360"/>
+      </w:pPr>
+      <w:rPr>
+        <w:rFonts w:ascii="Courier New" w:hAnsi="Courier New" w:cs="Courier New" w:hint="default"/>
+      </w:rPr>
+    </w:lvl>
+    <w:lvl w:ilvl="8" w:tplc="040C0005" w:tentative="1">
+      <w:start w:val="1"/>
+      <w:numFmt w:val="bullet"/>
+      <w:lvlText w:val=""/>
+      <w:lvlJc w:val="left"/>
+      <w:pPr>
+        <w:ind w:left="6480" w:hanging="360"/>
+      </w:pPr>
+      <w:rPr>
+        <w:rFonts w:ascii="Wingdings" w:hAnsi="Wingdings" w:hint="default"/>
+      </w:rPr>
+    </w:lvl>
+  </w:abstractNum>
+  <w:abstractNum w:abstractNumId="12" w15:restartNumberingAfterBreak="0">
     <w:nsid w:val="40B06DD7"/>
     <w:multiLevelType w:val="hybridMultilevel"/>
     <w:tmpl w:val="521A01A2"/>
@@ -5444,7 +7467,7 @@
       </w:rPr>
     </w:lvl>
   </w:abstractNum>
-  <w:abstractNum w:abstractNumId="10" w15:restartNumberingAfterBreak="0">
+  <w:abstractNum w:abstractNumId="13" w15:restartNumberingAfterBreak="0">
     <w:nsid w:val="435D0F85"/>
     <w:multiLevelType w:val="hybridMultilevel"/>
     <w:tmpl w:val="C88890FA"/>
@@ -5558,7 +7581,120 @@
       </w:rPr>
     </w:lvl>
   </w:abstractNum>
-  <w:abstractNum w:abstractNumId="11" w15:restartNumberingAfterBreak="0">
+  <w:abstractNum w:abstractNumId="14" w15:restartNumberingAfterBreak="0">
+    <w:nsid w:val="4D561A31"/>
+    <w:multiLevelType w:val="hybridMultilevel"/>
+    <w:tmpl w:val="1FCE6BCA"/>
+    <w:lvl w:ilvl="0" w:tplc="040C000B">
+      <w:start w:val="1"/>
+      <w:numFmt w:val="bullet"/>
+      <w:lvlText w:val=""/>
+      <w:lvlJc w:val="left"/>
+      <w:pPr>
+        <w:ind w:left="720" w:hanging="360"/>
+      </w:pPr>
+      <w:rPr>
+        <w:rFonts w:ascii="Wingdings" w:hAnsi="Wingdings" w:hint="default"/>
+      </w:rPr>
+    </w:lvl>
+    <w:lvl w:ilvl="1" w:tplc="040C0003">
+      <w:start w:val="1"/>
+      <w:numFmt w:val="bullet"/>
+      <w:lvlText w:val="o"/>
+      <w:lvlJc w:val="left"/>
+      <w:pPr>
+        <w:ind w:left="1440" w:hanging="360"/>
+      </w:pPr>
+      <w:rPr>
+        <w:rFonts w:ascii="Courier New" w:hAnsi="Courier New" w:cs="Courier New" w:hint="default"/>
+      </w:rPr>
+    </w:lvl>
+    <w:lvl w:ilvl="2" w:tplc="040C0005" w:tentative="1">
+      <w:start w:val="1"/>
+      <w:numFmt w:val="bullet"/>
+      <w:lvlText w:val=""/>
+      <w:lvlJc w:val="left"/>
+      <w:pPr>
+        <w:ind w:left="2160" w:hanging="360"/>
+      </w:pPr>
+      <w:rPr>
+        <w:rFonts w:ascii="Wingdings" w:hAnsi="Wingdings" w:hint="default"/>
+      </w:rPr>
+    </w:lvl>
+    <w:lvl w:ilvl="3" w:tplc="040C0001" w:tentative="1">
+      <w:start w:val="1"/>
+      <w:numFmt w:val="bullet"/>
+      <w:lvlText w:val=""/>
+      <w:lvlJc w:val="left"/>
+      <w:pPr>
+        <w:ind w:left="2880" w:hanging="360"/>
+      </w:pPr>
+      <w:rPr>
+        <w:rFonts w:ascii="Symbol" w:hAnsi="Symbol" w:hint="default"/>
+      </w:rPr>
+    </w:lvl>
+    <w:lvl w:ilvl="4" w:tplc="040C0003" w:tentative="1">
+      <w:start w:val="1"/>
+      <w:numFmt w:val="bullet"/>
+      <w:lvlText w:val="o"/>
+      <w:lvlJc w:val="left"/>
+      <w:pPr>
+        <w:ind w:left="3600" w:hanging="360"/>
+      </w:pPr>
+      <w:rPr>
+        <w:rFonts w:ascii="Courier New" w:hAnsi="Courier New" w:cs="Courier New" w:hint="default"/>
+      </w:rPr>
+    </w:lvl>
+    <w:lvl w:ilvl="5" w:tplc="040C0005" w:tentative="1">
+      <w:start w:val="1"/>
+      <w:numFmt w:val="bullet"/>
+      <w:lvlText w:val=""/>
+      <w:lvlJc w:val="left"/>
+      <w:pPr>
+        <w:ind w:left="4320" w:hanging="360"/>
+      </w:pPr>
+      <w:rPr>
+        <w:rFonts w:ascii="Wingdings" w:hAnsi="Wingdings" w:hint="default"/>
+      </w:rPr>
+    </w:lvl>
+    <w:lvl w:ilvl="6" w:tplc="040C0001" w:tentative="1">
+      <w:start w:val="1"/>
+      <w:numFmt w:val="bullet"/>
+      <w:lvlText w:val=""/>
+      <w:lvlJc w:val="left"/>
+      <w:pPr>
+        <w:ind w:left="5040" w:hanging="360"/>
+      </w:pPr>
+      <w:rPr>
+        <w:rFonts w:ascii="Symbol" w:hAnsi="Symbol" w:hint="default"/>
+      </w:rPr>
+    </w:lvl>
+    <w:lvl w:ilvl="7" w:tplc="040C0003" w:tentative="1">
+      <w:start w:val="1"/>
+      <w:numFmt w:val="bullet"/>
+      <w:lvlText w:val="o"/>
+      <w:lvlJc w:val="left"/>
+      <w:pPr>
+        <w:ind w:left="5760" w:hanging="360"/>
+      </w:pPr>
+      <w:rPr>
+        <w:rFonts w:ascii="Courier New" w:hAnsi="Courier New" w:cs="Courier New" w:hint="default"/>
+      </w:rPr>
+    </w:lvl>
+    <w:lvl w:ilvl="8" w:tplc="040C0005" w:tentative="1">
+      <w:start w:val="1"/>
+      <w:numFmt w:val="bullet"/>
+      <w:lvlText w:val=""/>
+      <w:lvlJc w:val="left"/>
+      <w:pPr>
+        <w:ind w:left="6480" w:hanging="360"/>
+      </w:pPr>
+      <w:rPr>
+        <w:rFonts w:ascii="Wingdings" w:hAnsi="Wingdings" w:hint="default"/>
+      </w:rPr>
+    </w:lvl>
+  </w:abstractNum>
+  <w:abstractNum w:abstractNumId="15" w15:restartNumberingAfterBreak="0">
     <w:nsid w:val="4FDB4A88"/>
     <w:multiLevelType w:val="hybridMultilevel"/>
     <w:tmpl w:val="F79CA2C6"/>
@@ -5672,7 +7808,7 @@
       </w:rPr>
     </w:lvl>
   </w:abstractNum>
-  <w:abstractNum w:abstractNumId="12" w15:restartNumberingAfterBreak="0">
+  <w:abstractNum w:abstractNumId="16" w15:restartNumberingAfterBreak="0">
     <w:nsid w:val="515201A3"/>
     <w:multiLevelType w:val="hybridMultilevel"/>
     <w:tmpl w:val="6D409646"/>
@@ -5786,7 +7922,459 @@
       </w:rPr>
     </w:lvl>
   </w:abstractNum>
-  <w:abstractNum w:abstractNumId="13" w15:restartNumberingAfterBreak="0">
+  <w:abstractNum w:abstractNumId="17" w15:restartNumberingAfterBreak="0">
+    <w:nsid w:val="556F39B9"/>
+    <w:multiLevelType w:val="hybridMultilevel"/>
+    <w:tmpl w:val="6FACAFE0"/>
+    <w:lvl w:ilvl="0" w:tplc="040C000B">
+      <w:start w:val="1"/>
+      <w:numFmt w:val="bullet"/>
+      <w:lvlText w:val=""/>
+      <w:lvlJc w:val="left"/>
+      <w:pPr>
+        <w:ind w:left="720" w:hanging="360"/>
+      </w:pPr>
+      <w:rPr>
+        <w:rFonts w:ascii="Wingdings" w:hAnsi="Wingdings" w:hint="default"/>
+      </w:rPr>
+    </w:lvl>
+    <w:lvl w:ilvl="1" w:tplc="040C0003" w:tentative="1">
+      <w:start w:val="1"/>
+      <w:numFmt w:val="bullet"/>
+      <w:lvlText w:val="o"/>
+      <w:lvlJc w:val="left"/>
+      <w:pPr>
+        <w:ind w:left="1440" w:hanging="360"/>
+      </w:pPr>
+      <w:rPr>
+        <w:rFonts w:ascii="Courier New" w:hAnsi="Courier New" w:cs="Courier New" w:hint="default"/>
+      </w:rPr>
+    </w:lvl>
+    <w:lvl w:ilvl="2" w:tplc="040C0005" w:tentative="1">
+      <w:start w:val="1"/>
+      <w:numFmt w:val="bullet"/>
+      <w:lvlText w:val=""/>
+      <w:lvlJc w:val="left"/>
+      <w:pPr>
+        <w:ind w:left="2160" w:hanging="360"/>
+      </w:pPr>
+      <w:rPr>
+        <w:rFonts w:ascii="Wingdings" w:hAnsi="Wingdings" w:hint="default"/>
+      </w:rPr>
+    </w:lvl>
+    <w:lvl w:ilvl="3" w:tplc="040C0001" w:tentative="1">
+      <w:start w:val="1"/>
+      <w:numFmt w:val="bullet"/>
+      <w:lvlText w:val=""/>
+      <w:lvlJc w:val="left"/>
+      <w:pPr>
+        <w:ind w:left="2880" w:hanging="360"/>
+      </w:pPr>
+      <w:rPr>
+        <w:rFonts w:ascii="Symbol" w:hAnsi="Symbol" w:hint="default"/>
+      </w:rPr>
+    </w:lvl>
+    <w:lvl w:ilvl="4" w:tplc="040C0003" w:tentative="1">
+      <w:start w:val="1"/>
+      <w:numFmt w:val="bullet"/>
+      <w:lvlText w:val="o"/>
+      <w:lvlJc w:val="left"/>
+      <w:pPr>
+        <w:ind w:left="3600" w:hanging="360"/>
+      </w:pPr>
+      <w:rPr>
+        <w:rFonts w:ascii="Courier New" w:hAnsi="Courier New" w:cs="Courier New" w:hint="default"/>
+      </w:rPr>
+    </w:lvl>
+    <w:lvl w:ilvl="5" w:tplc="040C0005" w:tentative="1">
+      <w:start w:val="1"/>
+      <w:numFmt w:val="bullet"/>
+      <w:lvlText w:val=""/>
+      <w:lvlJc w:val="left"/>
+      <w:pPr>
+        <w:ind w:left="4320" w:hanging="360"/>
+      </w:pPr>
+      <w:rPr>
+        <w:rFonts w:ascii="Wingdings" w:hAnsi="Wingdings" w:hint="default"/>
+      </w:rPr>
+    </w:lvl>
+    <w:lvl w:ilvl="6" w:tplc="040C0001" w:tentative="1">
+      <w:start w:val="1"/>
+      <w:numFmt w:val="bullet"/>
+      <w:lvlText w:val=""/>
+      <w:lvlJc w:val="left"/>
+      <w:pPr>
+        <w:ind w:left="5040" w:hanging="360"/>
+      </w:pPr>
+      <w:rPr>
+        <w:rFonts w:ascii="Symbol" w:hAnsi="Symbol" w:hint="default"/>
+      </w:rPr>
+    </w:lvl>
+    <w:lvl w:ilvl="7" w:tplc="040C0003" w:tentative="1">
+      <w:start w:val="1"/>
+      <w:numFmt w:val="bullet"/>
+      <w:lvlText w:val="o"/>
+      <w:lvlJc w:val="left"/>
+      <w:pPr>
+        <w:ind w:left="5760" w:hanging="360"/>
+      </w:pPr>
+      <w:rPr>
+        <w:rFonts w:ascii="Courier New" w:hAnsi="Courier New" w:cs="Courier New" w:hint="default"/>
+      </w:rPr>
+    </w:lvl>
+    <w:lvl w:ilvl="8" w:tplc="040C0005" w:tentative="1">
+      <w:start w:val="1"/>
+      <w:numFmt w:val="bullet"/>
+      <w:lvlText w:val=""/>
+      <w:lvlJc w:val="left"/>
+      <w:pPr>
+        <w:ind w:left="6480" w:hanging="360"/>
+      </w:pPr>
+      <w:rPr>
+        <w:rFonts w:ascii="Wingdings" w:hAnsi="Wingdings" w:hint="default"/>
+      </w:rPr>
+    </w:lvl>
+  </w:abstractNum>
+  <w:abstractNum w:abstractNumId="18" w15:restartNumberingAfterBreak="0">
+    <w:nsid w:val="59C77AE8"/>
+    <w:multiLevelType w:val="hybridMultilevel"/>
+    <w:tmpl w:val="BA340E3A"/>
+    <w:lvl w:ilvl="0" w:tplc="040C000B">
+      <w:start w:val="1"/>
+      <w:numFmt w:val="bullet"/>
+      <w:lvlText w:val=""/>
+      <w:lvlJc w:val="left"/>
+      <w:pPr>
+        <w:ind w:left="720" w:hanging="360"/>
+      </w:pPr>
+      <w:rPr>
+        <w:rFonts w:ascii="Wingdings" w:hAnsi="Wingdings" w:hint="default"/>
+      </w:rPr>
+    </w:lvl>
+    <w:lvl w:ilvl="1" w:tplc="040C0003" w:tentative="1">
+      <w:start w:val="1"/>
+      <w:numFmt w:val="bullet"/>
+      <w:lvlText w:val="o"/>
+      <w:lvlJc w:val="left"/>
+      <w:pPr>
+        <w:ind w:left="1440" w:hanging="360"/>
+      </w:pPr>
+      <w:rPr>
+        <w:rFonts w:ascii="Courier New" w:hAnsi="Courier New" w:cs="Courier New" w:hint="default"/>
+      </w:rPr>
+    </w:lvl>
+    <w:lvl w:ilvl="2" w:tplc="040C0005" w:tentative="1">
+      <w:start w:val="1"/>
+      <w:numFmt w:val="bullet"/>
+      <w:lvlText w:val=""/>
+      <w:lvlJc w:val="left"/>
+      <w:pPr>
+        <w:ind w:left="2160" w:hanging="360"/>
+      </w:pPr>
+      <w:rPr>
+        <w:rFonts w:ascii="Wingdings" w:hAnsi="Wingdings" w:hint="default"/>
+      </w:rPr>
+    </w:lvl>
+    <w:lvl w:ilvl="3" w:tplc="040C0001" w:tentative="1">
+      <w:start w:val="1"/>
+      <w:numFmt w:val="bullet"/>
+      <w:lvlText w:val=""/>
+      <w:lvlJc w:val="left"/>
+      <w:pPr>
+        <w:ind w:left="2880" w:hanging="360"/>
+      </w:pPr>
+      <w:rPr>
+        <w:rFonts w:ascii="Symbol" w:hAnsi="Symbol" w:hint="default"/>
+      </w:rPr>
+    </w:lvl>
+    <w:lvl w:ilvl="4" w:tplc="040C0003" w:tentative="1">
+      <w:start w:val="1"/>
+      <w:numFmt w:val="bullet"/>
+      <w:lvlText w:val="o"/>
+      <w:lvlJc w:val="left"/>
+      <w:pPr>
+        <w:ind w:left="3600" w:hanging="360"/>
+      </w:pPr>
+      <w:rPr>
+        <w:rFonts w:ascii="Courier New" w:hAnsi="Courier New" w:cs="Courier New" w:hint="default"/>
+      </w:rPr>
+    </w:lvl>
+    <w:lvl w:ilvl="5" w:tplc="040C0005" w:tentative="1">
+      <w:start w:val="1"/>
+      <w:numFmt w:val="bullet"/>
+      <w:lvlText w:val=""/>
+      <w:lvlJc w:val="left"/>
+      <w:pPr>
+        <w:ind w:left="4320" w:hanging="360"/>
+      </w:pPr>
+      <w:rPr>
+        <w:rFonts w:ascii="Wingdings" w:hAnsi="Wingdings" w:hint="default"/>
+      </w:rPr>
+    </w:lvl>
+    <w:lvl w:ilvl="6" w:tplc="040C0001" w:tentative="1">
+      <w:start w:val="1"/>
+      <w:numFmt w:val="bullet"/>
+      <w:lvlText w:val=""/>
+      <w:lvlJc w:val="left"/>
+      <w:pPr>
+        <w:ind w:left="5040" w:hanging="360"/>
+      </w:pPr>
+      <w:rPr>
+        <w:rFonts w:ascii="Symbol" w:hAnsi="Symbol" w:hint="default"/>
+      </w:rPr>
+    </w:lvl>
+    <w:lvl w:ilvl="7" w:tplc="040C0003" w:tentative="1">
+      <w:start w:val="1"/>
+      <w:numFmt w:val="bullet"/>
+      <w:lvlText w:val="o"/>
+      <w:lvlJc w:val="left"/>
+      <w:pPr>
+        <w:ind w:left="5760" w:hanging="360"/>
+      </w:pPr>
+      <w:rPr>
+        <w:rFonts w:ascii="Courier New" w:hAnsi="Courier New" w:cs="Courier New" w:hint="default"/>
+      </w:rPr>
+    </w:lvl>
+    <w:lvl w:ilvl="8" w:tplc="040C0005" w:tentative="1">
+      <w:start w:val="1"/>
+      <w:numFmt w:val="bullet"/>
+      <w:lvlText w:val=""/>
+      <w:lvlJc w:val="left"/>
+      <w:pPr>
+        <w:ind w:left="6480" w:hanging="360"/>
+      </w:pPr>
+      <w:rPr>
+        <w:rFonts w:ascii="Wingdings" w:hAnsi="Wingdings" w:hint="default"/>
+      </w:rPr>
+    </w:lvl>
+  </w:abstractNum>
+  <w:abstractNum w:abstractNumId="19" w15:restartNumberingAfterBreak="0">
+    <w:nsid w:val="5B1E6236"/>
+    <w:multiLevelType w:val="hybridMultilevel"/>
+    <w:tmpl w:val="D8B40CE8"/>
+    <w:lvl w:ilvl="0" w:tplc="040C000B">
+      <w:start w:val="1"/>
+      <w:numFmt w:val="bullet"/>
+      <w:lvlText w:val=""/>
+      <w:lvlJc w:val="left"/>
+      <w:pPr>
+        <w:ind w:left="720" w:hanging="360"/>
+      </w:pPr>
+      <w:rPr>
+        <w:rFonts w:ascii="Wingdings" w:hAnsi="Wingdings" w:hint="default"/>
+      </w:rPr>
+    </w:lvl>
+    <w:lvl w:ilvl="1" w:tplc="040C0003" w:tentative="1">
+      <w:start w:val="1"/>
+      <w:numFmt w:val="bullet"/>
+      <w:lvlText w:val="o"/>
+      <w:lvlJc w:val="left"/>
+      <w:pPr>
+        <w:ind w:left="1440" w:hanging="360"/>
+      </w:pPr>
+      <w:rPr>
+        <w:rFonts w:ascii="Courier New" w:hAnsi="Courier New" w:cs="Courier New" w:hint="default"/>
+      </w:rPr>
+    </w:lvl>
+    <w:lvl w:ilvl="2" w:tplc="040C0005" w:tentative="1">
+      <w:start w:val="1"/>
+      <w:numFmt w:val="bullet"/>
+      <w:lvlText w:val=""/>
+      <w:lvlJc w:val="left"/>
+      <w:pPr>
+        <w:ind w:left="2160" w:hanging="360"/>
+      </w:pPr>
+      <w:rPr>
+        <w:rFonts w:ascii="Wingdings" w:hAnsi="Wingdings" w:hint="default"/>
+      </w:rPr>
+    </w:lvl>
+    <w:lvl w:ilvl="3" w:tplc="040C0001" w:tentative="1">
+      <w:start w:val="1"/>
+      <w:numFmt w:val="bullet"/>
+      <w:lvlText w:val=""/>
+      <w:lvlJc w:val="left"/>
+      <w:pPr>
+        <w:ind w:left="2880" w:hanging="360"/>
+      </w:pPr>
+      <w:rPr>
+        <w:rFonts w:ascii="Symbol" w:hAnsi="Symbol" w:hint="default"/>
+      </w:rPr>
+    </w:lvl>
+    <w:lvl w:ilvl="4" w:tplc="040C0003" w:tentative="1">
+      <w:start w:val="1"/>
+      <w:numFmt w:val="bullet"/>
+      <w:lvlText w:val="o"/>
+      <w:lvlJc w:val="left"/>
+      <w:pPr>
+        <w:ind w:left="3600" w:hanging="360"/>
+      </w:pPr>
+      <w:rPr>
+        <w:rFonts w:ascii="Courier New" w:hAnsi="Courier New" w:cs="Courier New" w:hint="default"/>
+      </w:rPr>
+    </w:lvl>
+    <w:lvl w:ilvl="5" w:tplc="040C0005" w:tentative="1">
+      <w:start w:val="1"/>
+      <w:numFmt w:val="bullet"/>
+      <w:lvlText w:val=""/>
+      <w:lvlJc w:val="left"/>
+      <w:pPr>
+        <w:ind w:left="4320" w:hanging="360"/>
+      </w:pPr>
+      <w:rPr>
+        <w:rFonts w:ascii="Wingdings" w:hAnsi="Wingdings" w:hint="default"/>
+      </w:rPr>
+    </w:lvl>
+    <w:lvl w:ilvl="6" w:tplc="040C0001" w:tentative="1">
+      <w:start w:val="1"/>
+      <w:numFmt w:val="bullet"/>
+      <w:lvlText w:val=""/>
+      <w:lvlJc w:val="left"/>
+      <w:pPr>
+        <w:ind w:left="5040" w:hanging="360"/>
+      </w:pPr>
+      <w:rPr>
+        <w:rFonts w:ascii="Symbol" w:hAnsi="Symbol" w:hint="default"/>
+      </w:rPr>
+    </w:lvl>
+    <w:lvl w:ilvl="7" w:tplc="040C0003" w:tentative="1">
+      <w:start w:val="1"/>
+      <w:numFmt w:val="bullet"/>
+      <w:lvlText w:val="o"/>
+      <w:lvlJc w:val="left"/>
+      <w:pPr>
+        <w:ind w:left="5760" w:hanging="360"/>
+      </w:pPr>
+      <w:rPr>
+        <w:rFonts w:ascii="Courier New" w:hAnsi="Courier New" w:cs="Courier New" w:hint="default"/>
+      </w:rPr>
+    </w:lvl>
+    <w:lvl w:ilvl="8" w:tplc="040C0005" w:tentative="1">
+      <w:start w:val="1"/>
+      <w:numFmt w:val="bullet"/>
+      <w:lvlText w:val=""/>
+      <w:lvlJc w:val="left"/>
+      <w:pPr>
+        <w:ind w:left="6480" w:hanging="360"/>
+      </w:pPr>
+      <w:rPr>
+        <w:rFonts w:ascii="Wingdings" w:hAnsi="Wingdings" w:hint="default"/>
+      </w:rPr>
+    </w:lvl>
+  </w:abstractNum>
+  <w:abstractNum w:abstractNumId="20" w15:restartNumberingAfterBreak="0">
+    <w:nsid w:val="61467CF4"/>
+    <w:multiLevelType w:val="hybridMultilevel"/>
+    <w:tmpl w:val="C61A8E36"/>
+    <w:lvl w:ilvl="0" w:tplc="040C000B">
+      <w:start w:val="1"/>
+      <w:numFmt w:val="bullet"/>
+      <w:lvlText w:val=""/>
+      <w:lvlJc w:val="left"/>
+      <w:pPr>
+        <w:ind w:left="720" w:hanging="360"/>
+      </w:pPr>
+      <w:rPr>
+        <w:rFonts w:ascii="Wingdings" w:hAnsi="Wingdings" w:hint="default"/>
+      </w:rPr>
+    </w:lvl>
+    <w:lvl w:ilvl="1" w:tplc="040C0003" w:tentative="1">
+      <w:start w:val="1"/>
+      <w:numFmt w:val="bullet"/>
+      <w:lvlText w:val="o"/>
+      <w:lvlJc w:val="left"/>
+      <w:pPr>
+        <w:ind w:left="1440" w:hanging="360"/>
+      </w:pPr>
+      <w:rPr>
+        <w:rFonts w:ascii="Courier New" w:hAnsi="Courier New" w:cs="Courier New" w:hint="default"/>
+      </w:rPr>
+    </w:lvl>
+    <w:lvl w:ilvl="2" w:tplc="040C0005" w:tentative="1">
+      <w:start w:val="1"/>
+      <w:numFmt w:val="bullet"/>
+      <w:lvlText w:val=""/>
+      <w:lvlJc w:val="left"/>
+      <w:pPr>
+        <w:ind w:left="2160" w:hanging="360"/>
+      </w:pPr>
+      <w:rPr>
+        <w:rFonts w:ascii="Wingdings" w:hAnsi="Wingdings" w:hint="default"/>
+      </w:rPr>
+    </w:lvl>
+    <w:lvl w:ilvl="3" w:tplc="040C0001" w:tentative="1">
+      <w:start w:val="1"/>
+      <w:numFmt w:val="bullet"/>
+      <w:lvlText w:val=""/>
+      <w:lvlJc w:val="left"/>
+      <w:pPr>
+        <w:ind w:left="2880" w:hanging="360"/>
+      </w:pPr>
+      <w:rPr>
+        <w:rFonts w:ascii="Symbol" w:hAnsi="Symbol" w:hint="default"/>
+      </w:rPr>
+    </w:lvl>
+    <w:lvl w:ilvl="4" w:tplc="040C0003" w:tentative="1">
+      <w:start w:val="1"/>
+      <w:numFmt w:val="bullet"/>
+      <w:lvlText w:val="o"/>
+      <w:lvlJc w:val="left"/>
+      <w:pPr>
+        <w:ind w:left="3600" w:hanging="360"/>
+      </w:pPr>
+      <w:rPr>
+        <w:rFonts w:ascii="Courier New" w:hAnsi="Courier New" w:cs="Courier New" w:hint="default"/>
+      </w:rPr>
+    </w:lvl>
+    <w:lvl w:ilvl="5" w:tplc="040C0005" w:tentative="1">
+      <w:start w:val="1"/>
+      <w:numFmt w:val="bullet"/>
+      <w:lvlText w:val=""/>
+      <w:lvlJc w:val="left"/>
+      <w:pPr>
+        <w:ind w:left="4320" w:hanging="360"/>
+      </w:pPr>
+      <w:rPr>
+        <w:rFonts w:ascii="Wingdings" w:hAnsi="Wingdings" w:hint="default"/>
+      </w:rPr>
+    </w:lvl>
+    <w:lvl w:ilvl="6" w:tplc="040C0001" w:tentative="1">
+      <w:start w:val="1"/>
+      <w:numFmt w:val="bullet"/>
+      <w:lvlText w:val=""/>
+      <w:lvlJc w:val="left"/>
+      <w:pPr>
+        <w:ind w:left="5040" w:hanging="360"/>
+      </w:pPr>
+      <w:rPr>
+        <w:rFonts w:ascii="Symbol" w:hAnsi="Symbol" w:hint="default"/>
+      </w:rPr>
+    </w:lvl>
+    <w:lvl w:ilvl="7" w:tplc="040C0003" w:tentative="1">
+      <w:start w:val="1"/>
+      <w:numFmt w:val="bullet"/>
+      <w:lvlText w:val="o"/>
+      <w:lvlJc w:val="left"/>
+      <w:pPr>
+        <w:ind w:left="5760" w:hanging="360"/>
+      </w:pPr>
+      <w:rPr>
+        <w:rFonts w:ascii="Courier New" w:hAnsi="Courier New" w:cs="Courier New" w:hint="default"/>
+      </w:rPr>
+    </w:lvl>
+    <w:lvl w:ilvl="8" w:tplc="040C0005" w:tentative="1">
+      <w:start w:val="1"/>
+      <w:numFmt w:val="bullet"/>
+      <w:lvlText w:val=""/>
+      <w:lvlJc w:val="left"/>
+      <w:pPr>
+        <w:ind w:left="6480" w:hanging="360"/>
+      </w:pPr>
+      <w:rPr>
+        <w:rFonts w:ascii="Wingdings" w:hAnsi="Wingdings" w:hint="default"/>
+      </w:rPr>
+    </w:lvl>
+  </w:abstractNum>
+  <w:abstractNum w:abstractNumId="21" w15:restartNumberingAfterBreak="0">
     <w:nsid w:val="619738EF"/>
     <w:multiLevelType w:val="multilevel"/>
     <w:tmpl w:val="37CE2D78"/>
@@ -5881,7 +8469,120 @@
       </w:pPr>
     </w:lvl>
   </w:abstractNum>
-  <w:abstractNum w:abstractNumId="14" w15:restartNumberingAfterBreak="0">
+  <w:abstractNum w:abstractNumId="22" w15:restartNumberingAfterBreak="0">
+    <w:nsid w:val="66C86151"/>
+    <w:multiLevelType w:val="hybridMultilevel"/>
+    <w:tmpl w:val="3752CBFC"/>
+    <w:lvl w:ilvl="0" w:tplc="040C000B">
+      <w:start w:val="1"/>
+      <w:numFmt w:val="bullet"/>
+      <w:lvlText w:val=""/>
+      <w:lvlJc w:val="left"/>
+      <w:pPr>
+        <w:ind w:left="720" w:hanging="360"/>
+      </w:pPr>
+      <w:rPr>
+        <w:rFonts w:ascii="Wingdings" w:hAnsi="Wingdings" w:hint="default"/>
+      </w:rPr>
+    </w:lvl>
+    <w:lvl w:ilvl="1" w:tplc="040C0003" w:tentative="1">
+      <w:start w:val="1"/>
+      <w:numFmt w:val="bullet"/>
+      <w:lvlText w:val="o"/>
+      <w:lvlJc w:val="left"/>
+      <w:pPr>
+        <w:ind w:left="1440" w:hanging="360"/>
+      </w:pPr>
+      <w:rPr>
+        <w:rFonts w:ascii="Courier New" w:hAnsi="Courier New" w:cs="Courier New" w:hint="default"/>
+      </w:rPr>
+    </w:lvl>
+    <w:lvl w:ilvl="2" w:tplc="040C0005" w:tentative="1">
+      <w:start w:val="1"/>
+      <w:numFmt w:val="bullet"/>
+      <w:lvlText w:val=""/>
+      <w:lvlJc w:val="left"/>
+      <w:pPr>
+        <w:ind w:left="2160" w:hanging="360"/>
+      </w:pPr>
+      <w:rPr>
+        <w:rFonts w:ascii="Wingdings" w:hAnsi="Wingdings" w:hint="default"/>
+      </w:rPr>
+    </w:lvl>
+    <w:lvl w:ilvl="3" w:tplc="040C0001" w:tentative="1">
+      <w:start w:val="1"/>
+      <w:numFmt w:val="bullet"/>
+      <w:lvlText w:val=""/>
+      <w:lvlJc w:val="left"/>
+      <w:pPr>
+        <w:ind w:left="2880" w:hanging="360"/>
+      </w:pPr>
+      <w:rPr>
+        <w:rFonts w:ascii="Symbol" w:hAnsi="Symbol" w:hint="default"/>
+      </w:rPr>
+    </w:lvl>
+    <w:lvl w:ilvl="4" w:tplc="040C0003" w:tentative="1">
+      <w:start w:val="1"/>
+      <w:numFmt w:val="bullet"/>
+      <w:lvlText w:val="o"/>
+      <w:lvlJc w:val="left"/>
+      <w:pPr>
+        <w:ind w:left="3600" w:hanging="360"/>
+      </w:pPr>
+      <w:rPr>
+        <w:rFonts w:ascii="Courier New" w:hAnsi="Courier New" w:cs="Courier New" w:hint="default"/>
+      </w:rPr>
+    </w:lvl>
+    <w:lvl w:ilvl="5" w:tplc="040C0005" w:tentative="1">
+      <w:start w:val="1"/>
+      <w:numFmt w:val="bullet"/>
+      <w:lvlText w:val=""/>
+      <w:lvlJc w:val="left"/>
+      <w:pPr>
+        <w:ind w:left="4320" w:hanging="360"/>
+      </w:pPr>
+      <w:rPr>
+        <w:rFonts w:ascii="Wingdings" w:hAnsi="Wingdings" w:hint="default"/>
+      </w:rPr>
+    </w:lvl>
+    <w:lvl w:ilvl="6" w:tplc="040C0001" w:tentative="1">
+      <w:start w:val="1"/>
+      <w:numFmt w:val="bullet"/>
+      <w:lvlText w:val=""/>
+      <w:lvlJc w:val="left"/>
+      <w:pPr>
+        <w:ind w:left="5040" w:hanging="360"/>
+      </w:pPr>
+      <w:rPr>
+        <w:rFonts w:ascii="Symbol" w:hAnsi="Symbol" w:hint="default"/>
+      </w:rPr>
+    </w:lvl>
+    <w:lvl w:ilvl="7" w:tplc="040C0003" w:tentative="1">
+      <w:start w:val="1"/>
+      <w:numFmt w:val="bullet"/>
+      <w:lvlText w:val="o"/>
+      <w:lvlJc w:val="left"/>
+      <w:pPr>
+        <w:ind w:left="5760" w:hanging="360"/>
+      </w:pPr>
+      <w:rPr>
+        <w:rFonts w:ascii="Courier New" w:hAnsi="Courier New" w:cs="Courier New" w:hint="default"/>
+      </w:rPr>
+    </w:lvl>
+    <w:lvl w:ilvl="8" w:tplc="040C0005" w:tentative="1">
+      <w:start w:val="1"/>
+      <w:numFmt w:val="bullet"/>
+      <w:lvlText w:val=""/>
+      <w:lvlJc w:val="left"/>
+      <w:pPr>
+        <w:ind w:left="6480" w:hanging="360"/>
+      </w:pPr>
+      <w:rPr>
+        <w:rFonts w:ascii="Wingdings" w:hAnsi="Wingdings" w:hint="default"/>
+      </w:rPr>
+    </w:lvl>
+  </w:abstractNum>
+  <w:abstractNum w:abstractNumId="23" w15:restartNumberingAfterBreak="0">
     <w:nsid w:val="68815C15"/>
     <w:multiLevelType w:val="hybridMultilevel"/>
     <w:tmpl w:val="CEDEB89A"/>
@@ -5995,7 +8696,7 @@
       </w:rPr>
     </w:lvl>
   </w:abstractNum>
-  <w:abstractNum w:abstractNumId="15" w15:restartNumberingAfterBreak="0">
+  <w:abstractNum w:abstractNumId="24" w15:restartNumberingAfterBreak="0">
     <w:nsid w:val="700A02B7"/>
     <w:multiLevelType w:val="hybridMultilevel"/>
     <w:tmpl w:val="C896B842"/>
@@ -6108,7 +8809,7 @@
       </w:rPr>
     </w:lvl>
   </w:abstractNum>
-  <w:abstractNum w:abstractNumId="16" w15:restartNumberingAfterBreak="0">
+  <w:abstractNum w:abstractNumId="25" w15:restartNumberingAfterBreak="0">
     <w:nsid w:val="760C6AAA"/>
     <w:multiLevelType w:val="hybridMultilevel"/>
     <w:tmpl w:val="9D7E7962"/>
@@ -6221,7 +8922,7 @@
       </w:rPr>
     </w:lvl>
   </w:abstractNum>
-  <w:abstractNum w:abstractNumId="17" w15:restartNumberingAfterBreak="0">
+  <w:abstractNum w:abstractNumId="26" w15:restartNumberingAfterBreak="0">
     <w:nsid w:val="7913282B"/>
     <w:multiLevelType w:val="hybridMultilevel"/>
     <w:tmpl w:val="5A3051B4"/>
@@ -6335,58 +9036,85 @@
     </w:lvl>
   </w:abstractNum>
   <w:num w:numId="1">
+    <w:abstractNumId w:val="16"/>
+  </w:num>
+  <w:num w:numId="2">
+    <w:abstractNumId w:val="13"/>
+  </w:num>
+  <w:num w:numId="3">
+    <w:abstractNumId w:val="15"/>
+  </w:num>
+  <w:num w:numId="4">
+    <w:abstractNumId w:val="21"/>
+  </w:num>
+  <w:num w:numId="5">
+    <w:abstractNumId w:val="5"/>
+  </w:num>
+  <w:num w:numId="6">
+    <w:abstractNumId w:val="9"/>
+  </w:num>
+  <w:num w:numId="7">
+    <w:abstractNumId w:val="23"/>
+  </w:num>
+  <w:num w:numId="8">
+    <w:abstractNumId w:val="1"/>
+  </w:num>
+  <w:num w:numId="9">
+    <w:abstractNumId w:val="2"/>
+  </w:num>
+  <w:num w:numId="10">
+    <w:abstractNumId w:val="25"/>
+  </w:num>
+  <w:num w:numId="11">
+    <w:abstractNumId w:val="7"/>
+  </w:num>
+  <w:num w:numId="12">
+    <w:abstractNumId w:val="8"/>
+  </w:num>
+  <w:num w:numId="13">
+    <w:abstractNumId w:val="10"/>
+  </w:num>
+  <w:num w:numId="14">
+    <w:abstractNumId w:val="24"/>
+  </w:num>
+  <w:num w:numId="15">
+    <w:abstractNumId w:val="4"/>
+  </w:num>
+  <w:num w:numId="16">
+    <w:abstractNumId w:val="3"/>
+  </w:num>
+  <w:num w:numId="17">
     <w:abstractNumId w:val="12"/>
   </w:num>
-  <w:num w:numId="2">
-    <w:abstractNumId w:val="10"/>
+  <w:num w:numId="18">
+    <w:abstractNumId w:val="26"/>
   </w:num>
-  <w:num w:numId="3">
+  <w:num w:numId="19">
+    <w:abstractNumId w:val="14"/>
+  </w:num>
+  <w:num w:numId="20">
+    <w:abstractNumId w:val="0"/>
+  </w:num>
+  <w:num w:numId="21">
+    <w:abstractNumId w:val="19"/>
+  </w:num>
+  <w:num w:numId="22">
+    <w:abstractNumId w:val="17"/>
+  </w:num>
+  <w:num w:numId="23">
+    <w:abstractNumId w:val="6"/>
+  </w:num>
+  <w:num w:numId="24">
+    <w:abstractNumId w:val="18"/>
+  </w:num>
+  <w:num w:numId="25">
+    <w:abstractNumId w:val="20"/>
+  </w:num>
+  <w:num w:numId="26">
     <w:abstractNumId w:val="11"/>
   </w:num>
-  <w:num w:numId="4">
-    <w:abstractNumId w:val="13"/>
-  </w:num>
-  <w:num w:numId="5">
-    <w:abstractNumId w:val="4"/>
-  </w:num>
-  <w:num w:numId="6">
-    <w:abstractNumId w:val="7"/>
-  </w:num>
-  <w:num w:numId="7">
-    <w:abstractNumId w:val="14"/>
-  </w:num>
-  <w:num w:numId="8">
-    <w:abstractNumId w:val="0"/>
-  </w:num>
-  <w:num w:numId="9">
-    <w:abstractNumId w:val="1"/>
-  </w:num>
-  <w:num w:numId="10">
-    <w:abstractNumId w:val="16"/>
-  </w:num>
-  <w:num w:numId="11">
-    <w:abstractNumId w:val="5"/>
-  </w:num>
-  <w:num w:numId="12">
-    <w:abstractNumId w:val="6"/>
-  </w:num>
-  <w:num w:numId="13">
-    <w:abstractNumId w:val="8"/>
-  </w:num>
-  <w:num w:numId="14">
-    <w:abstractNumId w:val="15"/>
-  </w:num>
-  <w:num w:numId="15">
-    <w:abstractNumId w:val="3"/>
-  </w:num>
-  <w:num w:numId="16">
-    <w:abstractNumId w:val="2"/>
-  </w:num>
-  <w:num w:numId="17">
-    <w:abstractNumId w:val="9"/>
-  </w:num>
-  <w:num w:numId="18">
-    <w:abstractNumId w:val="17"/>
+  <w:num w:numId="27">
+    <w:abstractNumId w:val="22"/>
   </w:num>
 </w:numbering>
 </file>
@@ -7661,6 +10389,29 @@
       <w:ind w:left="440"/>
     </w:pPr>
   </w:style>
+  <w:style w:type="table" w:styleId="Grilledutableau">
+    <w:name w:val="Table Grid"/>
+    <w:basedOn w:val="TableauNormal"/>
+    <w:uiPriority w:val="59"/>
+    <w:rsid w:val="00A61626"/>
+    <w:pPr>
+      <w:spacing w:after="0" w:line="240" w:lineRule="auto"/>
+    </w:pPr>
+    <w:rPr>
+      <w:rFonts w:eastAsiaTheme="minorEastAsia"/>
+      <w:lang w:val="en-US"/>
+    </w:rPr>
+    <w:tblPr>
+      <w:tblBorders>
+        <w:top w:val="single" w:sz="4" w:space="0" w:color="auto"/>
+        <w:left w:val="single" w:sz="4" w:space="0" w:color="auto"/>
+        <w:bottom w:val="single" w:sz="4" w:space="0" w:color="auto"/>
+        <w:right w:val="single" w:sz="4" w:space="0" w:color="auto"/>
+        <w:insideH w:val="single" w:sz="4" w:space="0" w:color="auto"/>
+        <w:insideV w:val="single" w:sz="4" w:space="0" w:color="auto"/>
+      </w:tblBorders>
+    </w:tblPr>
+  </w:style>
 </w:styles>
 </file>
 
@@ -7789,10 +10540,10 @@
 
 <file path=word/glossary/fontTable.xml><?xml version="1.0" encoding="utf-8"?>
 <w:fonts xmlns:mc="http://schemas.openxmlformats.org/markup-compatibility/2006" xmlns:r="http://schemas.openxmlformats.org/officeDocument/2006/relationships" xmlns:w="http://schemas.openxmlformats.org/wordprocessingml/2006/main" xmlns:w14="http://schemas.microsoft.com/office/word/2010/wordml" xmlns:w15="http://schemas.microsoft.com/office/word/2012/wordml" xmlns:w16cex="http://schemas.microsoft.com/office/word/2018/wordml/cex" xmlns:w16cid="http://schemas.microsoft.com/office/word/2016/wordml/cid" xmlns:w16="http://schemas.microsoft.com/office/word/2018/wordml" xmlns:w16sdtdh="http://schemas.microsoft.com/office/word/2020/wordml/sdtdatahash" xmlns:w16se="http://schemas.microsoft.com/office/word/2015/wordml/symex" mc:Ignorable="w14 w15 w16se w16cid w16 w16cex w16sdtdh">
-  <w:font w:name="Symbol">
-    <w:panose1 w:val="05050102010706020507"/>
+  <w:font w:name="Wingdings">
+    <w:panose1 w:val="05000000000000000000"/>
     <w:charset w:val="02"/>
-    <w:family w:val="roman"/>
+    <w:family w:val="auto"/>
     <w:pitch w:val="variable"/>
     <w:sig w:usb0="00000000" w:usb1="10000000" w:usb2="00000000" w:usb3="00000000" w:csb0="80000000" w:csb1="00000000"/>
   </w:font>
@@ -7810,10 +10561,10 @@
     <w:pitch w:val="fixed"/>
     <w:sig w:usb0="E0002EFF" w:usb1="C0007843" w:usb2="00000009" w:usb3="00000000" w:csb0="000001FF" w:csb1="00000000"/>
   </w:font>
-  <w:font w:name="Wingdings">
-    <w:panose1 w:val="05000000000000000000"/>
+  <w:font w:name="Symbol">
+    <w:panose1 w:val="05050102010706020507"/>
     <w:charset w:val="02"/>
-    <w:family w:val="auto"/>
+    <w:family w:val="roman"/>
     <w:pitch w:val="variable"/>
     <w:sig w:usb0="00000000" w:usb1="10000000" w:usb2="00000000" w:usb3="00000000" w:csb0="80000000" w:csb1="00000000"/>
   </w:font>
@@ -7886,6 +10637,7 @@
     <w:rsid w:val="0040063D"/>
     <w:rsid w:val="005E7BDA"/>
     <w:rsid w:val="0067166D"/>
+    <w:rsid w:val="006C2F40"/>
     <w:rsid w:val="008B1BFF"/>
     <w:rsid w:val="0094073A"/>
     <w:rsid w:val="00B10ED4"/>

</xml_diff>

<commit_message>
Dossier d'analyse jusqu'au 3c)
</commit_message>
<xml_diff>
--- a/Documents/DossierAnalyse.docx
+++ b/Documents/DossierAnalyse.docx
@@ -3723,7 +3723,63 @@
         <w:pStyle w:val="Titre3"/>
       </w:pPr>
       <w:r>
+        <w:lastRenderedPageBreak/>
         <w:t>Diagramme de cas d’utilisations</w:t>
+      </w:r>
+    </w:p>
+    <w:p>
+      <w:r>
+        <w:rPr>
+          <w:noProof/>
+        </w:rPr>
+        <w:drawing>
+          <wp:inline distT="0" distB="0" distL="0" distR="0" wp14:anchorId="4CF635F4" wp14:editId="4B2836C9">
+            <wp:extent cx="5760720" cy="7451090"/>
+            <wp:effectExtent l="0" t="0" r="0" b="0"/>
+            <wp:docPr id="1" name="Image 1"/>
+            <wp:cNvGraphicFramePr>
+              <a:graphicFrameLocks xmlns:a="http://schemas.openxmlformats.org/drawingml/2006/main" noChangeAspect="1"/>
+            </wp:cNvGraphicFramePr>
+            <a:graphic xmlns:a="http://schemas.openxmlformats.org/drawingml/2006/main">
+              <a:graphicData uri="http://schemas.openxmlformats.org/drawingml/2006/picture">
+                <pic:pic xmlns:pic="http://schemas.openxmlformats.org/drawingml/2006/picture">
+                  <pic:nvPicPr>
+                    <pic:cNvPr id="0" name="Picture 1"/>
+                    <pic:cNvPicPr>
+                      <a:picLocks noChangeAspect="1" noChangeArrowheads="1"/>
+                    </pic:cNvPicPr>
+                  </pic:nvPicPr>
+                  <pic:blipFill>
+                    <a:blip r:embed="rId20">
+                      <a:extLst>
+                        <a:ext uri="{28A0092B-C50C-407E-A947-70E740481C1C}">
+                          <a14:useLocalDpi xmlns:a14="http://schemas.microsoft.com/office/drawing/2010/main" val="0"/>
+                        </a:ext>
+                      </a:extLst>
+                    </a:blip>
+                    <a:srcRect/>
+                    <a:stretch>
+                      <a:fillRect/>
+                    </a:stretch>
+                  </pic:blipFill>
+                  <pic:spPr bwMode="auto">
+                    <a:xfrm>
+                      <a:off x="0" y="0"/>
+                      <a:ext cx="5760720" cy="7451090"/>
+                    </a:xfrm>
+                    <a:prstGeom prst="rect">
+                      <a:avLst/>
+                    </a:prstGeom>
+                    <a:noFill/>
+                    <a:ln>
+                      <a:noFill/>
+                    </a:ln>
+                  </pic:spPr>
+                </pic:pic>
+              </a:graphicData>
+            </a:graphic>
+          </wp:inline>
+        </w:drawing>
       </w:r>
     </w:p>
     <w:p>
@@ -5212,11 +5268,20 @@
       </w:r>
     </w:p>
     <w:p/>
+    <w:p>
+      <w:pPr>
+        <w:pStyle w:val="Titre2"/>
+      </w:pPr>
+      <w:r>
+        <w:t>Définition des interactions</w:t>
+      </w:r>
+    </w:p>
     <w:p/>
+    <w:p/>
     <w:p>
       <w:pPr>
         <w:sectPr>
-          <w:footerReference w:type="default" r:id="rId20"/>
+          <w:footerReference w:type="default" r:id="rId21"/>
           <w:pgSz w:w="11906" w:h="16838"/>
           <w:pgMar w:top="1417" w:right="1417" w:bottom="1417" w:left="1417" w:header="708" w:footer="708" w:gutter="0"/>
           <w:pgNumType w:start="1"/>
@@ -5598,7 +5663,7 @@
       </w:r>
     </w:p>
     <w:sectPr>
-      <w:footerReference w:type="default" r:id="rId21"/>
+      <w:footerReference w:type="default" r:id="rId22"/>
       <w:type w:val="evenPage"/>
       <w:pgSz w:w="11906" w:h="16838"/>
       <w:pgMar w:top="1417" w:right="1417" w:bottom="1417" w:left="1417" w:header="708" w:footer="708" w:gutter="0"/>
@@ -5783,7 +5848,7 @@
         <w:bCs/>
         <w:noProof/>
       </w:rPr>
-      <w:t>8</w:t>
+      <w:t>9</w:t>
     </w:r>
     <w:r>
       <w:rPr>

</xml_diff>

<commit_message>
Ajout RGPD dans dossier analyse
</commit_message>
<xml_diff>
--- a/Documents/DossierAnalyse.docx
+++ b/Documents/DossierAnalyse.docx
@@ -3986,11 +3986,19 @@
       </w:pPr>
       <w:bookmarkStart w:id="7" w:name="_Toc210395845"/>
       <w:r>
-        <w:t>Contrainte matériel</w:t>
+        <w:t>Contrainte</w:t>
       </w:r>
       <w:bookmarkEnd w:id="7"/>
     </w:p>
     <w:p>
+      <w:pPr>
+        <w:pStyle w:val="Titre3"/>
+      </w:pPr>
+      <w:r>
+        <w:t>Contraintes matérielles</w:t>
+      </w:r>
+    </w:p>
+    <w:p>
       <w:r>
         <w:t xml:space="preserve">Nous avons comme contrainte d’utiliser </w:t>
       </w:r>
@@ -4002,6 +4010,1375 @@
       <w:r>
         <w:t xml:space="preserve"> pour notre projet. Nous allons avoir besoins d’une connexion à internet, d’une base de données et également d’un serveur pour héberger notre site. </w:t>
       </w:r>
+    </w:p>
+    <w:p/>
+    <w:p/>
+    <w:p/>
+    <w:p/>
+    <w:p/>
+    <w:p/>
+    <w:p/>
+    <w:p/>
+    <w:p/>
+    <w:p/>
+    <w:p/>
+    <w:p>
+      <w:pPr>
+        <w:pStyle w:val="Titre3"/>
+      </w:pPr>
+      <w:r>
+        <w:lastRenderedPageBreak/>
+        <w:t>RGPD</w:t>
+      </w:r>
+    </w:p>
+    <w:p>
+      <w:pPr>
+        <w:jc w:val="left"/>
+        <w:rPr>
+          <w:rFonts w:ascii="Arial" w:hAnsi="Arial" w:cs="Arial"/>
+        </w:rPr>
+      </w:pPr>
+    </w:p>
+    <w:tbl>
+      <w:tblPr>
+        <w:tblStyle w:val="Grilledutableau"/>
+        <w:tblW w:w="0" w:type="auto"/>
+        <w:tblLook w:val="04A0" w:firstRow="1" w:lastRow="0" w:firstColumn="1" w:lastColumn="0" w:noHBand="0" w:noVBand="1"/>
+      </w:tblPr>
+      <w:tblGrid>
+        <w:gridCol w:w="1377"/>
+        <w:gridCol w:w="1651"/>
+        <w:gridCol w:w="1497"/>
+        <w:gridCol w:w="1443"/>
+        <w:gridCol w:w="1487"/>
+        <w:gridCol w:w="1607"/>
+      </w:tblGrid>
+      <w:tr>
+        <w:tc>
+          <w:tcPr>
+            <w:tcW w:w="1377" w:type="dxa"/>
+            <w:shd w:val="clear" w:color="auto" w:fill="BFBFBF" w:themeFill="background1" w:themeFillShade="BF"/>
+          </w:tcPr>
+          <w:p>
+            <w:pPr>
+              <w:jc w:val="left"/>
+              <w:rPr>
+                <w:rFonts w:ascii="Arial" w:hAnsi="Arial" w:cs="Arial"/>
+                <w:lang w:val="fr-FR"/>
+              </w:rPr>
+            </w:pPr>
+            <w:r>
+              <w:rPr>
+                <w:rFonts w:ascii="Arial" w:hAnsi="Arial" w:cs="Arial"/>
+                <w:b/>
+                <w:lang w:val="fr-FR"/>
+              </w:rPr>
+              <w:t>Catégorie de données</w:t>
+            </w:r>
+          </w:p>
+        </w:tc>
+        <w:tc>
+          <w:tcPr>
+            <w:tcW w:w="1879" w:type="dxa"/>
+            <w:shd w:val="clear" w:color="auto" w:fill="BFBFBF" w:themeFill="background1" w:themeFillShade="BF"/>
+          </w:tcPr>
+          <w:p>
+            <w:pPr>
+              <w:jc w:val="left"/>
+              <w:rPr>
+                <w:rFonts w:ascii="Arial" w:hAnsi="Arial" w:cs="Arial"/>
+                <w:lang w:val="fr-FR"/>
+              </w:rPr>
+            </w:pPr>
+            <w:r>
+              <w:rPr>
+                <w:rFonts w:ascii="Arial" w:hAnsi="Arial" w:cs="Arial"/>
+                <w:b/>
+                <w:lang w:val="fr-FR"/>
+              </w:rPr>
+              <w:t>Finalité</w:t>
+            </w:r>
+          </w:p>
+        </w:tc>
+        <w:tc>
+          <w:tcPr>
+            <w:tcW w:w="1269" w:type="dxa"/>
+            <w:shd w:val="clear" w:color="auto" w:fill="BFBFBF" w:themeFill="background1" w:themeFillShade="BF"/>
+          </w:tcPr>
+          <w:p>
+            <w:pPr>
+              <w:jc w:val="left"/>
+              <w:rPr>
+                <w:rFonts w:ascii="Arial" w:hAnsi="Arial" w:cs="Arial"/>
+                <w:lang w:val="fr-FR"/>
+              </w:rPr>
+            </w:pPr>
+            <w:r>
+              <w:rPr>
+                <w:rFonts w:ascii="Arial" w:hAnsi="Arial" w:cs="Arial"/>
+                <w:b/>
+                <w:lang w:val="fr-FR"/>
+              </w:rPr>
+              <w:t>Base légale</w:t>
+            </w:r>
+          </w:p>
+        </w:tc>
+        <w:tc>
+          <w:tcPr>
+            <w:tcW w:w="1443" w:type="dxa"/>
+            <w:shd w:val="clear" w:color="auto" w:fill="BFBFBF" w:themeFill="background1" w:themeFillShade="BF"/>
+          </w:tcPr>
+          <w:p>
+            <w:pPr>
+              <w:jc w:val="left"/>
+              <w:rPr>
+                <w:rFonts w:ascii="Arial" w:hAnsi="Arial" w:cs="Arial"/>
+                <w:lang w:val="fr-FR"/>
+              </w:rPr>
+            </w:pPr>
+            <w:r>
+              <w:rPr>
+                <w:rFonts w:ascii="Arial" w:hAnsi="Arial" w:cs="Arial"/>
+                <w:b/>
+                <w:lang w:val="fr-FR"/>
+              </w:rPr>
+              <w:t>Durée de conservation</w:t>
+            </w:r>
+          </w:p>
+        </w:tc>
+        <w:tc>
+          <w:tcPr>
+            <w:tcW w:w="1487" w:type="dxa"/>
+            <w:shd w:val="clear" w:color="auto" w:fill="BFBFBF" w:themeFill="background1" w:themeFillShade="BF"/>
+          </w:tcPr>
+          <w:p>
+            <w:pPr>
+              <w:jc w:val="left"/>
+              <w:rPr>
+                <w:rFonts w:ascii="Arial" w:hAnsi="Arial" w:cs="Arial"/>
+                <w:lang w:val="fr-FR"/>
+              </w:rPr>
+            </w:pPr>
+            <w:r>
+              <w:rPr>
+                <w:rFonts w:ascii="Arial" w:hAnsi="Arial" w:cs="Arial"/>
+                <w:b/>
+                <w:lang w:val="fr-FR"/>
+              </w:rPr>
+              <w:t>Accès / destinataires</w:t>
+            </w:r>
+          </w:p>
+        </w:tc>
+        <w:tc>
+          <w:tcPr>
+            <w:tcW w:w="1607" w:type="dxa"/>
+            <w:shd w:val="clear" w:color="auto" w:fill="BFBFBF" w:themeFill="background1" w:themeFillShade="BF"/>
+          </w:tcPr>
+          <w:p>
+            <w:pPr>
+              <w:jc w:val="left"/>
+              <w:rPr>
+                <w:rFonts w:ascii="Arial" w:hAnsi="Arial" w:cs="Arial"/>
+                <w:lang w:val="fr-FR"/>
+              </w:rPr>
+            </w:pPr>
+            <w:r>
+              <w:rPr>
+                <w:rFonts w:ascii="Arial" w:hAnsi="Arial" w:cs="Arial"/>
+                <w:b/>
+                <w:lang w:val="fr-FR"/>
+              </w:rPr>
+              <w:t>Mesures de sécurité</w:t>
+            </w:r>
+          </w:p>
+        </w:tc>
+      </w:tr>
+      <w:tr>
+        <w:tc>
+          <w:tcPr>
+            <w:tcW w:w="1377" w:type="dxa"/>
+          </w:tcPr>
+          <w:p>
+            <w:pPr>
+              <w:jc w:val="left"/>
+              <w:rPr>
+                <w:rFonts w:ascii="Arial" w:hAnsi="Arial" w:cs="Arial"/>
+                <w:lang w:val="fr-FR"/>
+              </w:rPr>
+            </w:pPr>
+            <w:r>
+              <w:rPr>
+                <w:rFonts w:ascii="Arial" w:hAnsi="Arial" w:cs="Arial"/>
+                <w:lang w:val="fr-FR"/>
+              </w:rPr>
+              <w:t>Nom, prénom</w:t>
+            </w:r>
+          </w:p>
+        </w:tc>
+        <w:tc>
+          <w:tcPr>
+            <w:tcW w:w="1879" w:type="dxa"/>
+          </w:tcPr>
+          <w:p>
+            <w:pPr>
+              <w:jc w:val="left"/>
+              <w:rPr>
+                <w:rFonts w:ascii="Arial" w:hAnsi="Arial" w:cs="Arial"/>
+                <w:lang w:val="fr-FR"/>
+              </w:rPr>
+            </w:pPr>
+            <w:r>
+              <w:rPr>
+                <w:rFonts w:ascii="Arial" w:hAnsi="Arial" w:cs="Arial"/>
+                <w:lang w:val="fr-FR"/>
+              </w:rPr>
+              <w:t>Création et gestion du compte utilisateur</w:t>
+            </w:r>
+          </w:p>
+        </w:tc>
+        <w:tc>
+          <w:tcPr>
+            <w:tcW w:w="1269" w:type="dxa"/>
+          </w:tcPr>
+          <w:p>
+            <w:pPr>
+              <w:jc w:val="left"/>
+              <w:rPr>
+                <w:rFonts w:ascii="Arial" w:hAnsi="Arial" w:cs="Arial"/>
+                <w:lang w:val="fr-FR"/>
+              </w:rPr>
+            </w:pPr>
+            <w:r>
+              <w:rPr>
+                <w:rFonts w:ascii="Arial" w:hAnsi="Arial" w:cs="Arial"/>
+                <w:lang w:val="fr-FR"/>
+              </w:rPr>
+              <w:t>Exécution du contrat</w:t>
+            </w:r>
+          </w:p>
+        </w:tc>
+        <w:tc>
+          <w:tcPr>
+            <w:tcW w:w="1443" w:type="dxa"/>
+          </w:tcPr>
+          <w:p>
+            <w:pPr>
+              <w:jc w:val="left"/>
+              <w:rPr>
+                <w:rFonts w:ascii="Arial" w:hAnsi="Arial" w:cs="Arial"/>
+                <w:lang w:val="fr-FR"/>
+              </w:rPr>
+            </w:pPr>
+            <w:r>
+              <w:rPr>
+                <w:rFonts w:ascii="Arial" w:hAnsi="Arial" w:cs="Arial"/>
+                <w:lang w:val="fr-FR"/>
+              </w:rPr>
+              <w:t>Jusqu’à suppression du compte</w:t>
+            </w:r>
+          </w:p>
+        </w:tc>
+        <w:tc>
+          <w:tcPr>
+            <w:tcW w:w="1487" w:type="dxa"/>
+          </w:tcPr>
+          <w:p>
+            <w:pPr>
+              <w:jc w:val="left"/>
+              <w:rPr>
+                <w:rFonts w:ascii="Arial" w:hAnsi="Arial" w:cs="Arial"/>
+                <w:lang w:val="fr-FR"/>
+              </w:rPr>
+            </w:pPr>
+            <w:r>
+              <w:rPr>
+                <w:rFonts w:ascii="Arial" w:hAnsi="Arial" w:cs="Arial"/>
+                <w:lang w:val="fr-FR"/>
+              </w:rPr>
+              <w:t>Administrateur du site</w:t>
+            </w:r>
+          </w:p>
+        </w:tc>
+        <w:tc>
+          <w:tcPr>
+            <w:tcW w:w="1607" w:type="dxa"/>
+          </w:tcPr>
+          <w:p>
+            <w:pPr>
+              <w:jc w:val="left"/>
+              <w:rPr>
+                <w:rFonts w:ascii="Arial" w:hAnsi="Arial" w:cs="Arial"/>
+                <w:lang w:val="fr-FR"/>
+              </w:rPr>
+            </w:pPr>
+            <w:r>
+              <w:rPr>
+                <w:rFonts w:ascii="Arial" w:hAnsi="Arial" w:cs="Arial"/>
+                <w:lang w:val="fr-FR"/>
+              </w:rPr>
+              <w:t>Accès restreint, base sécurisée</w:t>
+            </w:r>
+          </w:p>
+        </w:tc>
+      </w:tr>
+      <w:tr>
+        <w:tc>
+          <w:tcPr>
+            <w:tcW w:w="1377" w:type="dxa"/>
+          </w:tcPr>
+          <w:p>
+            <w:pPr>
+              <w:jc w:val="left"/>
+              <w:rPr>
+                <w:rFonts w:ascii="Arial" w:hAnsi="Arial" w:cs="Arial"/>
+                <w:lang w:val="fr-FR"/>
+              </w:rPr>
+            </w:pPr>
+            <w:r>
+              <w:rPr>
+                <w:rFonts w:ascii="Arial" w:hAnsi="Arial" w:cs="Arial"/>
+                <w:lang w:val="fr-FR"/>
+              </w:rPr>
+              <w:t>Date de naissance</w:t>
+            </w:r>
+          </w:p>
+        </w:tc>
+        <w:tc>
+          <w:tcPr>
+            <w:tcW w:w="1879" w:type="dxa"/>
+          </w:tcPr>
+          <w:p>
+            <w:pPr>
+              <w:jc w:val="left"/>
+              <w:rPr>
+                <w:rFonts w:ascii="Arial" w:hAnsi="Arial" w:cs="Arial"/>
+                <w:lang w:val="fr-FR"/>
+              </w:rPr>
+            </w:pPr>
+            <w:r>
+              <w:rPr>
+                <w:rFonts w:ascii="Arial" w:hAnsi="Arial" w:cs="Arial"/>
+                <w:lang w:val="fr-FR"/>
+              </w:rPr>
+              <w:t>Vérification de l’âge (majorité si nécessaire)</w:t>
+            </w:r>
+          </w:p>
+        </w:tc>
+        <w:tc>
+          <w:tcPr>
+            <w:tcW w:w="1269" w:type="dxa"/>
+          </w:tcPr>
+          <w:p>
+            <w:pPr>
+              <w:jc w:val="left"/>
+              <w:rPr>
+                <w:rFonts w:ascii="Arial" w:hAnsi="Arial" w:cs="Arial"/>
+                <w:lang w:val="fr-FR"/>
+              </w:rPr>
+            </w:pPr>
+            <w:r>
+              <w:rPr>
+                <w:rFonts w:ascii="Arial" w:hAnsi="Arial" w:cs="Arial"/>
+                <w:lang w:val="fr-FR"/>
+              </w:rPr>
+              <w:t>Exécution du contrat</w:t>
+            </w:r>
+          </w:p>
+        </w:tc>
+        <w:tc>
+          <w:tcPr>
+            <w:tcW w:w="1443" w:type="dxa"/>
+          </w:tcPr>
+          <w:p>
+            <w:pPr>
+              <w:jc w:val="left"/>
+              <w:rPr>
+                <w:rFonts w:ascii="Arial" w:hAnsi="Arial" w:cs="Arial"/>
+                <w:lang w:val="fr-FR"/>
+              </w:rPr>
+            </w:pPr>
+            <w:r>
+              <w:rPr>
+                <w:rFonts w:ascii="Arial" w:hAnsi="Arial" w:cs="Arial"/>
+                <w:lang w:val="fr-FR"/>
+              </w:rPr>
+              <w:t>Jusqu’à suppression du compte</w:t>
+            </w:r>
+          </w:p>
+        </w:tc>
+        <w:tc>
+          <w:tcPr>
+            <w:tcW w:w="1487" w:type="dxa"/>
+          </w:tcPr>
+          <w:p>
+            <w:pPr>
+              <w:jc w:val="left"/>
+              <w:rPr>
+                <w:rFonts w:ascii="Arial" w:hAnsi="Arial" w:cs="Arial"/>
+                <w:lang w:val="fr-FR"/>
+              </w:rPr>
+            </w:pPr>
+            <w:r>
+              <w:rPr>
+                <w:rFonts w:ascii="Arial" w:hAnsi="Arial" w:cs="Arial"/>
+                <w:lang w:val="fr-FR"/>
+              </w:rPr>
+              <w:t>Administrateur du site</w:t>
+            </w:r>
+          </w:p>
+        </w:tc>
+        <w:tc>
+          <w:tcPr>
+            <w:tcW w:w="1607" w:type="dxa"/>
+          </w:tcPr>
+          <w:p>
+            <w:pPr>
+              <w:jc w:val="left"/>
+              <w:rPr>
+                <w:rFonts w:ascii="Arial" w:hAnsi="Arial" w:cs="Arial"/>
+                <w:lang w:val="fr-FR"/>
+              </w:rPr>
+            </w:pPr>
+            <w:r>
+              <w:rPr>
+                <w:rFonts w:ascii="Arial" w:hAnsi="Arial" w:cs="Arial"/>
+                <w:lang w:val="fr-FR"/>
+              </w:rPr>
+              <w:t>Base sécurisée, pas d’affichage public</w:t>
+            </w:r>
+          </w:p>
+        </w:tc>
+      </w:tr>
+      <w:tr>
+        <w:tc>
+          <w:tcPr>
+            <w:tcW w:w="1377" w:type="dxa"/>
+          </w:tcPr>
+          <w:p>
+            <w:pPr>
+              <w:jc w:val="left"/>
+              <w:rPr>
+                <w:rFonts w:ascii="Arial" w:hAnsi="Arial" w:cs="Arial"/>
+                <w:lang w:val="fr-FR"/>
+              </w:rPr>
+            </w:pPr>
+            <w:r>
+              <w:rPr>
+                <w:rFonts w:ascii="Arial" w:hAnsi="Arial" w:cs="Arial"/>
+                <w:lang w:val="fr-FR"/>
+              </w:rPr>
+              <w:t>Adresse mail</w:t>
+            </w:r>
+          </w:p>
+        </w:tc>
+        <w:tc>
+          <w:tcPr>
+            <w:tcW w:w="1879" w:type="dxa"/>
+          </w:tcPr>
+          <w:p>
+            <w:pPr>
+              <w:jc w:val="left"/>
+              <w:rPr>
+                <w:rFonts w:ascii="Arial" w:hAnsi="Arial" w:cs="Arial"/>
+                <w:lang w:val="fr-FR"/>
+              </w:rPr>
+            </w:pPr>
+            <w:r>
+              <w:rPr>
+                <w:rFonts w:ascii="Arial" w:hAnsi="Arial" w:cs="Arial"/>
+                <w:lang w:val="fr-FR"/>
+              </w:rPr>
+              <w:t>Connexion, récupération du compte, communication</w:t>
+            </w:r>
+          </w:p>
+        </w:tc>
+        <w:tc>
+          <w:tcPr>
+            <w:tcW w:w="1269" w:type="dxa"/>
+          </w:tcPr>
+          <w:p>
+            <w:pPr>
+              <w:jc w:val="left"/>
+              <w:rPr>
+                <w:rFonts w:ascii="Arial" w:hAnsi="Arial" w:cs="Arial"/>
+                <w:lang w:val="fr-FR"/>
+              </w:rPr>
+            </w:pPr>
+            <w:r>
+              <w:rPr>
+                <w:rFonts w:ascii="Arial" w:hAnsi="Arial" w:cs="Arial"/>
+                <w:lang w:val="fr-FR"/>
+              </w:rPr>
+              <w:t>Exécution du contrat</w:t>
+            </w:r>
+          </w:p>
+        </w:tc>
+        <w:tc>
+          <w:tcPr>
+            <w:tcW w:w="1443" w:type="dxa"/>
+          </w:tcPr>
+          <w:p>
+            <w:pPr>
+              <w:jc w:val="left"/>
+              <w:rPr>
+                <w:rFonts w:ascii="Arial" w:hAnsi="Arial" w:cs="Arial"/>
+                <w:lang w:val="fr-FR"/>
+              </w:rPr>
+            </w:pPr>
+            <w:r>
+              <w:rPr>
+                <w:rFonts w:ascii="Arial" w:hAnsi="Arial" w:cs="Arial"/>
+                <w:lang w:val="fr-FR"/>
+              </w:rPr>
+              <w:t>Jusqu’à suppression du compte</w:t>
+            </w:r>
+          </w:p>
+        </w:tc>
+        <w:tc>
+          <w:tcPr>
+            <w:tcW w:w="1487" w:type="dxa"/>
+          </w:tcPr>
+          <w:p>
+            <w:pPr>
+              <w:jc w:val="left"/>
+              <w:rPr>
+                <w:rFonts w:ascii="Arial" w:hAnsi="Arial" w:cs="Arial"/>
+                <w:lang w:val="fr-FR"/>
+              </w:rPr>
+            </w:pPr>
+            <w:r>
+              <w:rPr>
+                <w:rFonts w:ascii="Arial" w:hAnsi="Arial" w:cs="Arial"/>
+                <w:lang w:val="fr-FR"/>
+              </w:rPr>
+              <w:t>Administrateur du site</w:t>
+            </w:r>
+          </w:p>
+        </w:tc>
+        <w:tc>
+          <w:tcPr>
+            <w:tcW w:w="1607" w:type="dxa"/>
+          </w:tcPr>
+          <w:p>
+            <w:pPr>
+              <w:jc w:val="left"/>
+              <w:rPr>
+                <w:rFonts w:ascii="Arial" w:hAnsi="Arial" w:cs="Arial"/>
+                <w:lang w:val="fr-FR"/>
+              </w:rPr>
+            </w:pPr>
+            <w:r>
+              <w:rPr>
+                <w:rFonts w:ascii="Arial" w:hAnsi="Arial" w:cs="Arial"/>
+                <w:lang w:val="fr-FR"/>
+              </w:rPr>
+              <w:t>Base sécurisée, envoi via SMTP sécurisé</w:t>
+            </w:r>
+          </w:p>
+        </w:tc>
+      </w:tr>
+      <w:tr>
+        <w:tc>
+          <w:tcPr>
+            <w:tcW w:w="1377" w:type="dxa"/>
+          </w:tcPr>
+          <w:p>
+            <w:pPr>
+              <w:jc w:val="left"/>
+              <w:rPr>
+                <w:rFonts w:ascii="Arial" w:hAnsi="Arial" w:cs="Arial"/>
+                <w:lang w:val="fr-FR"/>
+              </w:rPr>
+            </w:pPr>
+            <w:r>
+              <w:rPr>
+                <w:rFonts w:ascii="Arial" w:hAnsi="Arial" w:cs="Arial"/>
+                <w:lang w:val="fr-FR"/>
+              </w:rPr>
+              <w:t>Ville</w:t>
+            </w:r>
+          </w:p>
+        </w:tc>
+        <w:tc>
+          <w:tcPr>
+            <w:tcW w:w="1879" w:type="dxa"/>
+          </w:tcPr>
+          <w:p>
+            <w:pPr>
+              <w:jc w:val="left"/>
+              <w:rPr>
+                <w:rFonts w:ascii="Arial" w:hAnsi="Arial" w:cs="Arial"/>
+                <w:lang w:val="fr-FR"/>
+              </w:rPr>
+            </w:pPr>
+            <w:r>
+              <w:rPr>
+                <w:rFonts w:ascii="Arial" w:hAnsi="Arial" w:cs="Arial"/>
+                <w:lang w:val="fr-FR"/>
+              </w:rPr>
+              <w:t>Affichage dans le profil, personnalisation</w:t>
+            </w:r>
+          </w:p>
+        </w:tc>
+        <w:tc>
+          <w:tcPr>
+            <w:tcW w:w="1269" w:type="dxa"/>
+          </w:tcPr>
+          <w:p>
+            <w:pPr>
+              <w:jc w:val="left"/>
+              <w:rPr>
+                <w:rFonts w:ascii="Arial" w:hAnsi="Arial" w:cs="Arial"/>
+                <w:lang w:val="fr-FR"/>
+              </w:rPr>
+            </w:pPr>
+            <w:r>
+              <w:rPr>
+                <w:rFonts w:ascii="Arial" w:hAnsi="Arial" w:cs="Arial"/>
+                <w:lang w:val="fr-FR"/>
+              </w:rPr>
+              <w:t>Consentement de l’utilisateur</w:t>
+            </w:r>
+          </w:p>
+        </w:tc>
+        <w:tc>
+          <w:tcPr>
+            <w:tcW w:w="1443" w:type="dxa"/>
+          </w:tcPr>
+          <w:p>
+            <w:pPr>
+              <w:jc w:val="left"/>
+              <w:rPr>
+                <w:rFonts w:ascii="Arial" w:hAnsi="Arial" w:cs="Arial"/>
+                <w:lang w:val="fr-FR"/>
+              </w:rPr>
+            </w:pPr>
+            <w:r>
+              <w:rPr>
+                <w:rFonts w:ascii="Arial" w:hAnsi="Arial" w:cs="Arial"/>
+                <w:lang w:val="fr-FR"/>
+              </w:rPr>
+              <w:t>Jusqu’à suppression du compte</w:t>
+            </w:r>
+          </w:p>
+        </w:tc>
+        <w:tc>
+          <w:tcPr>
+            <w:tcW w:w="1487" w:type="dxa"/>
+          </w:tcPr>
+          <w:p>
+            <w:pPr>
+              <w:jc w:val="left"/>
+              <w:rPr>
+                <w:rFonts w:ascii="Arial" w:hAnsi="Arial" w:cs="Arial"/>
+                <w:lang w:val="fr-FR"/>
+              </w:rPr>
+            </w:pPr>
+            <w:r>
+              <w:rPr>
+                <w:rFonts w:ascii="Arial" w:hAnsi="Arial" w:cs="Arial"/>
+                <w:lang w:val="fr-FR"/>
+              </w:rPr>
+              <w:t>Autres utilisateurs si affichage public</w:t>
+            </w:r>
+          </w:p>
+        </w:tc>
+        <w:tc>
+          <w:tcPr>
+            <w:tcW w:w="1607" w:type="dxa"/>
+          </w:tcPr>
+          <w:p>
+            <w:pPr>
+              <w:jc w:val="left"/>
+              <w:rPr>
+                <w:rFonts w:ascii="Arial" w:hAnsi="Arial" w:cs="Arial"/>
+                <w:lang w:val="fr-FR"/>
+              </w:rPr>
+            </w:pPr>
+            <w:r>
+              <w:rPr>
+                <w:rFonts w:ascii="Arial" w:hAnsi="Arial" w:cs="Arial"/>
+                <w:lang w:val="fr-FR"/>
+              </w:rPr>
+              <w:t>Base sécurisée</w:t>
+            </w:r>
+          </w:p>
+        </w:tc>
+      </w:tr>
+      <w:tr>
+        <w:tc>
+          <w:tcPr>
+            <w:tcW w:w="1377" w:type="dxa"/>
+          </w:tcPr>
+          <w:p>
+            <w:pPr>
+              <w:jc w:val="left"/>
+              <w:rPr>
+                <w:rFonts w:ascii="Arial" w:hAnsi="Arial" w:cs="Arial"/>
+                <w:lang w:val="fr-FR"/>
+              </w:rPr>
+            </w:pPr>
+            <w:r>
+              <w:rPr>
+                <w:rFonts w:ascii="Arial" w:hAnsi="Arial" w:cs="Arial"/>
+                <w:lang w:val="fr-FR"/>
+              </w:rPr>
+              <w:t>Mot de passe</w:t>
+            </w:r>
+          </w:p>
+        </w:tc>
+        <w:tc>
+          <w:tcPr>
+            <w:tcW w:w="1879" w:type="dxa"/>
+          </w:tcPr>
+          <w:p>
+            <w:pPr>
+              <w:jc w:val="left"/>
+              <w:rPr>
+                <w:rFonts w:ascii="Arial" w:hAnsi="Arial" w:cs="Arial"/>
+                <w:lang w:val="fr-FR"/>
+              </w:rPr>
+            </w:pPr>
+            <w:r>
+              <w:rPr>
+                <w:rFonts w:ascii="Arial" w:hAnsi="Arial" w:cs="Arial"/>
+                <w:lang w:val="fr-FR"/>
+              </w:rPr>
+              <w:t>Authentification de l’utilisateur</w:t>
+            </w:r>
+          </w:p>
+        </w:tc>
+        <w:tc>
+          <w:tcPr>
+            <w:tcW w:w="1269" w:type="dxa"/>
+          </w:tcPr>
+          <w:p>
+            <w:pPr>
+              <w:jc w:val="left"/>
+              <w:rPr>
+                <w:rFonts w:ascii="Arial" w:hAnsi="Arial" w:cs="Arial"/>
+                <w:lang w:val="fr-FR"/>
+              </w:rPr>
+            </w:pPr>
+            <w:r>
+              <w:rPr>
+                <w:rFonts w:ascii="Arial" w:hAnsi="Arial" w:cs="Arial"/>
+                <w:lang w:val="fr-FR"/>
+              </w:rPr>
+              <w:t>Exécution du contrat</w:t>
+            </w:r>
+          </w:p>
+        </w:tc>
+        <w:tc>
+          <w:tcPr>
+            <w:tcW w:w="1443" w:type="dxa"/>
+          </w:tcPr>
+          <w:p>
+            <w:pPr>
+              <w:jc w:val="left"/>
+              <w:rPr>
+                <w:rFonts w:ascii="Arial" w:hAnsi="Arial" w:cs="Arial"/>
+                <w:lang w:val="fr-FR"/>
+              </w:rPr>
+            </w:pPr>
+            <w:r>
+              <w:rPr>
+                <w:rFonts w:ascii="Arial" w:hAnsi="Arial" w:cs="Arial"/>
+                <w:lang w:val="fr-FR"/>
+              </w:rPr>
+              <w:t>Jusqu’à suppression du compte</w:t>
+            </w:r>
+          </w:p>
+        </w:tc>
+        <w:tc>
+          <w:tcPr>
+            <w:tcW w:w="1487" w:type="dxa"/>
+          </w:tcPr>
+          <w:p>
+            <w:pPr>
+              <w:jc w:val="left"/>
+              <w:rPr>
+                <w:rFonts w:ascii="Arial" w:hAnsi="Arial" w:cs="Arial"/>
+                <w:lang w:val="fr-FR"/>
+              </w:rPr>
+            </w:pPr>
+            <w:r>
+              <w:rPr>
+                <w:rFonts w:ascii="Arial" w:hAnsi="Arial" w:cs="Arial"/>
+                <w:lang w:val="fr-FR"/>
+              </w:rPr>
+              <w:t>Aucun (jamais en clair)</w:t>
+            </w:r>
+          </w:p>
+        </w:tc>
+        <w:tc>
+          <w:tcPr>
+            <w:tcW w:w="1607" w:type="dxa"/>
+          </w:tcPr>
+          <w:p>
+            <w:pPr>
+              <w:jc w:val="left"/>
+              <w:rPr>
+                <w:rFonts w:ascii="Arial" w:hAnsi="Arial" w:cs="Arial"/>
+                <w:lang w:val="fr-FR"/>
+              </w:rPr>
+            </w:pPr>
+            <w:proofErr w:type="spellStart"/>
+            <w:r>
+              <w:rPr>
+                <w:rFonts w:ascii="Arial" w:hAnsi="Arial" w:cs="Arial"/>
+                <w:lang w:val="fr-FR"/>
+              </w:rPr>
+              <w:t>Hashage</w:t>
+            </w:r>
+            <w:proofErr w:type="spellEnd"/>
+            <w:r>
+              <w:rPr>
+                <w:rFonts w:ascii="Arial" w:hAnsi="Arial" w:cs="Arial"/>
+                <w:lang w:val="fr-FR"/>
+              </w:rPr>
+              <w:t xml:space="preserve"> (</w:t>
+            </w:r>
+            <w:proofErr w:type="spellStart"/>
+            <w:r>
+              <w:rPr>
+                <w:rFonts w:ascii="Arial" w:hAnsi="Arial" w:cs="Arial"/>
+                <w:lang w:val="fr-FR"/>
+              </w:rPr>
+              <w:t>bcrypt</w:t>
+            </w:r>
+            <w:proofErr w:type="spellEnd"/>
+            <w:r>
+              <w:rPr>
+                <w:rFonts w:ascii="Arial" w:hAnsi="Arial" w:cs="Arial"/>
+                <w:lang w:val="fr-FR"/>
+              </w:rPr>
+              <w:t>/argon2), salage, pas de stockage en clair</w:t>
+            </w:r>
+          </w:p>
+        </w:tc>
+      </w:tr>
+      <w:tr>
+        <w:tc>
+          <w:tcPr>
+            <w:tcW w:w="1377" w:type="dxa"/>
+          </w:tcPr>
+          <w:p>
+            <w:pPr>
+              <w:jc w:val="left"/>
+              <w:rPr>
+                <w:rFonts w:ascii="Arial" w:hAnsi="Arial" w:cs="Arial"/>
+                <w:lang w:val="fr-FR"/>
+              </w:rPr>
+            </w:pPr>
+            <w:r>
+              <w:rPr>
+                <w:rFonts w:ascii="Arial" w:hAnsi="Arial" w:cs="Arial"/>
+                <w:lang w:val="fr-FR"/>
+              </w:rPr>
+              <w:t>Parcours postés (texte)</w:t>
+            </w:r>
+          </w:p>
+        </w:tc>
+        <w:tc>
+          <w:tcPr>
+            <w:tcW w:w="1879" w:type="dxa"/>
+          </w:tcPr>
+          <w:p>
+            <w:pPr>
+              <w:jc w:val="left"/>
+              <w:rPr>
+                <w:rFonts w:ascii="Arial" w:hAnsi="Arial" w:cs="Arial"/>
+                <w:lang w:val="fr-FR"/>
+              </w:rPr>
+            </w:pPr>
+            <w:r>
+              <w:rPr>
+                <w:rFonts w:ascii="Arial" w:hAnsi="Arial" w:cs="Arial"/>
+                <w:lang w:val="fr-FR"/>
+              </w:rPr>
+              <w:t>Fonctionnalité réseau social (partage)</w:t>
+            </w:r>
+          </w:p>
+        </w:tc>
+        <w:tc>
+          <w:tcPr>
+            <w:tcW w:w="1269" w:type="dxa"/>
+          </w:tcPr>
+          <w:p>
+            <w:pPr>
+              <w:jc w:val="left"/>
+              <w:rPr>
+                <w:rFonts w:ascii="Arial" w:hAnsi="Arial" w:cs="Arial"/>
+                <w:lang w:val="fr-FR"/>
+              </w:rPr>
+            </w:pPr>
+            <w:r>
+              <w:rPr>
+                <w:rFonts w:ascii="Arial" w:hAnsi="Arial" w:cs="Arial"/>
+                <w:lang w:val="fr-FR"/>
+              </w:rPr>
+              <w:t>Consentement de l’utilisateur</w:t>
+            </w:r>
+          </w:p>
+        </w:tc>
+        <w:tc>
+          <w:tcPr>
+            <w:tcW w:w="1443" w:type="dxa"/>
+          </w:tcPr>
+          <w:p>
+            <w:pPr>
+              <w:jc w:val="left"/>
+              <w:rPr>
+                <w:rFonts w:ascii="Arial" w:hAnsi="Arial" w:cs="Arial"/>
+                <w:lang w:val="fr-FR"/>
+              </w:rPr>
+            </w:pPr>
+            <w:r>
+              <w:rPr>
+                <w:rFonts w:ascii="Arial" w:hAnsi="Arial" w:cs="Arial"/>
+                <w:lang w:val="fr-FR"/>
+              </w:rPr>
+              <w:t>Jusqu’à suppression par l’utilisateur</w:t>
+            </w:r>
+          </w:p>
+        </w:tc>
+        <w:tc>
+          <w:tcPr>
+            <w:tcW w:w="1487" w:type="dxa"/>
+          </w:tcPr>
+          <w:p>
+            <w:pPr>
+              <w:jc w:val="left"/>
+              <w:rPr>
+                <w:rFonts w:ascii="Arial" w:hAnsi="Arial" w:cs="Arial"/>
+                <w:lang w:val="fr-FR"/>
+              </w:rPr>
+            </w:pPr>
+            <w:r>
+              <w:rPr>
+                <w:rFonts w:ascii="Arial" w:hAnsi="Arial" w:cs="Arial"/>
+                <w:lang w:val="fr-FR"/>
+              </w:rPr>
+              <w:t>Autres utilisateurs</w:t>
+            </w:r>
+          </w:p>
+        </w:tc>
+        <w:tc>
+          <w:tcPr>
+            <w:tcW w:w="1607" w:type="dxa"/>
+          </w:tcPr>
+          <w:p>
+            <w:pPr>
+              <w:jc w:val="left"/>
+              <w:rPr>
+                <w:rFonts w:ascii="Arial" w:hAnsi="Arial" w:cs="Arial"/>
+                <w:lang w:val="fr-FR"/>
+              </w:rPr>
+            </w:pPr>
+            <w:r>
+              <w:rPr>
+                <w:rFonts w:ascii="Arial" w:hAnsi="Arial" w:cs="Arial"/>
+                <w:lang w:val="fr-FR"/>
+              </w:rPr>
+              <w:t>Base sécurisée, option de suppression</w:t>
+            </w:r>
+          </w:p>
+        </w:tc>
+      </w:tr>
+      <w:tr>
+        <w:tc>
+          <w:tcPr>
+            <w:tcW w:w="1377" w:type="dxa"/>
+          </w:tcPr>
+          <w:p>
+            <w:pPr>
+              <w:jc w:val="left"/>
+              <w:rPr>
+                <w:rFonts w:ascii="Arial" w:hAnsi="Arial" w:cs="Arial"/>
+                <w:lang w:val="fr-FR"/>
+              </w:rPr>
+            </w:pPr>
+            <w:r>
+              <w:rPr>
+                <w:rFonts w:ascii="Arial" w:hAnsi="Arial" w:cs="Arial"/>
+                <w:lang w:val="fr-FR"/>
+              </w:rPr>
+              <w:t>Photos postées</w:t>
+            </w:r>
+          </w:p>
+        </w:tc>
+        <w:tc>
+          <w:tcPr>
+            <w:tcW w:w="1879" w:type="dxa"/>
+          </w:tcPr>
+          <w:p>
+            <w:pPr>
+              <w:jc w:val="left"/>
+              <w:rPr>
+                <w:rFonts w:ascii="Arial" w:hAnsi="Arial" w:cs="Arial"/>
+                <w:lang w:val="fr-FR"/>
+              </w:rPr>
+            </w:pPr>
+            <w:r>
+              <w:rPr>
+                <w:rFonts w:ascii="Arial" w:hAnsi="Arial" w:cs="Arial"/>
+                <w:lang w:val="fr-FR"/>
+              </w:rPr>
+              <w:t>Fonctionnalité réseau social (partage)</w:t>
+            </w:r>
+          </w:p>
+        </w:tc>
+        <w:tc>
+          <w:tcPr>
+            <w:tcW w:w="1269" w:type="dxa"/>
+          </w:tcPr>
+          <w:p>
+            <w:pPr>
+              <w:jc w:val="left"/>
+              <w:rPr>
+                <w:rFonts w:ascii="Arial" w:hAnsi="Arial" w:cs="Arial"/>
+                <w:lang w:val="fr-FR"/>
+              </w:rPr>
+            </w:pPr>
+            <w:r>
+              <w:rPr>
+                <w:rFonts w:ascii="Arial" w:hAnsi="Arial" w:cs="Arial"/>
+                <w:lang w:val="fr-FR"/>
+              </w:rPr>
+              <w:t>Consentement de l’utilisateur</w:t>
+            </w:r>
+          </w:p>
+        </w:tc>
+        <w:tc>
+          <w:tcPr>
+            <w:tcW w:w="1443" w:type="dxa"/>
+          </w:tcPr>
+          <w:p>
+            <w:pPr>
+              <w:jc w:val="left"/>
+              <w:rPr>
+                <w:rFonts w:ascii="Arial" w:hAnsi="Arial" w:cs="Arial"/>
+                <w:lang w:val="fr-FR"/>
+              </w:rPr>
+            </w:pPr>
+            <w:r>
+              <w:rPr>
+                <w:rFonts w:ascii="Arial" w:hAnsi="Arial" w:cs="Arial"/>
+                <w:lang w:val="fr-FR"/>
+              </w:rPr>
+              <w:t>Jusqu’à suppression par l’utilisateur</w:t>
+            </w:r>
+          </w:p>
+        </w:tc>
+        <w:tc>
+          <w:tcPr>
+            <w:tcW w:w="1487" w:type="dxa"/>
+          </w:tcPr>
+          <w:p>
+            <w:pPr>
+              <w:jc w:val="left"/>
+              <w:rPr>
+                <w:rFonts w:ascii="Arial" w:hAnsi="Arial" w:cs="Arial"/>
+                <w:lang w:val="fr-FR"/>
+              </w:rPr>
+            </w:pPr>
+            <w:r>
+              <w:rPr>
+                <w:rFonts w:ascii="Arial" w:hAnsi="Arial" w:cs="Arial"/>
+                <w:lang w:val="fr-FR"/>
+              </w:rPr>
+              <w:t>Autres utilisateurs</w:t>
+            </w:r>
+          </w:p>
+        </w:tc>
+        <w:tc>
+          <w:tcPr>
+            <w:tcW w:w="1607" w:type="dxa"/>
+          </w:tcPr>
+          <w:p>
+            <w:pPr>
+              <w:jc w:val="left"/>
+              <w:rPr>
+                <w:rFonts w:ascii="Arial" w:hAnsi="Arial" w:cs="Arial"/>
+                <w:lang w:val="fr-FR"/>
+              </w:rPr>
+            </w:pPr>
+            <w:r>
+              <w:rPr>
+                <w:rFonts w:ascii="Arial" w:hAnsi="Arial" w:cs="Arial"/>
+                <w:lang w:val="fr-FR"/>
+              </w:rPr>
+              <w:t>Stockage sécurisé, option de suppression</w:t>
+            </w:r>
+          </w:p>
+        </w:tc>
+      </w:tr>
+      <w:tr>
+        <w:tc>
+          <w:tcPr>
+            <w:tcW w:w="1377" w:type="dxa"/>
+          </w:tcPr>
+          <w:p>
+            <w:pPr>
+              <w:jc w:val="left"/>
+              <w:rPr>
+                <w:rFonts w:ascii="Arial" w:hAnsi="Arial" w:cs="Arial"/>
+                <w:lang w:val="fr-FR"/>
+              </w:rPr>
+            </w:pPr>
+            <w:r>
+              <w:rPr>
+                <w:rFonts w:ascii="Arial" w:hAnsi="Arial" w:cs="Arial"/>
+                <w:lang w:val="fr-FR"/>
+              </w:rPr>
+              <w:t>Logs techniques (IP, connexions)</w:t>
+            </w:r>
+          </w:p>
+        </w:tc>
+        <w:tc>
+          <w:tcPr>
+            <w:tcW w:w="1879" w:type="dxa"/>
+          </w:tcPr>
+          <w:p>
+            <w:pPr>
+              <w:jc w:val="left"/>
+              <w:rPr>
+                <w:rFonts w:ascii="Arial" w:hAnsi="Arial" w:cs="Arial"/>
+                <w:lang w:val="fr-FR"/>
+              </w:rPr>
+            </w:pPr>
+            <w:r>
+              <w:rPr>
+                <w:rFonts w:ascii="Arial" w:hAnsi="Arial" w:cs="Arial"/>
+                <w:lang w:val="fr-FR"/>
+              </w:rPr>
+              <w:t>Sécurité, prévention des abus</w:t>
+            </w:r>
+          </w:p>
+        </w:tc>
+        <w:tc>
+          <w:tcPr>
+            <w:tcW w:w="1269" w:type="dxa"/>
+          </w:tcPr>
+          <w:p>
+            <w:pPr>
+              <w:jc w:val="left"/>
+              <w:rPr>
+                <w:rFonts w:ascii="Arial" w:hAnsi="Arial" w:cs="Arial"/>
+                <w:lang w:val="fr-FR"/>
+              </w:rPr>
+            </w:pPr>
+            <w:r>
+              <w:rPr>
+                <w:rFonts w:ascii="Arial" w:hAnsi="Arial" w:cs="Arial"/>
+                <w:lang w:val="fr-FR"/>
+              </w:rPr>
+              <w:t>Intérêt légitime</w:t>
+            </w:r>
+          </w:p>
+        </w:tc>
+        <w:tc>
+          <w:tcPr>
+            <w:tcW w:w="1443" w:type="dxa"/>
+          </w:tcPr>
+          <w:p>
+            <w:pPr>
+              <w:jc w:val="left"/>
+              <w:rPr>
+                <w:rFonts w:ascii="Arial" w:hAnsi="Arial" w:cs="Arial"/>
+                <w:lang w:val="fr-FR"/>
+              </w:rPr>
+            </w:pPr>
+            <w:r>
+              <w:rPr>
+                <w:rFonts w:ascii="Arial" w:hAnsi="Arial" w:cs="Arial"/>
+                <w:lang w:val="fr-FR"/>
+              </w:rPr>
+              <w:t>6 à 12 mois</w:t>
+            </w:r>
+          </w:p>
+        </w:tc>
+        <w:tc>
+          <w:tcPr>
+            <w:tcW w:w="1487" w:type="dxa"/>
+          </w:tcPr>
+          <w:p>
+            <w:pPr>
+              <w:jc w:val="left"/>
+              <w:rPr>
+                <w:rFonts w:ascii="Arial" w:hAnsi="Arial" w:cs="Arial"/>
+                <w:lang w:val="fr-FR"/>
+              </w:rPr>
+            </w:pPr>
+            <w:r>
+              <w:rPr>
+                <w:rFonts w:ascii="Arial" w:hAnsi="Arial" w:cs="Arial"/>
+                <w:lang w:val="fr-FR"/>
+              </w:rPr>
+              <w:t>Administrateur technique</w:t>
+            </w:r>
+          </w:p>
+        </w:tc>
+        <w:tc>
+          <w:tcPr>
+            <w:tcW w:w="1607" w:type="dxa"/>
+          </w:tcPr>
+          <w:p>
+            <w:pPr>
+              <w:jc w:val="left"/>
+              <w:rPr>
+                <w:rFonts w:ascii="Arial" w:hAnsi="Arial" w:cs="Arial"/>
+                <w:lang w:val="fr-FR"/>
+              </w:rPr>
+            </w:pPr>
+            <w:r>
+              <w:rPr>
+                <w:rFonts w:ascii="Arial" w:hAnsi="Arial" w:cs="Arial"/>
+                <w:lang w:val="fr-FR"/>
+              </w:rPr>
+              <w:t>Journaux sécurisés, accès limité</w:t>
+            </w:r>
+          </w:p>
+        </w:tc>
+      </w:tr>
+      <w:tr>
+        <w:tc>
+          <w:tcPr>
+            <w:tcW w:w="1377" w:type="dxa"/>
+          </w:tcPr>
+          <w:p>
+            <w:pPr>
+              <w:jc w:val="left"/>
+              <w:rPr>
+                <w:rFonts w:ascii="Arial" w:hAnsi="Arial" w:cs="Arial"/>
+                <w:lang w:val="fr-FR"/>
+              </w:rPr>
+            </w:pPr>
+            <w:r>
+              <w:rPr>
+                <w:rFonts w:ascii="Arial" w:hAnsi="Arial" w:cs="Arial"/>
+                <w:lang w:val="fr-FR"/>
+              </w:rPr>
+              <w:t>Sauvegardes des données</w:t>
+            </w:r>
+          </w:p>
+        </w:tc>
+        <w:tc>
+          <w:tcPr>
+            <w:tcW w:w="1879" w:type="dxa"/>
+          </w:tcPr>
+          <w:p>
+            <w:pPr>
+              <w:jc w:val="left"/>
+              <w:rPr>
+                <w:rFonts w:ascii="Arial" w:hAnsi="Arial" w:cs="Arial"/>
+                <w:lang w:val="fr-FR"/>
+              </w:rPr>
+            </w:pPr>
+            <w:r>
+              <w:rPr>
+                <w:rFonts w:ascii="Arial" w:hAnsi="Arial" w:cs="Arial"/>
+                <w:lang w:val="fr-FR"/>
+              </w:rPr>
+              <w:t>Restauration en cas d’incident</w:t>
+            </w:r>
+          </w:p>
+        </w:tc>
+        <w:tc>
+          <w:tcPr>
+            <w:tcW w:w="1269" w:type="dxa"/>
+          </w:tcPr>
+          <w:p>
+            <w:pPr>
+              <w:jc w:val="left"/>
+              <w:rPr>
+                <w:rFonts w:ascii="Arial" w:hAnsi="Arial" w:cs="Arial"/>
+                <w:lang w:val="fr-FR"/>
+              </w:rPr>
+            </w:pPr>
+            <w:r>
+              <w:rPr>
+                <w:rFonts w:ascii="Arial" w:hAnsi="Arial" w:cs="Arial"/>
+                <w:lang w:val="fr-FR"/>
+              </w:rPr>
+              <w:t>Intérêt légitime</w:t>
+            </w:r>
+          </w:p>
+        </w:tc>
+        <w:tc>
+          <w:tcPr>
+            <w:tcW w:w="1443" w:type="dxa"/>
+          </w:tcPr>
+          <w:p>
+            <w:pPr>
+              <w:jc w:val="left"/>
+              <w:rPr>
+                <w:rFonts w:ascii="Arial" w:hAnsi="Arial" w:cs="Arial"/>
+                <w:lang w:val="fr-FR"/>
+              </w:rPr>
+            </w:pPr>
+            <w:r>
+              <w:rPr>
+                <w:rFonts w:ascii="Arial" w:hAnsi="Arial" w:cs="Arial"/>
+                <w:lang w:val="fr-FR"/>
+              </w:rPr>
+              <w:t>Durée limitée (rotation)</w:t>
+            </w:r>
+          </w:p>
+        </w:tc>
+        <w:tc>
+          <w:tcPr>
+            <w:tcW w:w="1487" w:type="dxa"/>
+          </w:tcPr>
+          <w:p>
+            <w:pPr>
+              <w:jc w:val="left"/>
+              <w:rPr>
+                <w:rFonts w:ascii="Arial" w:hAnsi="Arial" w:cs="Arial"/>
+                <w:lang w:val="fr-FR"/>
+              </w:rPr>
+            </w:pPr>
+            <w:r>
+              <w:rPr>
+                <w:rFonts w:ascii="Arial" w:hAnsi="Arial" w:cs="Arial"/>
+                <w:lang w:val="fr-FR"/>
+              </w:rPr>
+              <w:t>Hébergeur, administrateur</w:t>
+            </w:r>
+          </w:p>
+        </w:tc>
+        <w:tc>
+          <w:tcPr>
+            <w:tcW w:w="1607" w:type="dxa"/>
+          </w:tcPr>
+          <w:p>
+            <w:pPr>
+              <w:jc w:val="left"/>
+              <w:rPr>
+                <w:rFonts w:ascii="Arial" w:hAnsi="Arial" w:cs="Arial"/>
+                <w:lang w:val="fr-FR"/>
+              </w:rPr>
+            </w:pPr>
+            <w:r>
+              <w:rPr>
+                <w:rFonts w:ascii="Arial" w:hAnsi="Arial" w:cs="Arial"/>
+                <w:lang w:val="fr-FR"/>
+              </w:rPr>
+              <w:t>Chiffrement, accès restreint</w:t>
+            </w:r>
+          </w:p>
+        </w:tc>
+      </w:tr>
+    </w:tbl>
+    <w:p>
+      <w:pPr>
+        <w:pStyle w:val="Titre3"/>
+        <w:numPr>
+          <w:ilvl w:val="0"/>
+          <w:numId w:val="0"/>
+        </w:numPr>
+      </w:pPr>
       <w:r>
         <w:br w:type="page"/>
       </w:r>
@@ -4450,6 +5827,7 @@
       </w:pPr>
       <w:hyperlink r:id="rId19" w:history="1">
         <w:proofErr w:type="spellStart"/>
+        <w:proofErr w:type="gramStart"/>
         <w:r>
           <w:rPr>
             <w:rStyle w:val="Lienhypertexte"/>
@@ -4457,6 +5835,7 @@
           <w:t>triplt</w:t>
         </w:r>
         <w:proofErr w:type="spellEnd"/>
+        <w:proofErr w:type="gramEnd"/>
       </w:hyperlink>
       <w:r>
         <w:t xml:space="preserve"> : </w:t>
@@ -4467,10 +5846,12 @@
         <w:pStyle w:val="Paragraphedeliste"/>
       </w:pPr>
       <w:proofErr w:type="spellStart"/>
+      <w:proofErr w:type="gramStart"/>
       <w:r>
         <w:t>triplt</w:t>
       </w:r>
       <w:proofErr w:type="spellEnd"/>
+      <w:proofErr w:type="gramEnd"/>
       <w:r>
         <w:t xml:space="preserve"> est une application de gestion de voyage où il est possible d’organiser un itinéraire de manière structurée.</w:t>
       </w:r>
@@ -5223,7 +6604,19 @@
         </w:numPr>
       </w:pPr>
       <w:r>
-        <w:t>Accessibilité (aveugle , problèmes d’audition ,…)</w:t>
+        <w:t>Accessibilité (</w:t>
+      </w:r>
+      <w:r>
+        <w:t>aveugle,</w:t>
+      </w:r>
+      <w:r>
+        <w:t xml:space="preserve"> problèmes d’audition</w:t>
+      </w:r>
+      <w:r>
+        <w:t xml:space="preserve"> …</w:t>
+      </w:r>
+      <w:r>
+        <w:t>)</w:t>
       </w:r>
     </w:p>
     <w:p>
@@ -7021,7 +8414,25 @@
         </w:numPr>
       </w:pPr>
       <w:r>
-        <w:t>Le système retourne la liste des options possibles, qui sont affichés à l’utilisateurs sous forme de menu (connexion , inscription , messagerie, création de Road Trip, profil  amis ,recherche).</w:t>
+        <w:t>Le système retourne la liste des options possibles, qui sont affichés à l’utilisateurs sous forme de menu (</w:t>
+      </w:r>
+      <w:r>
+        <w:t>connexion,</w:t>
+      </w:r>
+      <w:r>
+        <w:t xml:space="preserve"> </w:t>
+      </w:r>
+      <w:r>
+        <w:t>inscription,</w:t>
+      </w:r>
+      <w:r>
+        <w:t xml:space="preserve"> messagerie, création de Road Trip, </w:t>
+      </w:r>
+      <w:r>
+        <w:t>profil amis, recherche</w:t>
+      </w:r>
+      <w:r>
+        <w:t>).</w:t>
       </w:r>
     </w:p>
     <w:p>
@@ -7328,7 +8739,13 @@
         </w:numPr>
       </w:pPr>
       <w:r>
-        <w:t>Si les identifiants sont correctes :</w:t>
+        <w:t xml:space="preserve">Si les identifiants sont </w:t>
+      </w:r>
+      <w:r>
+        <w:t>corrects</w:t>
+      </w:r>
+      <w:r>
+        <w:t> :</w:t>
       </w:r>
     </w:p>
     <w:p>
@@ -7340,7 +8757,13 @@
         </w:numPr>
       </w:pPr>
       <w:r>
-        <w:t xml:space="preserve">Le système informe la page de connexion que l’authentification est réussi </w:t>
+        <w:t xml:space="preserve">Le système informe la page de connexion que l’authentification est </w:t>
+      </w:r>
+      <w:r>
+        <w:t>réussie</w:t>
+      </w:r>
+      <w:r>
+        <w:t xml:space="preserve"> </w:t>
       </w:r>
     </w:p>
     <w:p>
@@ -7364,7 +8787,13 @@
         </w:numPr>
       </w:pPr>
       <w:r>
-        <w:t>Si les identifiants sont incorrectes :</w:t>
+        <w:t xml:space="preserve">Si les identifiants sont </w:t>
+      </w:r>
+      <w:r>
+        <w:t>incorrects</w:t>
+      </w:r>
+      <w:r>
+        <w:t> :</w:t>
       </w:r>
     </w:p>
     <w:p>
@@ -7376,7 +8805,13 @@
         </w:numPr>
       </w:pPr>
       <w:r>
-        <w:t>Le système retourne une message d’erreur à la plage de connexion</w:t>
+        <w:t xml:space="preserve">Le système retourne </w:t>
+      </w:r>
+      <w:r>
+        <w:t>un message</w:t>
+      </w:r>
+      <w:r>
+        <w:t xml:space="preserve"> d’erreur à la plage de connexion</w:t>
       </w:r>
     </w:p>
     <w:p>
@@ -7413,11 +8848,9 @@
       <w:r>
         <w:t xml:space="preserve">interagit directement avec la </w:t>
       </w:r>
-      <w:proofErr w:type="spellStart"/>
-      <w:r>
-        <w:t>abse</w:t>
-      </w:r>
-      <w:proofErr w:type="spellEnd"/>
+      <w:r>
+        <w:t>base</w:t>
+      </w:r>
       <w:r>
         <w:t xml:space="preserve"> de données. L’utilisateur reçoit un retour immédiat selon le résultat de la vérification, garantissant ainsi un processus de connexion fiable et sécurisé.</w:t>
       </w:r>
@@ -7640,7 +9073,13 @@
         <w:pStyle w:val="Paragraphedeliste"/>
       </w:pPr>
       <w:r>
-        <w:t>Ce diagramme montre comment le système joue un rôle central dans la gestion de la messagerie , il assure la synchronisation avec la base de données pour le stockage et la récupération des messages, il garantit que les notifications sont correctement envoyées aux amis lorsque de nouveaux messages sont reçus, il permet également à l’utilisateur de visualiser et d’interagir avec ses conversations de manières fluide et sécurisée.</w:t>
+        <w:t xml:space="preserve">Ce diagramme montre comment le système joue un rôle central dans la gestion de la </w:t>
+      </w:r>
+      <w:r>
+        <w:t>messagerie,</w:t>
+      </w:r>
+      <w:r>
+        <w:t xml:space="preserve"> il assure la synchronisation avec la base de données pour le stockage et la récupération des messages, il garantit que les notifications sont correctement envoyées aux amis lorsque de nouveaux messages sont reçus, il permet également à l’utilisateur de visualiser et d’interagir avec ses conversations de manières fluide et sécurisée.</w:t>
       </w:r>
     </w:p>
     <w:p>
@@ -8043,10 +9482,10 @@
         <w:t xml:space="preserve"> renvoie ces informations au Système, qui les transmet ensuite à la </w:t>
       </w:r>
       <w:r>
-        <w:t xml:space="preserve">page profil </w:t>
-      </w:r>
-      <w:r>
-        <w:t>.</w:t>
+        <w:t xml:space="preserve">page </w:t>
+      </w:r>
+      <w:r>
+        <w:t>profil.</w:t>
       </w:r>
     </w:p>
     <w:p>
@@ -8361,8 +9800,13 @@
       <w:pPr>
         <w:pStyle w:val="Paragraphedeliste"/>
       </w:pPr>
-      <w:r>
-        <w:t>  Description :</w:t>
+      <w:proofErr w:type="gramStart"/>
+      <w:r>
+        <w:t>  Description</w:t>
+      </w:r>
+      <w:proofErr w:type="gramEnd"/>
+      <w:r>
+        <w:t xml:space="preserve"> :</w:t>
       </w:r>
       <w:r>
         <w:br/>
@@ -8373,8 +9817,13 @@
       <w:pPr>
         <w:pStyle w:val="Paragraphedeliste"/>
       </w:pPr>
-      <w:r>
-        <w:t>  Rôles et actions possibles :</w:t>
+      <w:proofErr w:type="gramStart"/>
+      <w:r>
+        <w:t>  Rôles</w:t>
+      </w:r>
+      <w:proofErr w:type="gramEnd"/>
+      <w:r>
+        <w:t xml:space="preserve"> et actions possibles :</w:t>
       </w:r>
     </w:p>
     <w:p>
@@ -8405,8 +9854,13 @@
       <w:pPr>
         <w:pStyle w:val="Paragraphedeliste"/>
       </w:pPr>
-      <w:r>
-        <w:t>  Transitions :</w:t>
+      <w:proofErr w:type="gramStart"/>
+      <w:r>
+        <w:t>  Transitions</w:t>
+      </w:r>
+      <w:proofErr w:type="gramEnd"/>
+      <w:r>
+        <w:t xml:space="preserve"> :</w:t>
       </w:r>
     </w:p>
     <w:p>
@@ -8438,8 +9892,13 @@
       <w:pPr>
         <w:pStyle w:val="Paragraphedeliste"/>
       </w:pPr>
-      <w:r>
-        <w:t>  Description :</w:t>
+      <w:proofErr w:type="gramStart"/>
+      <w:r>
+        <w:t>  Description</w:t>
+      </w:r>
+      <w:proofErr w:type="gramEnd"/>
+      <w:r>
+        <w:t xml:space="preserve"> :</w:t>
       </w:r>
       <w:r>
         <w:br/>
@@ -8450,8 +9909,13 @@
       <w:pPr>
         <w:pStyle w:val="Paragraphedeliste"/>
       </w:pPr>
-      <w:r>
-        <w:t>  Rôles et actions possibles :</w:t>
+      <w:proofErr w:type="gramStart"/>
+      <w:r>
+        <w:t>  Rôles</w:t>
+      </w:r>
+      <w:proofErr w:type="gramEnd"/>
+      <w:r>
+        <w:t xml:space="preserve"> et actions possibles :</w:t>
       </w:r>
     </w:p>
     <w:p>
@@ -8482,8 +9946,13 @@
       <w:pPr>
         <w:pStyle w:val="Paragraphedeliste"/>
       </w:pPr>
-      <w:r>
-        <w:t>  Transitions :</w:t>
+      <w:proofErr w:type="gramStart"/>
+      <w:r>
+        <w:t>  Transitions</w:t>
+      </w:r>
+      <w:proofErr w:type="gramEnd"/>
+      <w:r>
+        <w:t xml:space="preserve"> :</w:t>
       </w:r>
     </w:p>
     <w:p>
@@ -8515,8 +9984,13 @@
       <w:pPr>
         <w:pStyle w:val="Paragraphedeliste"/>
       </w:pPr>
-      <w:r>
-        <w:t>  Description :</w:t>
+      <w:proofErr w:type="gramStart"/>
+      <w:r>
+        <w:t>  Description</w:t>
+      </w:r>
+      <w:proofErr w:type="gramEnd"/>
+      <w:r>
+        <w:t xml:space="preserve"> :</w:t>
       </w:r>
       <w:r>
         <w:br/>
@@ -8527,8 +10001,13 @@
       <w:pPr>
         <w:pStyle w:val="Paragraphedeliste"/>
       </w:pPr>
-      <w:r>
-        <w:t>  Rôles et actions possibles :</w:t>
+      <w:proofErr w:type="gramStart"/>
+      <w:r>
+        <w:t>  Rôles</w:t>
+      </w:r>
+      <w:proofErr w:type="gramEnd"/>
+      <w:r>
+        <w:t xml:space="preserve"> et actions possibles :</w:t>
       </w:r>
     </w:p>
     <w:p>
@@ -8567,8 +10046,13 @@
       <w:pPr>
         <w:pStyle w:val="Paragraphedeliste"/>
       </w:pPr>
-      <w:r>
-        <w:t>  Transitions :</w:t>
+      <w:proofErr w:type="gramStart"/>
+      <w:r>
+        <w:t>  Transitions</w:t>
+      </w:r>
+      <w:proofErr w:type="gramEnd"/>
+      <w:r>
+        <w:t xml:space="preserve"> :</w:t>
       </w:r>
     </w:p>
     <w:p>
@@ -8600,8 +10084,13 @@
       <w:pPr>
         <w:pStyle w:val="Paragraphedeliste"/>
       </w:pPr>
-      <w:r>
-        <w:t>  Description :</w:t>
+      <w:proofErr w:type="gramStart"/>
+      <w:r>
+        <w:t>  Description</w:t>
+      </w:r>
+      <w:proofErr w:type="gramEnd"/>
+      <w:r>
+        <w:t xml:space="preserve"> :</w:t>
       </w:r>
       <w:r>
         <w:br/>
@@ -8612,8 +10101,13 @@
       <w:pPr>
         <w:pStyle w:val="Paragraphedeliste"/>
       </w:pPr>
-      <w:r>
-        <w:t>  Rôles et actions possibles :</w:t>
+      <w:proofErr w:type="gramStart"/>
+      <w:r>
+        <w:t>  Rôles</w:t>
+      </w:r>
+      <w:proofErr w:type="gramEnd"/>
+      <w:r>
+        <w:t xml:space="preserve"> et actions possibles :</w:t>
       </w:r>
     </w:p>
     <w:p>
@@ -8661,8 +10155,13 @@
       <w:pPr>
         <w:pStyle w:val="Paragraphedeliste"/>
       </w:pPr>
-      <w:r>
-        <w:t>  Transitions :</w:t>
+      <w:proofErr w:type="gramStart"/>
+      <w:r>
+        <w:t>  Transitions</w:t>
+      </w:r>
+      <w:proofErr w:type="gramEnd"/>
+      <w:r>
+        <w:t xml:space="preserve"> :</w:t>
       </w:r>
     </w:p>
     <w:p>
@@ -8718,8 +10217,13 @@
       <w:pPr>
         <w:pStyle w:val="Paragraphedeliste"/>
       </w:pPr>
-      <w:r>
-        <w:t>  Description :</w:t>
+      <w:proofErr w:type="gramStart"/>
+      <w:r>
+        <w:t>  Description</w:t>
+      </w:r>
+      <w:proofErr w:type="gramEnd"/>
+      <w:r>
+        <w:t xml:space="preserve"> :</w:t>
       </w:r>
       <w:r>
         <w:br/>
@@ -8730,8 +10234,13 @@
       <w:pPr>
         <w:pStyle w:val="Paragraphedeliste"/>
       </w:pPr>
-      <w:r>
-        <w:t>  Rôles et actions possibles :</w:t>
+      <w:proofErr w:type="gramStart"/>
+      <w:r>
+        <w:t>  Rôles</w:t>
+      </w:r>
+      <w:proofErr w:type="gramEnd"/>
+      <w:r>
+        <w:t xml:space="preserve"> et actions possibles :</w:t>
       </w:r>
     </w:p>
     <w:p>
@@ -8754,8 +10263,13 @@
       <w:pPr>
         <w:pStyle w:val="Paragraphedeliste"/>
       </w:pPr>
-      <w:r>
-        <w:t>  Transitions :</w:t>
+      <w:proofErr w:type="gramStart"/>
+      <w:r>
+        <w:t>  Transitions</w:t>
+      </w:r>
+      <w:proofErr w:type="gramEnd"/>
+      <w:r>
+        <w:t xml:space="preserve"> :</w:t>
       </w:r>
     </w:p>
     <w:p>
@@ -8787,8 +10301,13 @@
       <w:pPr>
         <w:pStyle w:val="Paragraphedeliste"/>
       </w:pPr>
-      <w:r>
-        <w:t>  Description :</w:t>
+      <w:proofErr w:type="gramStart"/>
+      <w:r>
+        <w:t>  Description</w:t>
+      </w:r>
+      <w:proofErr w:type="gramEnd"/>
+      <w:r>
+        <w:t xml:space="preserve"> :</w:t>
       </w:r>
       <w:r>
         <w:br/>
@@ -8799,8 +10318,13 @@
       <w:pPr>
         <w:pStyle w:val="Paragraphedeliste"/>
       </w:pPr>
-      <w:r>
-        <w:t>  Rôles et actions possibles :</w:t>
+      <w:proofErr w:type="gramStart"/>
+      <w:r>
+        <w:t>  Rôles</w:t>
+      </w:r>
+      <w:proofErr w:type="gramEnd"/>
+      <w:r>
+        <w:t xml:space="preserve"> et actions possibles :</w:t>
       </w:r>
     </w:p>
     <w:p>
@@ -8839,8 +10363,13 @@
       <w:pPr>
         <w:pStyle w:val="Paragraphedeliste"/>
       </w:pPr>
-      <w:r>
-        <w:t>  Transitions :</w:t>
+      <w:proofErr w:type="gramStart"/>
+      <w:r>
+        <w:t>  Transitions</w:t>
+      </w:r>
+      <w:proofErr w:type="gramEnd"/>
+      <w:r>
+        <w:t xml:space="preserve"> :</w:t>
       </w:r>
     </w:p>
     <w:p>
@@ -8872,8 +10401,13 @@
       <w:pPr>
         <w:pStyle w:val="Paragraphedeliste"/>
       </w:pPr>
-      <w:r>
-        <w:t>  Description :</w:t>
+      <w:proofErr w:type="gramStart"/>
+      <w:r>
+        <w:t>  Description</w:t>
+      </w:r>
+      <w:proofErr w:type="gramEnd"/>
+      <w:r>
+        <w:t xml:space="preserve"> :</w:t>
       </w:r>
       <w:r>
         <w:br/>
@@ -8884,8 +10418,13 @@
       <w:pPr>
         <w:pStyle w:val="Paragraphedeliste"/>
       </w:pPr>
-      <w:r>
-        <w:t>  Rôles et actions possibles :</w:t>
+      <w:proofErr w:type="gramStart"/>
+      <w:r>
+        <w:t>  Rôles</w:t>
+      </w:r>
+      <w:proofErr w:type="gramEnd"/>
+      <w:r>
+        <w:t xml:space="preserve"> et actions possibles :</w:t>
       </w:r>
     </w:p>
     <w:p>
@@ -8916,8 +10455,13 @@
       <w:pPr>
         <w:pStyle w:val="Paragraphedeliste"/>
       </w:pPr>
-      <w:r>
-        <w:t>  Transitions :</w:t>
+      <w:proofErr w:type="gramStart"/>
+      <w:r>
+        <w:t>  Transitions</w:t>
+      </w:r>
+      <w:proofErr w:type="gramEnd"/>
+      <w:r>
+        <w:t xml:space="preserve"> :</w:t>
       </w:r>
     </w:p>
     <w:p>
@@ -8942,8 +10486,13 @@
       <w:pPr>
         <w:pStyle w:val="Paragraphedeliste"/>
       </w:pPr>
-      <w:r>
-        <w:t>  Description :</w:t>
+      <w:proofErr w:type="gramStart"/>
+      <w:r>
+        <w:t>  Description</w:t>
+      </w:r>
+      <w:proofErr w:type="gramEnd"/>
+      <w:r>
+        <w:t xml:space="preserve"> :</w:t>
       </w:r>
       <w:r>
         <w:br/>
@@ -8954,8 +10503,13 @@
       <w:pPr>
         <w:pStyle w:val="Paragraphedeliste"/>
       </w:pPr>
-      <w:r>
-        <w:t>  Rôles et actions possibles :</w:t>
+      <w:proofErr w:type="gramStart"/>
+      <w:r>
+        <w:t>  Rôles</w:t>
+      </w:r>
+      <w:proofErr w:type="gramEnd"/>
+      <w:r>
+        <w:t xml:space="preserve"> et actions possibles :</w:t>
       </w:r>
     </w:p>
     <w:p>
@@ -8986,8 +10540,13 @@
       <w:pPr>
         <w:pStyle w:val="Paragraphedeliste"/>
       </w:pPr>
-      <w:r>
-        <w:t>  Transitions :</w:t>
+      <w:proofErr w:type="gramStart"/>
+      <w:r>
+        <w:t>  Transitions</w:t>
+      </w:r>
+      <w:proofErr w:type="gramEnd"/>
+      <w:r>
+        <w:t xml:space="preserve"> :</w:t>
       </w:r>
     </w:p>
     <w:p>
@@ -9011,8 +10570,13 @@
       <w:pPr>
         <w:pStyle w:val="Paragraphedeliste"/>
       </w:pPr>
-      <w:r>
-        <w:t>  Description :</w:t>
+      <w:proofErr w:type="gramStart"/>
+      <w:r>
+        <w:t>  Description</w:t>
+      </w:r>
+      <w:proofErr w:type="gramEnd"/>
+      <w:r>
+        <w:t xml:space="preserve"> :</w:t>
       </w:r>
       <w:r>
         <w:br/>
@@ -9023,8 +10587,13 @@
       <w:pPr>
         <w:pStyle w:val="Paragraphedeliste"/>
       </w:pPr>
-      <w:r>
-        <w:t>  Rôles et actions possibles :</w:t>
+      <w:proofErr w:type="gramStart"/>
+      <w:r>
+        <w:t>  Rôles</w:t>
+      </w:r>
+      <w:proofErr w:type="gramEnd"/>
+      <w:r>
+        <w:t xml:space="preserve"> et actions possibles :</w:t>
       </w:r>
     </w:p>
     <w:p>
@@ -9063,8 +10632,13 @@
       <w:pPr>
         <w:pStyle w:val="Paragraphedeliste"/>
       </w:pPr>
-      <w:r>
-        <w:t>  Transitions :</w:t>
+      <w:proofErr w:type="gramStart"/>
+      <w:r>
+        <w:t>  Transitions</w:t>
+      </w:r>
+      <w:proofErr w:type="gramEnd"/>
+      <w:r>
+        <w:t xml:space="preserve"> :</w:t>
       </w:r>
     </w:p>
     <w:p>
@@ -9093,8 +10667,13 @@
       <w:pPr>
         <w:pStyle w:val="Paragraphedeliste"/>
       </w:pPr>
-      <w:r>
-        <w:t>  Description :</w:t>
+      <w:proofErr w:type="gramStart"/>
+      <w:r>
+        <w:t>  Description</w:t>
+      </w:r>
+      <w:proofErr w:type="gramEnd"/>
+      <w:r>
+        <w:t xml:space="preserve"> :</w:t>
       </w:r>
       <w:r>
         <w:br/>
@@ -9105,8 +10684,13 @@
       <w:pPr>
         <w:pStyle w:val="Paragraphedeliste"/>
       </w:pPr>
-      <w:r>
-        <w:t>  Rôles et actions possibles :</w:t>
+      <w:proofErr w:type="gramStart"/>
+      <w:r>
+        <w:t>  Rôles</w:t>
+      </w:r>
+      <w:proofErr w:type="gramEnd"/>
+      <w:r>
+        <w:t xml:space="preserve"> et actions possibles :</w:t>
       </w:r>
     </w:p>
     <w:p>
@@ -9129,8 +10713,13 @@
       <w:pPr>
         <w:pStyle w:val="Paragraphedeliste"/>
       </w:pPr>
-      <w:r>
-        <w:t>  Transitions :</w:t>
+      <w:proofErr w:type="gramStart"/>
+      <w:r>
+        <w:t>  Transitions</w:t>
+      </w:r>
+      <w:proofErr w:type="gramEnd"/>
+      <w:r>
+        <w:t xml:space="preserve"> :</w:t>
       </w:r>
     </w:p>
     <w:p>
@@ -9154,8 +10743,13 @@
       <w:pPr>
         <w:pStyle w:val="Paragraphedeliste"/>
       </w:pPr>
-      <w:r>
-        <w:t>  Description :</w:t>
+      <w:proofErr w:type="gramStart"/>
+      <w:r>
+        <w:t>  Description</w:t>
+      </w:r>
+      <w:proofErr w:type="gramEnd"/>
+      <w:r>
+        <w:t xml:space="preserve"> :</w:t>
       </w:r>
       <w:r>
         <w:br/>
@@ -9166,8 +10760,13 @@
       <w:pPr>
         <w:pStyle w:val="Paragraphedeliste"/>
       </w:pPr>
-      <w:r>
-        <w:t>  Rôles et actions possibles :</w:t>
+      <w:proofErr w:type="gramStart"/>
+      <w:r>
+        <w:t>  Rôles</w:t>
+      </w:r>
+      <w:proofErr w:type="gramEnd"/>
+      <w:r>
+        <w:t xml:space="preserve"> et actions possibles :</w:t>
       </w:r>
     </w:p>
     <w:p>
@@ -9190,9 +10789,14 @@
       <w:pPr>
         <w:pStyle w:val="Paragraphedeliste"/>
       </w:pPr>
+      <w:proofErr w:type="gramStart"/>
       <w:r>
         <w:lastRenderedPageBreak/>
-        <w:t>  Transitions :</w:t>
+        <w:t>  Transitions</w:t>
+      </w:r>
+      <w:proofErr w:type="gramEnd"/>
+      <w:r>
+        <w:t xml:space="preserve"> :</w:t>
       </w:r>
     </w:p>
     <w:p>
@@ -9784,7 +11388,7 @@
         <w:bCs/>
         <w:noProof/>
       </w:rPr>
-      <w:t>20</w:t>
+      <w:t>21</w:t>
     </w:r>
     <w:r>
       <w:rPr>
@@ -13065,7 +14669,7 @@
     <w:charset w:val="00"/>
     <w:family w:val="roman"/>
     <w:pitch w:val="variable"/>
-    <w:sig w:usb0="E0002EFF" w:usb1="C000785B" w:usb2="00000009" w:usb3="00000000" w:csb0="000001FF" w:csb1="00000000"/>
+    <w:sig w:usb0="E0002AFF" w:usb1="C0007843" w:usb2="00000009" w:usb3="00000000" w:csb0="000001FF" w:csb1="00000000"/>
   </w:font>
   <w:font w:name="Courier New">
     <w:panose1 w:val="02070309020205020404"/>
@@ -13079,7 +14683,7 @@
     <w:charset w:val="00"/>
     <w:family w:val="swiss"/>
     <w:pitch w:val="variable"/>
-    <w:sig w:usb0="E4002EFF" w:usb1="C000247B" w:usb2="00000009" w:usb3="00000000" w:csb0="000001FF" w:csb1="00000000"/>
+    <w:sig w:usb0="E0002AFF" w:usb1="4000ACFF" w:usb2="00000001" w:usb3="00000000" w:csb0="000001FF" w:csb1="00000000"/>
   </w:font>
   <w:font w:name="Symbol">
     <w:panose1 w:val="05050102010706020507"/>
@@ -13093,14 +14697,14 @@
     <w:charset w:val="00"/>
     <w:family w:val="roman"/>
     <w:pitch w:val="variable"/>
-    <w:sig w:usb0="E00006FF" w:usb1="420024FF" w:usb2="02000000" w:usb3="00000000" w:csb0="0000019F" w:csb1="00000000"/>
+    <w:sig w:usb0="A00002EF" w:usb1="4000004B" w:usb2="00000000" w:usb3="00000000" w:csb0="0000019F" w:csb1="00000000"/>
   </w:font>
   <w:font w:name="Arial">
     <w:panose1 w:val="020B0604020202020204"/>
     <w:charset w:val="00"/>
     <w:family w:val="swiss"/>
     <w:pitch w:val="variable"/>
-    <w:sig w:usb0="E0002EFF" w:usb1="C000785B" w:usb2="00000009" w:usb3="00000000" w:csb0="000001FF" w:csb1="00000000"/>
+    <w:sig w:usb0="E0002AFF" w:usb1="C0007843" w:usb2="00000009" w:usb3="00000000" w:csb0="000001FF" w:csb1="00000000"/>
   </w:font>
   <w:font w:name="Wingdings 2">
     <w:panose1 w:val="05020102010507070707"/>
@@ -13114,7 +14718,7 @@
     <w:charset w:val="00"/>
     <w:family w:val="swiss"/>
     <w:pitch w:val="variable"/>
-    <w:sig w:usb0="E4002EFF" w:usb1="C000247B" w:usb2="00000009" w:usb3="00000000" w:csb0="000001FF" w:csb1="00000000"/>
+    <w:sig w:usb0="A0002AEF" w:usb1="4000207B" w:usb2="00000000" w:usb3="00000000" w:csb0="000001FF" w:csb1="00000000"/>
   </w:font>
 </w:fonts>
 </file>

</xml_diff>